<commit_message>
Manual de la web al día en los tres idiomas (octubre de 2026)
Sustituye los PDF del manual (ES, EN y PT-BR) y el .docx por la edición
de octubre de 2026, con las funciones de TrueLift añadidas desde el
21/09/2026: cronómetro con pitidos, compartir la sesión con foto de
fondo, Crea tu menú y menú semanal con IA, rest-pause, disponibilidad
por trenes, entre otras.

Co-Authored-By: Claude Opus 5.5 <noreply@anthropic.com>
Claude-Session: https://claude.ai/code/session_01LmEkRR1RBrpN9FJTkXikBU
</commit_message>
<xml_diff>
--- a/Manual_TrueLift.docx
+++ b/Manual_TrueLift.docx
@@ -107,7 +107,7 @@
           <w:sz w:val="22"/>
           <w:szCs w:val="22"/>
         </w:rPr>
-        <w:t xml:space="preserve">Edición de septiembre de 2026</w:t>
+        <w:t xml:space="preserve">Edición de octubre de 2026</w:t>
       </w:r>
     </w:p>
     <w:p>
@@ -938,7 +938,7 @@
                 <w:sz w:val="20"/>
                 <w:szCs w:val="20"/>
               </w:rPr>
-              <w:t xml:space="preserve">Cronómetro de descanso con alarma, cronómetro flotante (Android) y actividad en directo (iPhone)</w:t>
+              <w:t xml:space="preserve">Cronómetro de descanso con alarma y pitidos de los minutos, cronómetro flotante (Android) y actividad en directo (iPhone)</w:t>
             </w:r>
           </w:p>
         </w:tc>
@@ -1463,7 +1463,7 @@
                 <w:sz w:val="20"/>
                 <w:szCs w:val="20"/>
               </w:rPr>
-              <w:t xml:space="preserve">Compartir una sesión como imagen</w:t>
+              <w:t xml:space="preserve">Compartir una sesión como imagen, también con tu foto de fondo</w:t>
             </w:r>
           </w:p>
         </w:tc>
@@ -2054,6 +2054,7 @@
         <w:tc>
           <w:tcPr>
             <w:tcW w:type="dxa" w:w="6260"/>
+            <w:shd w:fill="F5F5F5" w:val="clear"/>
             <w:tcMar>
               <w:top w:type="dxa" w:w="80"/>
               <w:left w:type="dxa" w:w="120"/>
@@ -2081,6 +2082,7 @@
         <w:tc>
           <w:tcPr>
             <w:tcW w:type="dxa" w:w="1550"/>
+            <w:shd w:fill="F5F5F5" w:val="clear"/>
             <w:tcMar>
               <w:top w:type="dxa" w:w="80"/>
               <w:left w:type="dxa" w:w="120"/>
@@ -2108,6 +2110,7 @@
         <w:tc>
           <w:tcPr>
             <w:tcW w:type="dxa" w:w="1550"/>
+            <w:shd w:fill="F5F5F5" w:val="clear"/>
             <w:tcMar>
               <w:top w:type="dxa" w:w="80"/>
               <w:left w:type="dxa" w:w="120"/>
@@ -2226,6 +2229,7 @@
         <w:tc>
           <w:tcPr>
             <w:tcW w:type="dxa" w:w="6260"/>
+            <w:shd w:fill="F5F5F5" w:val="clear"/>
             <w:tcMar>
               <w:top w:type="dxa" w:w="80"/>
               <w:left w:type="dxa" w:w="120"/>
@@ -2253,6 +2257,7 @@
         <w:tc>
           <w:tcPr>
             <w:tcW w:type="dxa" w:w="1550"/>
+            <w:shd w:fill="F5F5F5" w:val="clear"/>
             <w:tcMar>
               <w:top w:type="dxa" w:w="80"/>
               <w:left w:type="dxa" w:w="120"/>
@@ -2280,6 +2285,7 @@
         <w:tc>
           <w:tcPr>
             <w:tcW w:type="dxa" w:w="1550"/>
+            <w:shd w:fill="F5F5F5" w:val="clear"/>
             <w:tcMar>
               <w:top w:type="dxa" w:w="80"/>
               <w:left w:type="dxa" w:w="120"/>
@@ -2301,6 +2307,92 @@
                 <w:szCs w:val="20"/>
               </w:rPr>
               <w:t>✓</w:t>
+            </w:r>
+          </w:p>
+        </w:tc>
+      </w:tr>
+      <w:tr>
+        <w:trPr>
+          <w:tblHeader w:val="false"/>
+        </w:trPr>
+        <w:tc>
+          <w:tcPr>
+            <w:tcW w:type="dxa" w:w="6260"/>
+            <w:tcMar>
+              <w:top w:type="dxa" w:w="80"/>
+              <w:left w:type="dxa" w:w="120"/>
+              <w:bottom w:type="dxa" w:w="80"/>
+              <w:right w:type="dxa" w:w="120"/>
+            </w:tcMar>
+          </w:tcPr>
+          <w:p>
+            <w:pPr>
+              <w:jc w:val="left"/>
+            </w:pPr>
+            <w:r>
+              <w:rPr>
+                <w:rFonts w:ascii="Calibri" w:cs="Calibri" w:eastAsia="Calibri" w:hAnsi="Calibri"/>
+                <w:b w:val="false"/>
+                <w:bCs w:val="false"/>
+                <w:color w:val="1A1A1A"/>
+                <w:sz w:val="20"/>
+                <w:szCs w:val="20"/>
+              </w:rPr>
+              <w:t xml:space="preserve">Reiniciar la base de rendimiento de un ejercicio y registro fijo por ejercicio</w:t>
+            </w:r>
+          </w:p>
+        </w:tc>
+        <w:tc>
+          <w:tcPr>
+            <w:tcW w:type="dxa" w:w="1550"/>
+            <w:tcMar>
+              <w:top w:type="dxa" w:w="80"/>
+              <w:left w:type="dxa" w:w="120"/>
+              <w:bottom w:type="dxa" w:w="80"/>
+              <w:right w:type="dxa" w:w="120"/>
+            </w:tcMar>
+          </w:tcPr>
+          <w:p>
+            <w:pPr>
+              <w:jc w:val="center"/>
+            </w:pPr>
+            <w:r>
+              <w:rPr>
+                <w:rFonts w:ascii="Calibri" w:cs="Calibri" w:eastAsia="Calibri" w:hAnsi="Calibri"/>
+                <w:b w:val="false"/>
+                <w:bCs w:val="false"/>
+                <w:color w:val="1A1A1A"/>
+                <w:sz w:val="20"/>
+                <w:szCs w:val="20"/>
+              </w:rPr>
+              <w:t xml:space="preserve">✓</w:t>
+            </w:r>
+          </w:p>
+        </w:tc>
+        <w:tc>
+          <w:tcPr>
+            <w:tcW w:type="dxa" w:w="1550"/>
+            <w:tcMar>
+              <w:top w:type="dxa" w:w="80"/>
+              <w:left w:type="dxa" w:w="120"/>
+              <w:bottom w:type="dxa" w:w="80"/>
+              <w:right w:type="dxa" w:w="120"/>
+            </w:tcMar>
+          </w:tcPr>
+          <w:p>
+            <w:pPr>
+              <w:jc w:val="center"/>
+            </w:pPr>
+            <w:r>
+              <w:rPr>
+                <w:rFonts w:ascii="Calibri" w:cs="Calibri" w:eastAsia="Calibri" w:hAnsi="Calibri"/>
+                <w:b w:val="false"/>
+                <w:bCs w:val="false"/>
+                <w:color w:val="1A1A1A"/>
+                <w:sz w:val="20"/>
+                <w:szCs w:val="20"/>
+              </w:rPr>
+              <w:t xml:space="preserve">✓</w:t>
             </w:r>
           </w:p>
         </w:tc>
@@ -2508,96 +2600,7 @@
                 <w:sz w:val="20"/>
                 <w:szCs w:val="20"/>
               </w:rPr>
-              <w:t xml:space="preserve">Crear ejercicios propios en la biblioteca</w:t>
-            </w:r>
-          </w:p>
-        </w:tc>
-        <w:tc>
-          <w:tcPr>
-            <w:tcW w:type="dxa" w:w="1550"/>
-            <w:shd w:fill="F5F5F5" w:val="clear"/>
-            <w:tcMar>
-              <w:top w:type="dxa" w:w="80"/>
-              <w:left w:type="dxa" w:w="120"/>
-              <w:bottom w:type="dxa" w:w="80"/>
-              <w:right w:type="dxa" w:w="120"/>
-            </w:tcMar>
-          </w:tcPr>
-          <w:p>
-            <w:pPr>
-              <w:jc w:val="center"/>
-            </w:pPr>
-            <w:r>
-              <w:rPr>
-                <w:rFonts w:ascii="Calibri" w:cs="Calibri" w:eastAsia="Calibri" w:hAnsi="Calibri"/>
-                <w:b w:val="false"/>
-                <w:bCs w:val="false"/>
-                <w:color w:val="1A1A1A"/>
-                <w:sz w:val="20"/>
-                <w:szCs w:val="20"/>
-              </w:rPr>
-              <w:t xml:space="preserve">—</w:t>
-            </w:r>
-          </w:p>
-        </w:tc>
-        <w:tc>
-          <w:tcPr>
-            <w:tcW w:type="dxa" w:w="1550"/>
-            <w:shd w:fill="F5F5F5" w:val="clear"/>
-            <w:tcMar>
-              <w:top w:type="dxa" w:w="80"/>
-              <w:left w:type="dxa" w:w="120"/>
-              <w:bottom w:type="dxa" w:w="80"/>
-              <w:right w:type="dxa" w:w="120"/>
-            </w:tcMar>
-          </w:tcPr>
-          <w:p>
-            <w:pPr>
-              <w:jc w:val="center"/>
-            </w:pPr>
-            <w:r>
-              <w:rPr>
-                <w:rFonts w:ascii="Calibri" w:cs="Calibri" w:eastAsia="Calibri" w:hAnsi="Calibri"/>
-                <w:b w:val="false"/>
-                <w:bCs w:val="false"/>
-                <w:color w:val="1A1A1A"/>
-                <w:sz w:val="20"/>
-                <w:szCs w:val="20"/>
-              </w:rPr>
-              <w:t xml:space="preserve">✓</w:t>
-            </w:r>
-          </w:p>
-        </w:tc>
-      </w:tr>
-      <w:tr>
-        <w:trPr>
-          <w:tblHeader w:val="false"/>
-        </w:trPr>
-        <w:tc>
-          <w:tcPr>
-            <w:tcW w:type="dxa" w:w="6260"/>
-            <w:shd w:fill="F5F5F5" w:val="clear"/>
-            <w:tcMar>
-              <w:top w:type="dxa" w:w="80"/>
-              <w:left w:type="dxa" w:w="120"/>
-              <w:bottom w:type="dxa" w:w="80"/>
-              <w:right w:type="dxa" w:w="120"/>
-            </w:tcMar>
-          </w:tcPr>
-          <w:p>
-            <w:pPr>
-              <w:jc w:val="left"/>
-            </w:pPr>
-            <w:r>
-              <w:rPr>
-                <w:rFonts w:ascii="Calibri" w:cs="Calibri" w:eastAsia="Calibri" w:hAnsi="Calibri"/>
-                <w:b w:val="false"/>
-                <w:bCs w:val="false"/>
-                <w:color w:val="1A1A1A"/>
-                <w:sz w:val="20"/>
-                <w:szCs w:val="20"/>
-              </w:rPr>
-              <w:t xml:space="preserve">Rutinas PRO listas para entrenar</w:t>
+              <w:t xml:space="preserve">Crear ejercicios propios en la biblioteca, por repeticiones o por tiempo</w:t>
             </w:r>
           </w:p>
         </w:tc>
@@ -2685,7 +2688,7 @@
                 <w:sz w:val="20"/>
                 <w:szCs w:val="20"/>
               </w:rPr>
-              <w:t xml:space="preserve">Crear tu rutina con IA (cuestionario + prompt)</w:t>
+              <w:t xml:space="preserve">Rutinas PRO listas para entrenar</w:t>
             </w:r>
           </w:p>
         </w:tc>
@@ -2772,7 +2775,7 @@
                 <w:sz w:val="20"/>
                 <w:szCs w:val="20"/>
               </w:rPr>
-              <w:t xml:space="preserve">Drop sets</w:t>
+              <w:t xml:space="preserve">Crear tu rutina con IA (cuestionario + prompt)</w:t>
             </w:r>
           </w:p>
         </w:tc>
@@ -2860,7 +2863,182 @@
                 <w:sz w:val="20"/>
                 <w:szCs w:val="20"/>
               </w:rPr>
+              <w:t xml:space="preserve">Drop sets</w:t>
+            </w:r>
+          </w:p>
+        </w:tc>
+        <w:tc>
+          <w:tcPr>
+            <w:tcW w:type="dxa" w:w="1550"/>
+            <w:tcMar>
+              <w:top w:type="dxa" w:w="80"/>
+              <w:left w:type="dxa" w:w="120"/>
+              <w:bottom w:type="dxa" w:w="80"/>
+              <w:right w:type="dxa" w:w="120"/>
+            </w:tcMar>
+          </w:tcPr>
+          <w:p>
+            <w:pPr>
+              <w:jc w:val="center"/>
+            </w:pPr>
+            <w:r>
+              <w:rPr>
+                <w:rFonts w:ascii="Calibri" w:cs="Calibri" w:eastAsia="Calibri" w:hAnsi="Calibri"/>
+                <w:b w:val="false"/>
+                <w:bCs w:val="false"/>
+                <w:color w:val="1A1A1A"/>
+                <w:sz w:val="20"/>
+                <w:szCs w:val="20"/>
+              </w:rPr>
+              <w:t xml:space="preserve">—</w:t>
+            </w:r>
+          </w:p>
+        </w:tc>
+        <w:tc>
+          <w:tcPr>
+            <w:tcW w:type="dxa" w:w="1550"/>
+            <w:tcMar>
+              <w:top w:type="dxa" w:w="80"/>
+              <w:left w:type="dxa" w:w="120"/>
+              <w:bottom w:type="dxa" w:w="80"/>
+              <w:right w:type="dxa" w:w="120"/>
+            </w:tcMar>
+          </w:tcPr>
+          <w:p>
+            <w:pPr>
+              <w:jc w:val="center"/>
+            </w:pPr>
+            <w:r>
+              <w:rPr>
+                <w:rFonts w:ascii="Calibri" w:cs="Calibri" w:eastAsia="Calibri" w:hAnsi="Calibri"/>
+                <w:b w:val="false"/>
+                <w:bCs w:val="false"/>
+                <w:color w:val="1A1A1A"/>
+                <w:sz w:val="20"/>
+                <w:szCs w:val="20"/>
+              </w:rPr>
+              <w:t xml:space="preserve">✓</w:t>
+            </w:r>
+          </w:p>
+        </w:tc>
+      </w:tr>
+      <w:tr>
+        <w:trPr>
+          <w:tblHeader w:val="false"/>
+        </w:trPr>
+        <w:tc>
+          <w:tcPr>
+            <w:tcW w:type="dxa" w:w="6260"/>
+            <w:shd w:fill="F5F5F5" w:val="clear"/>
+            <w:tcMar>
+              <w:top w:type="dxa" w:w="80"/>
+              <w:left w:type="dxa" w:w="120"/>
+              <w:bottom w:type="dxa" w:w="80"/>
+              <w:right w:type="dxa" w:w="120"/>
+            </w:tcMar>
+          </w:tcPr>
+          <w:p>
+            <w:pPr>
+              <w:jc w:val="left"/>
+            </w:pPr>
+            <w:r>
+              <w:rPr>
+                <w:rFonts w:ascii="Calibri" w:cs="Calibri" w:eastAsia="Calibri" w:hAnsi="Calibri"/>
+                <w:b w:val="false"/>
+                <w:bCs w:val="false"/>
+                <w:color w:val="1A1A1A"/>
+                <w:sz w:val="20"/>
+                <w:szCs w:val="20"/>
+              </w:rPr>
               <w:t xml:space="preserve">Superseries</w:t>
+            </w:r>
+          </w:p>
+        </w:tc>
+        <w:tc>
+          <w:tcPr>
+            <w:tcW w:type="dxa" w:w="1550"/>
+            <w:shd w:fill="F5F5F5" w:val="clear"/>
+            <w:tcMar>
+              <w:top w:type="dxa" w:w="80"/>
+              <w:left w:type="dxa" w:w="120"/>
+              <w:bottom w:type="dxa" w:w="80"/>
+              <w:right w:type="dxa" w:w="120"/>
+            </w:tcMar>
+          </w:tcPr>
+          <w:p>
+            <w:pPr>
+              <w:jc w:val="center"/>
+            </w:pPr>
+            <w:r>
+              <w:rPr>
+                <w:rFonts w:ascii="Calibri" w:cs="Calibri" w:eastAsia="Calibri" w:hAnsi="Calibri"/>
+                <w:b w:val="false"/>
+                <w:bCs w:val="false"/>
+                <w:color w:val="1A1A1A"/>
+                <w:sz w:val="20"/>
+                <w:szCs w:val="20"/>
+              </w:rPr>
+              <w:t xml:space="preserve">—</w:t>
+            </w:r>
+          </w:p>
+        </w:tc>
+        <w:tc>
+          <w:tcPr>
+            <w:tcW w:type="dxa" w:w="1550"/>
+            <w:shd w:fill="F5F5F5" w:val="clear"/>
+            <w:tcMar>
+              <w:top w:type="dxa" w:w="80"/>
+              <w:left w:type="dxa" w:w="120"/>
+              <w:bottom w:type="dxa" w:w="80"/>
+              <w:right w:type="dxa" w:w="120"/>
+            </w:tcMar>
+          </w:tcPr>
+          <w:p>
+            <w:pPr>
+              <w:jc w:val="center"/>
+            </w:pPr>
+            <w:r>
+              <w:rPr>
+                <w:rFonts w:ascii="Calibri" w:cs="Calibri" w:eastAsia="Calibri" w:hAnsi="Calibri"/>
+                <w:b w:val="false"/>
+                <w:bCs w:val="false"/>
+                <w:color w:val="1A1A1A"/>
+                <w:sz w:val="20"/>
+                <w:szCs w:val="20"/>
+              </w:rPr>
+              <w:t xml:space="preserve">✓</w:t>
+            </w:r>
+          </w:p>
+        </w:tc>
+      </w:tr>
+      <w:tr>
+        <w:trPr>
+          <w:tblHeader w:val="false"/>
+        </w:trPr>
+        <w:tc>
+          <w:tcPr>
+            <w:tcW w:type="dxa" w:w="6260"/>
+            <w:tcMar>
+              <w:top w:type="dxa" w:w="80"/>
+              <w:left w:type="dxa" w:w="120"/>
+              <w:bottom w:type="dxa" w:w="80"/>
+              <w:right w:type="dxa" w:w="120"/>
+            </w:tcMar>
+          </w:tcPr>
+          <w:p>
+            <w:pPr>
+              <w:jc w:val="left"/>
+            </w:pPr>
+            <w:r>
+              <w:rPr>
+                <w:rFonts w:ascii="Calibri" w:cs="Calibri" w:eastAsia="Calibri" w:hAnsi="Calibri"/>
+                <w:b w:val="false"/>
+                <w:bCs w:val="false"/>
+                <w:color w:val="1A1A1A"/>
+                <w:sz w:val="20"/>
+                <w:szCs w:val="20"/>
+              </w:rPr>
+              <w:t xml:space="preserve">Rest-pause</w:t>
             </w:r>
           </w:p>
         </w:tc>
@@ -3101,6 +3279,7 @@
         <w:tc>
           <w:tcPr>
             <w:tcW w:type="dxa" w:w="6260"/>
+            <w:shd w:fill="F5F5F5" w:val="clear"/>
             <w:tcMar>
               <w:top w:type="dxa" w:w="80"/>
               <w:left w:type="dxa" w:w="120"/>
@@ -3128,6 +3307,7 @@
         <w:tc>
           <w:tcPr>
             <w:tcW w:type="dxa" w:w="1550"/>
+            <w:shd w:fill="F5F5F5" w:val="clear"/>
             <w:tcMar>
               <w:top w:type="dxa" w:w="80"/>
               <w:left w:type="dxa" w:w="120"/>
@@ -3155,6 +3335,7 @@
         <w:tc>
           <w:tcPr>
             <w:tcW w:type="dxa" w:w="1550"/>
+            <w:shd w:fill="F5F5F5" w:val="clear"/>
             <w:tcMar>
               <w:top w:type="dxa" w:w="80"/>
               <w:left w:type="dxa" w:w="120"/>
@@ -3187,6 +3368,92 @@
         <w:tc>
           <w:tcPr>
             <w:tcW w:type="dxa" w:w="6260"/>
+            <w:tcMar>
+              <w:top w:type="dxa" w:w="80"/>
+              <w:left w:type="dxa" w:w="120"/>
+              <w:bottom w:type="dxa" w:w="80"/>
+              <w:right w:type="dxa" w:w="120"/>
+            </w:tcMar>
+          </w:tcPr>
+          <w:p>
+            <w:pPr>
+              <w:jc w:val="left"/>
+            </w:pPr>
+            <w:r>
+              <w:rPr>
+                <w:rFonts w:ascii="Calibri" w:cs="Calibri" w:eastAsia="Calibri" w:hAnsi="Calibri"/>
+                <w:b w:val="false"/>
+                <w:bCs w:val="false"/>
+                <w:color w:val="1A1A1A"/>
+                <w:sz w:val="20"/>
+                <w:szCs w:val="20"/>
+              </w:rPr>
+              <w:t xml:space="preserve">Fase de la dieta (déficit / normocalórica / superávit)</w:t>
+            </w:r>
+          </w:p>
+        </w:tc>
+        <w:tc>
+          <w:tcPr>
+            <w:tcW w:type="dxa" w:w="1550"/>
+            <w:tcMar>
+              <w:top w:type="dxa" w:w="80"/>
+              <w:left w:type="dxa" w:w="120"/>
+              <w:bottom w:type="dxa" w:w="80"/>
+              <w:right w:type="dxa" w:w="120"/>
+            </w:tcMar>
+          </w:tcPr>
+          <w:p>
+            <w:pPr>
+              <w:jc w:val="center"/>
+            </w:pPr>
+            <w:r>
+              <w:rPr>
+                <w:rFonts w:ascii="Calibri" w:cs="Calibri" w:eastAsia="Calibri" w:hAnsi="Calibri"/>
+                <w:b w:val="false"/>
+                <w:bCs w:val="false"/>
+                <w:color w:val="1A1A1A"/>
+                <w:sz w:val="20"/>
+                <w:szCs w:val="20"/>
+              </w:rPr>
+              <w:t xml:space="preserve">—</w:t>
+            </w:r>
+          </w:p>
+        </w:tc>
+        <w:tc>
+          <w:tcPr>
+            <w:tcW w:type="dxa" w:w="1550"/>
+            <w:tcMar>
+              <w:top w:type="dxa" w:w="80"/>
+              <w:left w:type="dxa" w:w="120"/>
+              <w:bottom w:type="dxa" w:w="80"/>
+              <w:right w:type="dxa" w:w="120"/>
+            </w:tcMar>
+          </w:tcPr>
+          <w:p>
+            <w:pPr>
+              <w:jc w:val="center"/>
+            </w:pPr>
+            <w:r>
+              <w:rPr>
+                <w:rFonts w:ascii="Calibri" w:cs="Calibri" w:eastAsia="Calibri" w:hAnsi="Calibri"/>
+                <w:b w:val="false"/>
+                <w:bCs w:val="false"/>
+                <w:color w:val="1A1A1A"/>
+                <w:sz w:val="20"/>
+                <w:szCs w:val="20"/>
+              </w:rPr>
+              <w:t xml:space="preserve">✓</w:t>
+            </w:r>
+          </w:p>
+        </w:tc>
+      </w:tr>
+      <w:tr>
+        <w:trPr>
+          <w:tblHeader w:val="false"/>
+        </w:trPr>
+        <w:tc>
+          <w:tcPr>
+            <w:tcW w:type="dxa" w:w="6260"/>
             <w:shd w:fill="F5F5F5" w:val="clear"/>
             <w:tcMar>
               <w:top w:type="dxa" w:w="80"/>
@@ -3208,7 +3475,7 @@
                 <w:sz w:val="20"/>
                 <w:szCs w:val="20"/>
               </w:rPr>
-              <w:t xml:space="preserve">Fase de la dieta (déficit / normocalórica / superávit)</w:t>
+              <w:t xml:space="preserve">Prueba de reordenación por estancamiento</w:t>
             </w:r>
           </w:p>
         </w:tc>
@@ -3296,7 +3563,7 @@
                 <w:sz w:val="20"/>
                 <w:szCs w:val="20"/>
               </w:rPr>
-              <w:t xml:space="preserve">Prueba de reordenación por estancamiento</w:t>
+              <w:t xml:space="preserve">Modo descarga manual y descarga sugerida</w:t>
             </w:r>
           </w:p>
         </w:tc>
@@ -3383,7 +3650,7 @@
                 <w:sz w:val="20"/>
                 <w:szCs w:val="20"/>
               </w:rPr>
-              <w:t xml:space="preserve">Modo descarga manual y descarga sugerida</w:t>
+              <w:t xml:space="preserve">Informe mensual, con su apartado de cardio</w:t>
             </w:r>
           </w:p>
         </w:tc>
@@ -3471,7 +3738,7 @@
                 <w:sz w:val="20"/>
                 <w:szCs w:val="20"/>
               </w:rPr>
-              <w:t xml:space="preserve">Informe mensual</w:t>
+              <w:t xml:space="preserve">Evolución corporal: gráficas de tus medidas y comparador de fotos</w:t>
             </w:r>
           </w:p>
         </w:tc>
@@ -3558,7 +3825,7 @@
                 <w:sz w:val="20"/>
                 <w:szCs w:val="20"/>
               </w:rPr>
-              <w:t xml:space="preserve">Evolución corporal: gráficas de tus medidas y comparador de fotos</w:t>
+              <w:t xml:space="preserve">Pestaña Nutrición: peso-tendencia, tarjeta semanal, planificador de temporada, % de grasa, alimentos, vigilante de rendimiento, energía diaria, reparto en comidas y menú semanal con IA</w:t>
             </w:r>
           </w:p>
         </w:tc>
@@ -3619,92 +3886,6 @@
           </w:p>
         </w:tc>
       </w:tr>
-      <w:tr>
-        <w:trPr>
-          <w:tblHeader w:val="false"/>
-        </w:trPr>
-        <w:tc>
-          <w:tcPr>
-            <w:tcW w:type="dxa" w:w="6260"/>
-            <w:tcMar>
-              <w:top w:type="dxa" w:w="80"/>
-              <w:left w:type="dxa" w:w="120"/>
-              <w:bottom w:type="dxa" w:w="80"/>
-              <w:right w:type="dxa" w:w="120"/>
-            </w:tcMar>
-          </w:tcPr>
-          <w:p>
-            <w:pPr>
-              <w:jc w:val="left"/>
-            </w:pPr>
-            <w:r>
-              <w:rPr>
-                <w:rFonts w:ascii="Calibri" w:cs="Calibri" w:eastAsia="Calibri" w:hAnsi="Calibri"/>
-                <w:b w:val="false"/>
-                <w:bCs w:val="false"/>
-                <w:color w:val="1A1A1A"/>
-                <w:sz w:val="20"/>
-                <w:szCs w:val="20"/>
-              </w:rPr>
-              <w:t xml:space="preserve">Pestaña Nutrición: peso-tendencia, tarjeta semanal, planificador de temporada, % de grasa, alimentos, vigilante de rendimiento</w:t>
-            </w:r>
-          </w:p>
-        </w:tc>
-        <w:tc>
-          <w:tcPr>
-            <w:tcW w:type="dxa" w:w="1550"/>
-            <w:tcMar>
-              <w:top w:type="dxa" w:w="80"/>
-              <w:left w:type="dxa" w:w="120"/>
-              <w:bottom w:type="dxa" w:w="80"/>
-              <w:right w:type="dxa" w:w="120"/>
-            </w:tcMar>
-          </w:tcPr>
-          <w:p>
-            <w:pPr>
-              <w:jc w:val="center"/>
-            </w:pPr>
-            <w:r>
-              <w:rPr>
-                <w:rFonts w:ascii="Calibri" w:cs="Calibri" w:eastAsia="Calibri" w:hAnsi="Calibri"/>
-                <w:b w:val="false"/>
-                <w:bCs w:val="false"/>
-                <w:color w:val="1A1A1A"/>
-                <w:sz w:val="20"/>
-                <w:szCs w:val="20"/>
-              </w:rPr>
-              <w:t xml:space="preserve">—</w:t>
-            </w:r>
-          </w:p>
-        </w:tc>
-        <w:tc>
-          <w:tcPr>
-            <w:tcW w:type="dxa" w:w="1550"/>
-            <w:tcMar>
-              <w:top w:type="dxa" w:w="80"/>
-              <w:left w:type="dxa" w:w="120"/>
-              <w:bottom w:type="dxa" w:w="80"/>
-              <w:right w:type="dxa" w:w="120"/>
-            </w:tcMar>
-          </w:tcPr>
-          <w:p>
-            <w:pPr>
-              <w:jc w:val="center"/>
-            </w:pPr>
-            <w:r>
-              <w:rPr>
-                <w:rFonts w:ascii="Calibri" w:cs="Calibri" w:eastAsia="Calibri" w:hAnsi="Calibri"/>
-                <w:b w:val="false"/>
-                <w:bCs w:val="false"/>
-                <w:color w:val="1A1A1A"/>
-                <w:sz w:val="20"/>
-                <w:szCs w:val="20"/>
-              </w:rPr>
-              <w:t xml:space="preserve">✓</w:t>
-            </w:r>
-          </w:p>
-        </w:tc>
-      </w:tr>
     </w:tbl>
     <w:p>
       <w:pPr>
@@ -3897,7 +4078,7 @@
           <w:sz w:val="22"/>
           <w:szCs w:val="22"/>
         </w:rPr>
-        <w:t xml:space="preserve">En la pantalla de la versión PRO hay tres modalidades: suscripción mensual, compra de un año y compra de por vida. El precio se muestra en la propia pantalla. Los pagos los gestiona Google Play con los métodos de tu cuenta. La compra queda asociada a tu cuenta de Google: si cambias de móvil o reinstalas, pulsa </w:t>
+        <w:t xml:space="preserve">En la pantalla de la versión PRO hay tres modalidades: suscripción mensual, compra de un año y compra de por vida. El precio se muestra en la propia pantalla. Los pagos los gestiona la tienda de tu móvil —Google Play en Android, App Store en el iPhone— con los métodos de tu cuenta. La compra queda asociada a esa cuenta: si cambias de móvil o reinstalas, pulsa </w:t>
       </w:r>
       <w:r>
         <w:rPr>
@@ -4406,13 +4587,35 @@
       <w:r>
         <w:rPr>
           <w:rFonts w:ascii="Calibri" w:cs="Calibri" w:eastAsia="Calibri" w:hAnsi="Calibri"/>
-          <w:b w:val="0"/>
-          <w:bCs w:val="false"/>
-          <w:color w:val="1A1A1A"/>
-          <w:sz w:val="22"/>
-          <w:szCs w:val="22"/>
-        </w:rPr>
-        <w:t>Se abre con el icono de ajustes (arriba a la derecha). Es un índice de seis categorías repartidas en tres bloques —Tu entrenamiento, Seguimiento y La app—; cada línea muestra su valor actual. Arriba está la tarjeta PRO, que abre la pantalla TrueLift PRO: estado de la prueba o compra, web, descarga del manual, app de escritorio Coach, contacto, política de privacidad y autor. Al pie figura la versión de la app. Dos decisiones que antes vivían aquí se toman ahora desde la pestaña Rutina, que es donde se miran: el material disponible y la semana de descarga.</w:t>
+          <w:b w:val="false"/>
+          <w:bCs w:val="false"/>
+          <w:color w:val="1A1A1A"/>
+          <w:sz w:val="22"/>
+          <w:szCs w:val="22"/>
+        </w:rPr>
+        <w:t xml:space="preserve">Se abre con el icono de ajustes (arriba a la derecha). Es un índice de categorías repartidas en tres bloques —Tu entrenamiento, Seguimiento y La app—; cada línea muestra su valor actual. Al pie figura la versión de la app. La pantalla TrueLift PRO —estado de la prueba o compra, web, descarga del manual, app de escritorio Coach, contacto, política de privacidad y autor— no se abre desde aquí, sino con el botón </w:t>
+      </w:r>
+      <w:r>
+        <w:rPr>
+          <w:rFonts w:ascii="Calibri" w:cs="Calibri" w:eastAsia="Calibri" w:hAnsi="Calibri"/>
+          <w:b/>
+          <w:bCs/>
+          <w:color w:val="1A1A1A"/>
+          <w:sz w:val="22"/>
+          <w:szCs w:val="22"/>
+        </w:rPr>
+        <w:t xml:space="preserve">PRO</w:t>
+      </w:r>
+      <w:r>
+        <w:rPr>
+          <w:rFonts w:ascii="Calibri" w:cs="Calibri" w:eastAsia="Calibri" w:hAnsi="Calibri"/>
+          <w:b w:val="false"/>
+          <w:bCs w:val="false"/>
+          <w:color w:val="1A1A1A"/>
+          <w:sz w:val="22"/>
+          <w:szCs w:val="22"/>
+        </w:rPr>
+        <w:t xml:space="preserve"> de la barra superior (sección 5). Dos decisiones que antes vivían aquí se toman ahora desde la pestaña Rutina, que es donde se miran: el material disponible y la semana de descarga.</w:t>
       </w:r>
     </w:p>
     <w:p>
@@ -4741,6 +4944,38 @@
           <w:sz w:val="22"/>
           <w:szCs w:val="22"/>
         </w:rPr>
+        <w:t xml:space="preserve">Pitidos de los minutos</w:t>
+      </w:r>
+      <w:r>
+        <w:rPr>
+          <w:rFonts w:ascii="Calibri" w:cs="Calibri" w:eastAsia="Calibri" w:hAnsi="Calibri"/>
+          <w:b w:val="false"/>
+          <w:bCs w:val="false"/>
+          <w:color w:val="1A1A1A"/>
+          <w:sz w:val="22"/>
+          <w:szCs w:val="22"/>
+        </w:rPr>
+        <w:t xml:space="preserve"> (gratis, activado de serie): depende de la cuenta atrás. Durante el descanso, cada vez que pasa un minuto entero suenan pitidos cortos, tantos como minutos quedan: dos pitidos cuando quedan dos minutos y uno cuando queda uno. Así sabes cuánto te falta sin mirar el móvil. El final del descanso lo sigue marcando la alarma de siempre, y los pitidos suenan también mientras escuchas música.</w:t>
+      </w:r>
+    </w:p>
+    <w:p>
+      <w:pPr>
+        <w:pStyle w:val="ListParagraph"/>
+        <w:numPr>
+          <w:ilvl w:val="0"/>
+          <w:numId w:val="2"/>
+        </w:numPr>
+        <w:spacing w:after="100" w:line="276"/>
+      </w:pPr>
+      <w:r>
+        <w:rPr>
+          <w:rFonts w:ascii="Calibri" w:cs="Calibri" w:eastAsia="Calibri" w:hAnsi="Calibri"/>
+          <w:b/>
+          <w:bCs/>
+          <w:color w:val="1A1A1A"/>
+          <w:sz w:val="22"/>
+          <w:szCs w:val="22"/>
+        </w:rPr>
         <w:t xml:space="preserve">Cronómetro flotante (Android):</w:t>
       </w:r>
       <w:r>
@@ -4774,23 +5009,45 @@
           <w:sz w:val="22"/>
           <w:szCs w:val="22"/>
         </w:rPr>
-        <w:t xml:space="preserve">; sin él, el interruptor no se activa.</w:t>
-      </w:r>
-    </w:p>
-    <w:p>
-      <w:pPr>
-        <w:spacing w:after="160" w:line="276"/>
-      </w:pPr>
-      <w:r>
-        <w:rPr>
-          <w:rFonts w:ascii="Calibri" w:cs="Calibri" w:eastAsia="Calibri" w:hAnsi="Calibri"/>
-          <w:b w:val="false"/>
-          <w:bCs w:val="false"/>
-          <w:color w:val="1A1A1A"/>
-          <w:sz w:val="22"/>
-          <w:szCs w:val="22"/>
-        </w:rPr>
-        <w:t xml:space="preserve">Con la cuenta atrás verás una notificación con el tiempo restante y un botón para detenerla; es la que evita que el sistema congele el cronómetro en segundo plano. Al terminar llega un aviso de descanso completado, silencioso en el móvil para no duplicar la alarma. La app usa dos canales de notificación, «Cronómetro de descanso» y «Fin del descanso»: si tu smartwatch muestra las notificaciones de TrueLift, puedes permitir solo el segundo y recibir en la muñeca únicamente el aviso final. Eso se configura en la app complementaria del reloj, no en TrueLift. En iPhone no hay cápsula flotante, pero sí actividad en directo: el descanso se ve en la pantalla bloqueada y en la Dynamic Island, y desde ahí lo sigues sin abrir la app.</w:t>
+        <w:t xml:space="preserve">; sin él, el interruptor no se activa. El «?» del ajuste, siempre visible, dice qué permisos hacen falta —en el iPhone, los de la actividad en directo—, dónde se conceden y qué revisar si no ves el descanso con el móvil bloqueado.</w:t>
+      </w:r>
+    </w:p>
+    <w:p>
+      <w:pPr>
+        <w:spacing w:after="160" w:line="276"/>
+      </w:pPr>
+      <w:r>
+        <w:rPr>
+          <w:rFonts w:ascii="Calibri" w:cs="Calibri" w:eastAsia="Calibri" w:hAnsi="Calibri"/>
+          <w:b w:val="false"/>
+          <w:bCs w:val="false"/>
+          <w:color w:val="1A1A1A"/>
+          <w:sz w:val="22"/>
+          <w:szCs w:val="22"/>
+        </w:rPr>
+        <w:t xml:space="preserve">Con la cuenta atrás verás una notificación con el tiempo restante y un botón para detenerla; es la que evita que el sistema congele el cronómetro en segundo plano. Además dice lo que toca al acabar el descanso: el dibujo del ejercicio, su nombre y la serie siguiente con su peso, sus repeticiones y su RIR objetivo, para leerlo con el móvil bloqueado. Al terminar llega el aviso </w:t>
+      </w:r>
+      <w:r>
+        <w:rPr>
+          <w:rFonts w:ascii="Calibri" w:cs="Calibri" w:eastAsia="Calibri" w:hAnsi="Calibri"/>
+          <w:b/>
+          <w:bCs/>
+          <w:color w:val="1A1A1A"/>
+          <w:sz w:val="22"/>
+          <w:szCs w:val="22"/>
+        </w:rPr>
+        <w:t xml:space="preserve">¡Siguiente serie!</w:t>
+      </w:r>
+      <w:r>
+        <w:rPr>
+          <w:rFonts w:ascii="Calibri" w:cs="Calibri" w:eastAsia="Calibri" w:hAnsi="Calibri"/>
+          <w:b w:val="false"/>
+          <w:bCs w:val="false"/>
+          <w:color w:val="1A1A1A"/>
+          <w:sz w:val="22"/>
+          <w:szCs w:val="22"/>
+        </w:rPr>
+        <w:t xml:space="preserve"> con esa misma información, silencioso en el móvil para no duplicar la alarma. La app usa dos canales de notificación, «Cronómetro de descanso» y «Fin del descanso»: si tu smartwatch muestra las notificaciones de TrueLift, puedes permitir solo el segundo y recibir en la muñeca únicamente el aviso final. Eso se configura en la app complementaria del reloj, no en TrueLift. En iPhone no hay cápsula flotante, pero sí actividad en directo: el descanso, con el dibujo del ejercicio y la serie que toca, se ve en la pantalla bloqueada y en la Dynamic Island, y desde ahí lo sigues sin abrir la app.</w:t>
       </w:r>
     </w:p>
     <w:p>
@@ -4886,13 +5143,46 @@
       <w:r>
         <w:rPr>
           <w:rFonts w:ascii="Calibri" w:cs="Calibri" w:eastAsia="Calibri" w:hAnsi="Calibri"/>
-          <w:b w:val="0"/>
-          <w:bCs w:val="false"/>
-          <w:color w:val="1A1A1A"/>
-          <w:sz w:val="22"/>
-          <w:szCs w:val="22"/>
-        </w:rPr>
-        <w:t>Reloj conectado (PRO): enlaza TrueLift con la plataforma de salud de tu móvil —Health Connect en Android, Apple Salud en el iPhone— y aprovecha lo que tu reloj, tu pulsera o tu báscula ya miden: frecuencia cardíaca en reposo, VFC nocturna, sueño, pasos, calorías, peso y tus entrenamientos de cardio. Solo lee, nunca escribe, y nada sale del móvil. Es una función en estado BETA. Se explica en la sección 11.</w:t>
+          <w:b/>
+          <w:bCs/>
+          <w:color w:val="1A1A1A"/>
+          <w:sz w:val="22"/>
+          <w:szCs w:val="22"/>
+        </w:rPr>
+        <w:t xml:space="preserve">Leer datos de Health Connect</w:t>
+      </w:r>
+      <w:r>
+        <w:rPr>
+          <w:rFonts w:ascii="Calibri" w:cs="Calibri" w:eastAsia="Calibri" w:hAnsi="Calibri"/>
+          <w:b w:val="false"/>
+          <w:bCs w:val="false"/>
+          <w:color w:val="1A1A1A"/>
+          <w:sz w:val="22"/>
+          <w:szCs w:val="22"/>
+        </w:rPr>
+        <w:t xml:space="preserve"> (en el iPhone, </w:t>
+      </w:r>
+      <w:r>
+        <w:rPr>
+          <w:rFonts w:ascii="Calibri" w:cs="Calibri" w:eastAsia="Calibri" w:hAnsi="Calibri"/>
+          <w:b/>
+          <w:bCs/>
+          <w:color w:val="1A1A1A"/>
+          <w:sz w:val="22"/>
+          <w:szCs w:val="22"/>
+        </w:rPr>
+        <w:t xml:space="preserve">de Apple Salud</w:t>
+      </w:r>
+      <w:r>
+        <w:rPr>
+          <w:rFonts w:ascii="Calibri" w:cs="Calibri" w:eastAsia="Calibri" w:hAnsi="Calibri"/>
+          <w:b w:val="false"/>
+          <w:bCs w:val="false"/>
+          <w:color w:val="1A1A1A"/>
+          <w:sz w:val="22"/>
+          <w:szCs w:val="22"/>
+        </w:rPr>
+        <w:t xml:space="preserve">) (PRO): es lo que en este manual llamamos el reloj conectado. Enlaza TrueLift con la plataforma de salud de tu móvil y aprovecha lo que tu reloj, tu pulsera o tu báscula ya miden: frecuencia cardíaca en reposo, VFC nocturna, sueño, pasos, calorías, peso y tus entrenamientos de cardio. Solo lee, nunca escribe, y nada sale del móvil. Es una función en estado BETA. Se explica en la sección 11.</w:t>
       </w:r>
     </w:p>
     <w:p>
@@ -4924,7 +5214,39 @@
           <w:sz w:val="22"/>
           <w:szCs w:val="22"/>
         </w:rPr>
-        <w:t xml:space="preserve"> (gratis): una notificación diaria a la hora que elijas con lo que tengas activo: estado subjetivo, VFC/FC en reposo y peso. Si no hay nada activo, no se programa. El día que toca volver a estimar el % de grasa (nutrición), la petición llega con este mismo recordatorio.</w:t>
+        <w:t xml:space="preserve"> (gratis): una notificación diaria a la hora que elijas con lo que tengas activo: estado subjetivo, VFC/FC en reposo y peso. Si no hay nada activo, no se programa, y el día que ya has anotado todo lo que pide no suena. El día que toca volver a estimar el % de grasa (nutrición), la petición llega con este mismo recordatorio.</w:t>
+      </w:r>
+    </w:p>
+    <w:p>
+      <w:pPr>
+        <w:pStyle w:val="ListParagraph"/>
+        <w:numPr>
+          <w:ilvl w:val="0"/>
+          <w:numId w:val="2"/>
+        </w:numPr>
+        <w:spacing w:after="100" w:line="276"/>
+      </w:pPr>
+      <w:r>
+        <w:rPr>
+          <w:rFonts w:ascii="Calibri" w:cs="Calibri" w:eastAsia="Calibri" w:hAnsi="Calibri"/>
+          <w:b/>
+          <w:bCs/>
+          <w:color w:val="1A1A1A"/>
+          <w:sz w:val="22"/>
+          <w:szCs w:val="22"/>
+        </w:rPr>
+        <w:t xml:space="preserve">Health Connect / Apple Salud</w:t>
+      </w:r>
+      <w:r>
+        <w:rPr>
+          <w:rFonts w:ascii="Calibri" w:cs="Calibri" w:eastAsia="Calibri" w:hAnsi="Calibri"/>
+          <w:b w:val="false"/>
+          <w:bCs w:val="false"/>
+          <w:color w:val="1A1A1A"/>
+          <w:sz w:val="22"/>
+          <w:szCs w:val="22"/>
+        </w:rPr>
+        <w:t xml:space="preserve"> (gratis): fila propia en el bloque Seguimiento. Explica qué datos puede leer TrueLift, para qué se usa cada uno y cómo controlar los permisos, y desde ella también se activa la lectura. Se puede consultar sin PRO, sin conceder permisos y sin datos previos.</w:t>
       </w:r>
     </w:p>
     <w:p>
@@ -5366,23 +5688,45 @@
           <w:sz w:val="22"/>
           <w:szCs w:val="22"/>
         </w:rPr>
-        <w:t xml:space="preserve"> peso diario, tarjeta semanal y plan de temporada.</w:t>
-      </w:r>
-    </w:p>
-    <w:p>
-      <w:pPr>
-        <w:spacing w:after="160" w:line="276"/>
-      </w:pPr>
-      <w:r>
-        <w:rPr>
-          <w:rFonts w:ascii="Calibri" w:cs="Calibri" w:eastAsia="Calibri" w:hAnsi="Calibri"/>
-          <w:b w:val="0"/>
-          <w:bCs w:val="false"/>
-          <w:color w:val="1A1A1A"/>
-          <w:sz w:val="22"/>
-          <w:szCs w:val="22"/>
-        </w:rPr>
-        <w:t>La barra superior dice en qué pestaña estás. Arriba a la derecha, en cualquier pestaña: calculadora de discos (icono de mancuerna) y Ajustes. Mientras dura una sesión de fuerza, la barra superior desaparece para dejar la pantalla entera al entrenamiento, y vuelve al guardar o descartar.</w:t>
+        <w:t xml:space="preserve"> peso diario, tarjeta semanal, energía diaria con el reparto en comidas y el menú semanal con IA, y plan de temporada.</w:t>
+      </w:r>
+    </w:p>
+    <w:p>
+      <w:pPr>
+        <w:spacing w:after="160" w:line="276"/>
+      </w:pPr>
+      <w:r>
+        <w:rPr>
+          <w:rFonts w:ascii="Calibri" w:cs="Calibri" w:eastAsia="Calibri" w:hAnsi="Calibri"/>
+          <w:b w:val="false"/>
+          <w:bCs w:val="false"/>
+          <w:color w:val="1A1A1A"/>
+          <w:sz w:val="22"/>
+          <w:szCs w:val="22"/>
+        </w:rPr>
+        <w:t xml:space="preserve">La barra superior dice en qué pestaña estás. Arriba a la derecha, en cualquier pestaña, están el botón </w:t>
+      </w:r>
+      <w:r>
+        <w:rPr>
+          <w:rFonts w:ascii="Calibri" w:cs="Calibri" w:eastAsia="Calibri" w:hAnsi="Calibri"/>
+          <w:b/>
+          <w:bCs/>
+          <w:color w:val="1A1A1A"/>
+          <w:sz w:val="22"/>
+          <w:szCs w:val="22"/>
+        </w:rPr>
+        <w:t xml:space="preserve">PRO</w:t>
+      </w:r>
+      <w:r>
+        <w:rPr>
+          <w:rFonts w:ascii="Calibri" w:cs="Calibri" w:eastAsia="Calibri" w:hAnsi="Calibri"/>
+          <w:b w:val="false"/>
+          <w:bCs w:val="false"/>
+          <w:color w:val="1A1A1A"/>
+          <w:sz w:val="22"/>
+          <w:szCs w:val="22"/>
+        </w:rPr>
+        <w:t xml:space="preserve"> y Ajustes. El botón PRO abre la pantalla TrueLift PRO y su color dice tu estado de un vistazo: verde con PRO comprado o suscrito, ámbar durante la prueba y tachado sin PRO. La calculadora de discos ya no está en la barra: se abre desde Rutina → Detalles → Material disponible, y cada serie trae su propio botón de discos (sección 7). Mientras dura una sesión de fuerza, la barra superior desaparece para dejar la pantalla entera al entrenamiento, y vuelve al guardar o descartar.</w:t>
       </w:r>
     </w:p>
     <w:p>
@@ -5702,6 +6046,33 @@
     </w:p>
     <w:p>
       <w:pPr>
+        <w:spacing w:after="160" w:line="276"/>
+      </w:pPr>
+      <w:r>
+        <w:rPr>
+          <w:rFonts w:ascii="Calibri" w:cs="Calibri" w:eastAsia="Calibri" w:hAnsi="Calibri"/>
+          <w:b/>
+          <w:bCs/>
+          <w:color w:val="1A1A1A"/>
+          <w:sz w:val="22"/>
+          <w:szCs w:val="22"/>
+        </w:rPr>
+        <w:t xml:space="preserve">Reiniciar base de rendimiento</w:t>
+      </w:r>
+      <w:r>
+        <w:rPr>
+          <w:rFonts w:ascii="Calibri" w:cs="Calibri" w:eastAsia="Calibri" w:hAnsi="Calibri"/>
+          <w:b w:val="false"/>
+          <w:bCs w:val="false"/>
+          <w:color w:val="1A1A1A"/>
+          <w:sz w:val="22"/>
+          <w:szCs w:val="22"/>
+        </w:rPr>
+        <w:t xml:space="preserve"> (gratis): en la tarjeta desplegada, bajo Cambiar ejercicio. Úsalo cuando algo cambie lo bastante como para que tus sesiones anteriores de ese ejercicio ya no sirvan de comparación: otra máquina con el mismo nombre, otra técnica o la vuelta de una lesión. A partir de ahí el ejercicio deja de compararse con lo anterior y la app construye una base nueva, como con un ejercicio recién añadido. Tu historial, tus marcas, tus gráficas y el peso propuesto se conservan. Pide doble confirmación y no aparece en los ejercicios que no puntúan rendimiento, como los medidos por tiempo.</w:t>
+      </w:r>
+    </w:p>
+    <w:p>
+      <w:pPr>
         <w:pStyle w:val="Heading2"/>
         <w:spacing w:after="140" w:before="240"/>
       </w:pPr>
@@ -6112,7 +6483,7 @@
           <w:sz w:val="22"/>
           <w:szCs w:val="22"/>
         </w:rPr>
-        <w:t xml:space="preserve">Se activa con el interruptor Drop set del panel de edición, con el ajuste % drop (de 5 a 30 %, 15 % por defecto). Hacen falta al menos dos series y no está disponible en ejercicios medidos por tiempo.</w:t>
+        <w:t xml:space="preserve">Se activa con el interruptor Drop set del panel de edición, con el ajuste % drop (de 5 a 30 %, 15 % por defecto). Ese porcentaje es una guía, no una cifra exacta: en el registro la app elige, cerca de esa bajada, pesos que se montan en segundos (sección 7). Hacen falta al menos dos series y no está disponible en ejercicios medidos por tiempo.</w:t>
       </w:r>
     </w:p>
     <w:p>
@@ -6247,7 +6618,7 @@
           <w:sz w:val="22"/>
           <w:szCs w:val="22"/>
         </w:rPr>
-        <w:t xml:space="preserve"> Cada ejercicio lleva una sola modalidad. El drop set y el top set + back-offs son excluyentes: activar uno apaga el otro. Y un ejercicio en superserie se entrena a series rectas, así que dentro de una superserie el interruptor de drop set queda apagado, con el motivo escrito debajo; si quieres el drop set, quita antes la superserie.</w:t>
+        <w:t xml:space="preserve"> Cada ejercicio lleva una sola modalidad. El drop set, el top set + back-offs y el rest-pause son excluyentes: activar uno apaga los otros. Y un ejercicio en superserie se entrena a series rectas, así que dentro de una superserie el interruptor de drop set queda apagado, con el motivo escrito debajo; si quieres el drop set, quita antes la superserie.</w:t>
       </w:r>
     </w:p>
     <w:p>
@@ -6431,7 +6802,7 @@
           <w:sz w:val="22"/>
           <w:szCs w:val="22"/>
         </w:rPr>
-        <w:t xml:space="preserve"> Una superserie solo enlaza ejercicios a series rectas, a los dos lados del enlace: si el ejercicio o el anterior llevan top set + back-offs o drop set, el interruptor Superserie con el anterior queda apagado y la nota de debajo dice qué hay que quitar y de qué ejercicio. Al revés también: dentro de una superserie, los interruptores de top + back-offs y de drop set quedan apagados. Son formas distintas de repartir la carga entre las series y no se pueden ejecutar a la vez.</w:t>
+        <w:t xml:space="preserve"> Una superserie solo enlaza ejercicios a series rectas, a los dos lados del enlace: si el ejercicio o el anterior llevan top set + back-offs, drop set o rest-pause, el interruptor Superserie con el anterior queda apagado y la nota de debajo dice qué hay que quitar y de qué ejercicio. Al revés también: dentro de una superserie, los interruptores de top + back-offs, de drop set y de rest-pause quedan apagados. Son formas distintas de repartir la carga entre las series y no se pueden ejecutar a la vez.</w:t>
       </w:r>
     </w:p>
     <w:p>
@@ -6464,6 +6835,251 @@
           <w:sz w:val="25"/>
           <w:szCs w:val="25"/>
         </w:rPr>
+        <w:t xml:space="preserve">Rest-pause (PRO)</w:t>
+      </w:r>
+    </w:p>
+    <w:p>
+      <w:pPr>
+        <w:spacing w:after="160" w:line="276"/>
+      </w:pPr>
+      <w:r>
+        <w:rPr>
+          <w:rFonts w:ascii="Calibri" w:cs="Calibri" w:eastAsia="Calibri" w:hAnsi="Calibri"/>
+          <w:b w:val="false"/>
+          <w:bCs w:val="false"/>
+          <w:color w:val="1A1A1A"/>
+          <w:sz w:val="22"/>
+          <w:szCs w:val="22"/>
+        </w:rPr>
+        <w:t xml:space="preserve">El rest-pause reparte un mismo esfuerzo en varias series cortas con el </w:t>
+      </w:r>
+      <w:r>
+        <w:rPr>
+          <w:rFonts w:ascii="Calibri" w:cs="Calibri" w:eastAsia="Calibri" w:hAnsi="Calibri"/>
+          <w:b/>
+          <w:bCs/>
+          <w:color w:val="1A1A1A"/>
+          <w:sz w:val="22"/>
+          <w:szCs w:val="22"/>
+        </w:rPr>
+        <w:t xml:space="preserve">mismo peso</w:t>
+      </w:r>
+      <w:r>
+        <w:rPr>
+          <w:rFonts w:ascii="Calibri" w:cs="Calibri" w:eastAsia="Calibri" w:hAnsi="Calibri"/>
+          <w:b w:val="false"/>
+          <w:bCs w:val="false"/>
+          <w:color w:val="1A1A1A"/>
+          <w:sz w:val="22"/>
+          <w:szCs w:val="22"/>
+        </w:rPr>
+        <w:t xml:space="preserve">, separadas por pausas muy breves. Cada serie se hace hasta el fallo: la última repetición que puedes completar con buena técnica. Por eso, con el rest-pause activo, la rutina no te pide RIR.</w:t>
+      </w:r>
+    </w:p>
+    <w:p>
+      <w:pPr>
+        <w:spacing w:after="160" w:line="276"/>
+      </w:pPr>
+      <w:r>
+        <w:rPr>
+          <w:rFonts w:ascii="Calibri" w:cs="Calibri" w:eastAsia="Calibri" w:hAnsi="Calibri"/>
+          <w:b w:val="false"/>
+          <w:bCs w:val="false"/>
+          <w:color w:val="1A1A1A"/>
+          <w:sz w:val="22"/>
+          <w:szCs w:val="22"/>
+        </w:rPr>
+        <w:t xml:space="preserve">Se activa con el interruptor </w:t>
+      </w:r>
+      <w:r>
+        <w:rPr>
+          <w:rFonts w:ascii="Calibri" w:cs="Calibri" w:eastAsia="Calibri" w:hAnsi="Calibri"/>
+          <w:b/>
+          <w:bCs/>
+          <w:color w:val="1A1A1A"/>
+          <w:sz w:val="22"/>
+          <w:szCs w:val="22"/>
+        </w:rPr>
+        <w:t xml:space="preserve">Rest-pause</w:t>
+      </w:r>
+      <w:r>
+        <w:rPr>
+          <w:rFonts w:ascii="Calibri" w:cs="Calibri" w:eastAsia="Calibri" w:hAnsi="Calibri"/>
+          <w:b w:val="false"/>
+          <w:bCs w:val="false"/>
+          <w:color w:val="1A1A1A"/>
+          <w:sz w:val="22"/>
+          <w:szCs w:val="22"/>
+        </w:rPr>
+        <w:t xml:space="preserve"> del panel de edición, bajo el de drop set. Al activarlo aparece el ajuste </w:t>
+      </w:r>
+      <w:r>
+        <w:rPr>
+          <w:rFonts w:ascii="Calibri" w:cs="Calibri" w:eastAsia="Calibri" w:hAnsi="Calibri"/>
+          <w:b/>
+          <w:bCs/>
+          <w:color w:val="1A1A1A"/>
+          <w:sz w:val="22"/>
+          <w:szCs w:val="22"/>
+        </w:rPr>
+        <w:t xml:space="preserve">Pausa entre series</w:t>
+      </w:r>
+      <w:r>
+        <w:rPr>
+          <w:rFonts w:ascii="Calibri" w:cs="Calibri" w:eastAsia="Calibri" w:hAnsi="Calibri"/>
+          <w:b w:val="false"/>
+          <w:bCs w:val="false"/>
+          <w:color w:val="1A1A1A"/>
+          <w:sz w:val="22"/>
+          <w:szCs w:val="22"/>
+        </w:rPr>
+        <w:t xml:space="preserve"> (de 10 a 50 segundos) y el rango pasa a ser </w:t>
+      </w:r>
+      <w:r>
+        <w:rPr>
+          <w:rFonts w:ascii="Calibri" w:cs="Calibri" w:eastAsia="Calibri" w:hAnsi="Calibri"/>
+          <w:b/>
+          <w:bCs/>
+          <w:color w:val="1A1A1A"/>
+          <w:sz w:val="22"/>
+          <w:szCs w:val="22"/>
+        </w:rPr>
+        <w:t xml:space="preserve">Rango de reps totales</w:t>
+      </w:r>
+      <w:r>
+        <w:rPr>
+          <w:rFonts w:ascii="Calibri" w:cs="Calibri" w:eastAsia="Calibri" w:hAnsi="Calibri"/>
+          <w:b w:val="false"/>
+          <w:bCs w:val="false"/>
+          <w:color w:val="1A1A1A"/>
+          <w:sz w:val="22"/>
+          <w:szCs w:val="22"/>
+        </w:rPr>
+        <w:t xml:space="preserve">: lo que cuenta es la suma de repeticiones de todas las series. Hacen falta al menos dos series y no está disponible en ejercicios medidos por tiempo. La tarjeta plegada lo marca con el chip RP.</w:t>
+      </w:r>
+    </w:p>
+    <w:p>
+      <w:pPr>
+        <w:spacing w:after="160" w:line="276"/>
+      </w:pPr>
+      <w:r>
+        <w:rPr>
+          <w:rFonts w:ascii="Calibri" w:cs="Calibri" w:eastAsia="Calibri" w:hAnsi="Calibri"/>
+          <w:b/>
+          <w:bCs/>
+          <w:color w:val="1A1A1A"/>
+          <w:sz w:val="22"/>
+          <w:szCs w:val="22"/>
+        </w:rPr>
+        <w:t xml:space="preserve">Para qué sirve.</w:t>
+      </w:r>
+      <w:r>
+        <w:rPr>
+          <w:rFonts w:ascii="Calibri" w:cs="Calibri" w:eastAsia="Calibri" w:hAnsi="Calibri"/>
+          <w:b w:val="false"/>
+          <w:bCs w:val="false"/>
+          <w:color w:val="1A1A1A"/>
+          <w:sz w:val="22"/>
+          <w:szCs w:val="22"/>
+        </w:rPr>
+        <w:t xml:space="preserve"> Acumular mucho trabajo en poco tiempo: las pausas cortas solo sirven para arañar unas repeticiones más con el mismo peso, sin cambiar de ejercicio.</w:t>
+      </w:r>
+    </w:p>
+    <w:p>
+      <w:pPr>
+        <w:spacing w:after="160" w:line="276"/>
+      </w:pPr>
+      <w:r>
+        <w:rPr>
+          <w:rFonts w:ascii="Calibri" w:cs="Calibri" w:eastAsia="Calibri" w:hAnsi="Calibri"/>
+          <w:b/>
+          <w:bCs/>
+          <w:color w:val="1A1A1A"/>
+          <w:sz w:val="22"/>
+          <w:szCs w:val="22"/>
+        </w:rPr>
+        <w:t xml:space="preserve">Contras.</w:t>
+      </w:r>
+      <w:r>
+        <w:rPr>
+          <w:rFonts w:ascii="Calibri" w:cs="Calibri" w:eastAsia="Calibri" w:hAnsi="Calibri"/>
+          <w:b w:val="false"/>
+          <w:bCs w:val="false"/>
+          <w:color w:val="1A1A1A"/>
+          <w:sz w:val="22"/>
+          <w:szCs w:val="22"/>
+        </w:rPr>
+        <w:t xml:space="preserve"> Como el drop set, es exigente y fatigante. Úsalo en aislamiento o en máquinas, donde fallar es seguro, y evítalo en los ejercicios libres pesados en los que fallar sea arriesgado.</w:t>
+      </w:r>
+    </w:p>
+    <w:p>
+      <w:pPr>
+        <w:spacing w:after="160" w:line="276"/>
+      </w:pPr>
+      <w:r>
+        <w:rPr>
+          <w:rFonts w:ascii="Calibri" w:cs="Calibri" w:eastAsia="Calibri" w:hAnsi="Calibri"/>
+          <w:b/>
+          <w:bCs/>
+          <w:color w:val="1A1A1A"/>
+          <w:sz w:val="22"/>
+          <w:szCs w:val="22"/>
+        </w:rPr>
+        <w:t xml:space="preserve">Cómo lo trata la app.</w:t>
+      </w:r>
+      <w:r>
+        <w:rPr>
+          <w:rFonts w:ascii="Calibri" w:cs="Calibri" w:eastAsia="Calibri" w:hAnsi="Calibri"/>
+          <w:b w:val="false"/>
+          <w:bCs w:val="false"/>
+          <w:color w:val="1A1A1A"/>
+          <w:sz w:val="22"/>
+          <w:szCs w:val="22"/>
+        </w:rPr>
+        <w:t xml:space="preserve"> Cuando la suma de repeticiones alcanza el objetivo, la próxima vez te propone subir el peso; si te quedas corto, mantienes el peso y cuenta como un intento, igual que en cualquier otro ejercicio. Para tu rendimiento y tus marcas solo cuenta la primera serie; las demás suman a tu volumen y a tu tonelaje. En una semana de descarga o en un día con fatiga la app te pide dejar alguna repetición en reserva. Tras la última serie descansas lo normal antes del siguiente ejercicio.</w:t>
+      </w:r>
+    </w:p>
+    <w:p>
+      <w:pPr>
+        <w:spacing w:after="160" w:line="276"/>
+      </w:pPr>
+      <w:r>
+        <w:rPr>
+          <w:rFonts w:ascii="Calibri" w:cs="Calibri" w:eastAsia="Calibri" w:hAnsi="Calibri"/>
+          <w:b/>
+          <w:bCs/>
+          <w:color w:val="1A1A1A"/>
+          <w:sz w:val="22"/>
+          <w:szCs w:val="22"/>
+        </w:rPr>
+        <w:t xml:space="preserve">Incompatibilidades.</w:t>
+      </w:r>
+      <w:r>
+        <w:rPr>
+          <w:rFonts w:ascii="Calibri" w:cs="Calibri" w:eastAsia="Calibri" w:hAnsi="Calibri"/>
+          <w:b w:val="false"/>
+          <w:bCs w:val="false"/>
+          <w:color w:val="1A1A1A"/>
+          <w:sz w:val="22"/>
+          <w:szCs w:val="22"/>
+        </w:rPr>
+        <w:t xml:space="preserve"> El rest-pause no se combina con top set + back-offs, drop set ni superserie: al activarlo se apagan los otros y se suelta la superserie. En el Excel tiene sus propias columnas.</w:t>
+      </w:r>
+    </w:p>
+    <w:p>
+      <w:pPr>
+        <w:pStyle w:val="Heading2"/>
+        <w:spacing w:after="140" w:before="240"/>
+      </w:pPr>
+      <w:r>
+        <w:rPr>
+          <w:rFonts w:ascii="Calibri" w:cs="Calibri" w:eastAsia="Calibri" w:hAnsi="Calibri"/>
+          <w:b/>
+          <w:bCs/>
+          <w:color w:val="1A1A1A"/>
+          <w:sz w:val="25"/>
+          <w:szCs w:val="25"/>
+        </w:rPr>
         <w:t xml:space="preserve">Herramientas de rutina</w:t>
       </w:r>
     </w:p>
@@ -6639,7 +7255,29 @@
           <w:sz w:val="22"/>
           <w:szCs w:val="22"/>
         </w:rPr>
-        <w:t xml:space="preserve"> (PRO): crea un ejercicio propio con nombre, patrón y grupos.</w:t>
+        <w:t xml:space="preserve"> (PRO): crea un ejercicio propio con nombre, patrón y grupos, y elige si </w:t>
+      </w:r>
+      <w:r>
+        <w:rPr>
+          <w:rFonts w:ascii="Calibri" w:cs="Calibri" w:eastAsia="Calibri" w:hAnsi="Calibri"/>
+          <w:b/>
+          <w:bCs/>
+          <w:color w:val="1A1A1A"/>
+          <w:sz w:val="22"/>
+          <w:szCs w:val="22"/>
+        </w:rPr>
+        <w:t xml:space="preserve">progresa por</w:t>
+      </w:r>
+      <w:r>
+        <w:rPr>
+          <w:rFonts w:ascii="Calibri" w:cs="Calibri" w:eastAsia="Calibri" w:hAnsi="Calibri"/>
+          <w:b w:val="false"/>
+          <w:bCs w:val="false"/>
+          <w:color w:val="1A1A1A"/>
+          <w:sz w:val="22"/>
+          <w:szCs w:val="22"/>
+        </w:rPr>
+        <w:t xml:space="preserve"> repeticiones o por tiempo. Los de tiempo funcionan como la plancha o el paseo del granjero de la biblioteca: anotas segundos en lugar de repeticiones y progresan alargando el tiempo. Cuando el ejercicio ya tiene series registradas, el tipo no se puede cambiar, para no mezclar repeticiones con segundos.</w:t>
       </w:r>
     </w:p>
     <w:p>
@@ -6708,7 +7346,7 @@
           <w:sz w:val="22"/>
           <w:szCs w:val="22"/>
         </w:rPr>
-        <w:t xml:space="preserve">La plantilla de Excel tiene, por día, tres columnas para top set + back-offs (sí/no, % de back-off y RIR back) y otras tres para las modalidades nuevas: Superserie (nº) —filas consecutivas con el mismo número quedan enlazadas—, Drop set (sí/no) y % drop. Sus desplegables ofrecen la biblioteca completa de ejercicios de la app y solo dejan marcar una modalidad por fila, con un mensaje de error si te sales de lo permitido. Si las columnas están vacías o indican «no», se interpretan como series rectas, así que las plantillas antiguas se importan sin cambios.</w:t>
+        <w:t xml:space="preserve">La plantilla de Excel tiene, por día, tres columnas para top set + back-offs (sí/no, % de back-off y RIR back) y otras para las demás modalidades: Superserie (nº) —filas consecutivas con el mismo número quedan enlazadas—, Drop set (sí/no), % drop, Rest-pause (sí/no) y Pausa RP (s). Sus desplegables ofrecen la biblioteca completa de ejercicios de la app y solo dejan marcar una modalidad por fila, con un mensaje de error si te sales de lo permitido. Si las columnas están vacías o indican «no», se interpretan como series rectas, así que las plantillas antiguas se importan sin cambios. Los ejercicios propios viajan con su tipo, por repeticiones o por tiempo.</w:t>
       </w:r>
     </w:p>
     <w:p>
@@ -7069,13 +7707,13 @@
       <w:r>
         <w:rPr>
           <w:rFonts w:ascii="Calibri" w:cs="Calibri" w:eastAsia="Calibri" w:hAnsi="Calibri"/>
-          <w:b w:val="0"/>
-          <w:bCs w:val="false"/>
-          <w:color w:val="1A1A1A"/>
-          <w:sz w:val="22"/>
-          <w:szCs w:val="22"/>
-        </w:rPr>
-        <w:t>Mientras corre el descanso, la cuenta atrás ocupa el sitio del contador de series, con Saltar al lado y OK al llegar a cero, y el tiempo que queda de sesión sigue a la vista. La cifra avisa por color antes de sonar: verde mientras queda descanso de sobra, ámbar cuando se acerca el final, rojo en el tramo corto y con un parpadeo suave en los últimos segundos, para que se vea de reojo desde la máquina sin tener que leer los números. Al llegar a cero suena la alarma de siempre y la cifra vuelve al verde: el descanso está cumplido.</w:t>
+          <w:b w:val="false"/>
+          <w:bCs w:val="false"/>
+          <w:color w:val="1A1A1A"/>
+          <w:sz w:val="22"/>
+          <w:szCs w:val="22"/>
+        </w:rPr>
+        <w:t xml:space="preserve">Mientras corre el descanso, la cuenta atrás ocupa el sitio del contador de series, con Saltar al lado y OK al llegar a cero, y el tiempo que queda de sesión sigue a la vista. La cifra avisa por color antes de sonar: verde mientras queda descanso de sobra, ámbar cuando se acerca el final, rojo en el tramo corto y con un parpadeo suave en los últimos segundos, para que se vea de reojo desde la máquina sin tener que leer los números. Con los pitidos de los minutos activos, además, cada minuto entero que pasa lo oyes (sección 4). Al llegar a cero suena la alarma de siempre y la cifra vuelve al verde: el descanso está cumplido.</w:t>
       </w:r>
     </w:p>
     <w:p>
@@ -7327,7 +7965,7 @@
           <w:sz w:val="22"/>
           <w:szCs w:val="22"/>
         </w:rPr>
-        <w:t xml:space="preserve">Al anotar la última serie aparece el veredicto del ejercicio: tu rendimiento frente a tu base en ese ejercicio. Se cierra con un toque.</w:t>
+        <w:t xml:space="preserve">Al anotar la última serie aparece el veredicto del ejercicio: tu rendimiento frente a tu base en ese ejercicio. Si has hecho las repeticiones objetivo pero con el RIR por debajo del previsto, el veredicto explica por qué la carga se consolida en lugar de subir: terminaste más cerca del fallo de lo planeado, así que ese peso todavía te exige más de lo que marca el plan. La próxima vez repite la carga y llega a las mismas repeticiones dejando el margen previsto, y entonces subirá. Se cierra con un toque.</w:t>
       </w:r>
     </w:p>
     <w:p>
@@ -7387,7 +8025,7 @@
           <w:sz w:val="22"/>
           <w:szCs w:val="22"/>
         </w:rPr>
-        <w:t xml:space="preserve">El botón de discos del panel abre la misma calculadora que hay arriba en la barra, pero ya rellena con el ejercicio y la carga que tienes delante: no hay que teclear nada.</w:t>
+        <w:t xml:space="preserve">El botón de discos del panel abre la calculadora de discos, pero ya rellena con el ejercicio y la carga que tienes delante: no hay que teclear nada.</w:t>
       </w:r>
     </w:p>
     <w:p>
@@ -7467,7 +8105,7 @@
           <w:sz w:val="22"/>
           <w:szCs w:val="22"/>
         </w:rPr>
-        <w:t xml:space="preserve">La calculadora de la barra superior sigue estando, y allí las series de calentamiento parten de tu 1RM. Aquí parten del peso que vas a levantar ahora, que es el dato que ya se conoce. El botón está también en el modo foco.</w:t>
+        <w:t xml:space="preserve">La calculadora completa sigue disponible desde Rutina → Detalles → Material disponible, y allí las series de calentamiento parten de tu 1RM. Aquí parten del peso que vas a levantar ahora, que es el dato que ya se conoce. El botón está también en el modo foco.</w:t>
       </w:r>
     </w:p>
     <w:p>
@@ -7516,7 +8154,7 @@
           <w:sz w:val="22"/>
           <w:szCs w:val="22"/>
         </w:rPr>
-        <w:t xml:space="preserve"> las series se etiquetan TOP, Drop 1, Drop 2… El peso de cada drop se rellena solo bajando el porcentaje configurado respecto a la serie anterior; si corriges uno, los siguientes le siguen. Las repeticiones propuestas son las que hiciste en ese mismo drop la vez anterior, y el RIR objetivo es 0 (3 en descarga). El cronómetro no arranca entre drops: el descanso llega tras el último.</w:t>
+        <w:t xml:space="preserve"> las series se etiquetan TOP, Drop 1, Drop 2… El peso de cada drop se rellena solo con una bajada que se monta en segundos: en barra y en máquinas de discos, quitando discos de los que ya tienes puestos y sin recurrir a microcargas; en torres de placas, poleas y mancuernas, el escalón cercano, mejor si es un número redondo. El porcentaje configurado hace de guía. Si repites la misma escalera que la última vez, la app te propone los mismos pesos, incluidos los que corregiste a mano. En la primera serie el panel anuncia los drops previstos para que dejes los discos preparados, y en cada drop dice qué quitar y qué poner por lado. Si corriges un drop, los siguientes le siguen. Las repeticiones propuestas son las que hiciste en ese mismo drop la vez anterior, y el RIR objetivo es 0 (3 en descarga). El cronómetro no arranca entre drops: el descanso llega tras el último.</w:t>
       </w:r>
     </w:p>
     <w:p>
@@ -7563,13 +8201,45 @@
       <w:r>
         <w:rPr>
           <w:rFonts w:ascii="Calibri" w:cs="Calibri" w:eastAsia="Calibri" w:hAnsi="Calibri"/>
-          <w:b w:val="false"/>
-          <w:bCs w:val="false"/>
-          <w:color w:val="1A1A1A"/>
-          <w:sz w:val="22"/>
-          <w:szCs w:val="22"/>
-        </w:rPr>
-        <w:t xml:space="preserve">La primera vez que te toca una serie de un drop set o de una superserie, la app te lo explica en corto; el «?» del interruptor lo cuenta entero.</w:t>
+          <w:b/>
+          <w:bCs/>
+          <w:color w:val="1A1A1A"/>
+          <w:sz w:val="22"/>
+          <w:szCs w:val="22"/>
+        </w:rPr>
+        <w:t xml:space="preserve">Rest-pause:</w:t>
+      </w:r>
+      <w:r>
+        <w:rPr>
+          <w:rFonts w:ascii="Calibri" w:cs="Calibri" w:eastAsia="Calibri" w:hAnsi="Calibri"/>
+          <w:b w:val="false"/>
+          <w:bCs w:val="false"/>
+          <w:color w:val="1A1A1A"/>
+          <w:sz w:val="22"/>
+          <w:szCs w:val="22"/>
+        </w:rPr>
+        <w:t xml:space="preserve"> la cabecera indica las series, el total de repeticiones a conseguir y RIR 0. Las repeticiones de cada serie son una estimación y el panel te va diciendo cuántas llevas acumuladas. Al anotar una serie que no es la última arranca la pausa corta; tras la última, el descanso normal. En la última serie se ve cuántas repeticiones te faltan para llegar al total y, al cerrar el ejercicio, el veredicto da el total conseguido.</w:t>
+      </w:r>
+    </w:p>
+    <w:p>
+      <w:pPr>
+        <w:pStyle w:val="ListParagraph"/>
+        <w:numPr>
+          <w:ilvl w:val="0"/>
+          <w:numId w:val="2"/>
+        </w:numPr>
+        <w:spacing w:after="100" w:line="276"/>
+      </w:pPr>
+      <w:r>
+        <w:rPr>
+          <w:rFonts w:ascii="Calibri" w:cs="Calibri" w:eastAsia="Calibri" w:hAnsi="Calibri"/>
+          <w:b w:val="false"/>
+          <w:bCs w:val="false"/>
+          <w:color w:val="1A1A1A"/>
+          <w:sz w:val="22"/>
+          <w:szCs w:val="22"/>
+        </w:rPr>
+        <w:t xml:space="preserve">La primera vez que te toca una serie de un drop set, de una superserie o de un rest-pause, la app te lo explica en corto; el «?» del interruptor lo cuenta entero.</w:t>
       </w:r>
     </w:p>
     <w:p>
@@ -7693,6 +8363,38 @@
           <w:sz w:val="22"/>
           <w:szCs w:val="22"/>
         </w:rPr>
+        <w:t xml:space="preserve">Registro fijo del ejercicio:</w:t>
+      </w:r>
+      <w:r>
+        <w:rPr>
+          <w:rFonts w:ascii="Calibri" w:cs="Calibri" w:eastAsia="Calibri" w:hAnsi="Calibri"/>
+          <w:b w:val="false"/>
+          <w:bCs w:val="false"/>
+          <w:color w:val="1A1A1A"/>
+          <w:sz w:val="22"/>
+          <w:szCs w:val="22"/>
+        </w:rPr>
+        <w:t xml:space="preserve"> una nota que no es de la sesión sino del ejercicio, y que tendrás delante en todas las sesiones: la altura del asiento, el agarre, el pin de la máquina… Se edita cuando quieras y se conserva tal cual hasta que la cambies.</w:t>
+      </w:r>
+    </w:p>
+    <w:p>
+      <w:pPr>
+        <w:pStyle w:val="ListParagraph"/>
+        <w:numPr>
+          <w:ilvl w:val="0"/>
+          <w:numId w:val="2"/>
+        </w:numPr>
+        <w:spacing w:after="100" w:line="276"/>
+      </w:pPr>
+      <w:r>
+        <w:rPr>
+          <w:rFonts w:ascii="Calibri" w:cs="Calibri" w:eastAsia="Calibri" w:hAnsi="Calibri"/>
+          <w:b/>
+          <w:bCs/>
+          <w:color w:val="1A1A1A"/>
+          <w:sz w:val="22"/>
+          <w:szCs w:val="22"/>
+        </w:rPr>
         <w:t xml:space="preserve">Ejercicio no realizado:</w:t>
       </w:r>
       <w:r>
@@ -7806,29 +8508,29 @@
       <w:r>
         <w:rPr>
           <w:rFonts w:ascii="Calibri" w:cs="Calibri" w:eastAsia="Calibri" w:hAnsi="Calibri"/>
-          <w:b w:val="0"/>
-          <w:bCs w:val="false"/>
-          <w:color w:val="1A1A1A"/>
-          <w:sz w:val="22"/>
-          <w:szCs w:val="22"/>
-        </w:rPr>
-        <w:t>El botón Ver sesión de la cabecera abre un menú anclado justo debajo, con el nombre de la sesión arriba y todos los ejercicios del día debajo. Cada fila lleva la lámina del ejercicio, las series anotadas sobre las previstas y el objetivo del día y, en una segunda línea, lo previsto de verdad: el peso y las repeticiones de cada serie, enumeradas cuando no todas llevan lo mismo, como en un top set + back-offs o en un drop set. Toca una fila para poner ese ejercicio delante.</w:t>
-      </w:r>
-    </w:p>
-    <w:p>
-      <w:pPr>
-        <w:spacing w:after="160" w:line="276"/>
-      </w:pPr>
-      <w:r>
-        <w:rPr>
-          <w:rFonts w:ascii="Calibri" w:cs="Calibri" w:eastAsia="Calibri" w:hAnsi="Calibri"/>
-          <w:b w:val="0"/>
-          <w:bCs w:val="false"/>
-          <w:color w:val="1A1A1A"/>
-          <w:sz w:val="22"/>
-          <w:szCs w:val="22"/>
-        </w:rPr>
-        <w:t>A la derecha de cada fila, la marca de cómo quedó: visto verde en el ejercicio terminado, aspa roja en el marcado como no realizado y nada en el que sigue pendiente. El ejercicio que tienes delante va realzado. Al pie del desplegable están Guardar y Descartar, que son las dos únicas salidas de una sesión en curso.</w:t>
+          <w:b w:val="false"/>
+          <w:bCs w:val="false"/>
+          <w:color w:val="1A1A1A"/>
+          <w:sz w:val="22"/>
+          <w:szCs w:val="22"/>
+        </w:rPr>
+        <w:t xml:space="preserve">El botón Ver sesión de la cabecera abre un menú anclado justo debajo, con el nombre de la sesión arriba y todos los ejercicios del día debajo. Cada fila lleva la lámina del ejercicio, las series anotadas sobre las previstas y el objetivo del día y, debajo, una ficha por serie con su rótulo (S1, TOP, BACK 1, DROP 1…), el peso en grande y las repeticiones. El color de las fichas dice en qué punto va cada serie: la hecha va rellena en verde lima, con un visto y las repeticiones que hiciste; la que toca ahora lleva el borde lima, y las que quedan van en neutro. En las máquinas de asistencia y en los ejercicios con lastre, encima de las fichas se indica de qué carga se habla. Toca una fila para poner ese ejercicio delante.</w:t>
+      </w:r>
+    </w:p>
+    <w:p>
+      <w:pPr>
+        <w:spacing w:after="160" w:line="276"/>
+      </w:pPr>
+      <w:r>
+        <w:rPr>
+          <w:rFonts w:ascii="Calibri" w:cs="Calibri" w:eastAsia="Calibri" w:hAnsi="Calibri"/>
+          <w:b w:val="false"/>
+          <w:bCs w:val="false"/>
+          <w:color w:val="1A1A1A"/>
+          <w:sz w:val="22"/>
+          <w:szCs w:val="22"/>
+        </w:rPr>
+        <w:t xml:space="preserve">A la derecha de cada fila, la marca de cómo quedó: visto verde en el ejercicio terminado —con una flecha hacia arriba delante si hoy has conseguido progresar en él—, aspa roja y fichas apagadas en el marcado como no realizado, y nada en el que sigue pendiente. El ejercicio que tienes delante va realzado. Al pie del desplegable están Guardar y Descartar, que son las dos únicas salidas de una sesión en curso.</w:t>
       </w:r>
     </w:p>
     <w:p>
@@ -8143,7 +8845,7 @@
           <w:sz w:val="22"/>
           <w:szCs w:val="22"/>
         </w:rPr>
-        <w:t xml:space="preserve"> tipo (o nombre propio), día, duración en minutos e intensidad de 1 a 10. Con la duración y la intensidad, la app calcula tu carga semanal de cardio y la compara con lo habitual en ti; una semana muy por encima cuenta como señal de fatiga.</w:t>
+        <w:t xml:space="preserve"> tipo (o nombre propio), día, duración en minutos e intensidad de 1 a 10. Con la duración y la intensidad, la app calcula tu carga semanal de cardio y la compara con lo habitual en ti; una semana muy por encima cuenta como señal de fatiga. Cada cardio del historial lleva un lápiz para corregir el tipo, el día, la duración o la intensidad sin tener que borrarlo; en los que vienen del reloj se conservan el pulso y las calorías.</w:t>
       </w:r>
     </w:p>
     <w:p>
@@ -8281,7 +8983,39 @@
           <w:sz w:val="22"/>
           <w:szCs w:val="22"/>
         </w:rPr>
-        <w:t xml:space="preserve">Las sesiones recientes, cada una con Compartir (imagen para redes), Editar (peso, repeticiones, RIR, observaciones, fecha, ejercicios no realizados y ejercicios hechos con molestias) y Eliminar. En los ejercicios con carga por serie, la edición muestra una fila por serie titulada Top / Drop 1 / Drop 2… Con PRO, cada sesión lleva su luz (verde, ámbar o rojo). Si registraste en tiempo real, aparece la duración.</w:t>
+        <w:t xml:space="preserve">Las sesiones recientes, cada una con Compartir (imagen para redes, sección 18), Editar (peso, repeticiones, RIR, observaciones, fecha, ejercicios no realizados y ejercicios hechos con molestias) y Eliminar. En los ejercicios con carga por serie, la edición muestra una fila por serie titulada Top / Drop 1 / Drop 2… Con PRO, cada sesión lleva su luz: verde, ámbar («Sesión con intensidad modulada») o roja («Sesión con intensidad y volumen modulados»); si ese día la disponibilidad se repartió por trenes, la franja lo dice («Tren inferior limitado · Tren superior sin limitaciones»). Si registraste en tiempo real, aparece la duración.</w:t>
+      </w:r>
+    </w:p>
+    <w:p>
+      <w:pPr>
+        <w:pStyle w:val="ListParagraph"/>
+        <w:numPr>
+          <w:ilvl w:val="0"/>
+          <w:numId w:val="2"/>
+        </w:numPr>
+        <w:spacing w:after="100" w:line="276"/>
+      </w:pPr>
+      <w:r>
+        <w:rPr>
+          <w:rFonts w:ascii="Calibri" w:cs="Calibri" w:eastAsia="Calibri" w:hAnsi="Calibri"/>
+          <w:b/>
+          <w:bCs/>
+          <w:color w:val="1A1A1A"/>
+          <w:sz w:val="22"/>
+          <w:szCs w:val="22"/>
+        </w:rPr>
+        <w:t xml:space="preserve">Sesiones de rutinas anteriores:</w:t>
+      </w:r>
+      <w:r>
+        <w:rPr>
+          <w:rFonts w:ascii="Calibri" w:cs="Calibri" w:eastAsia="Calibri" w:hAnsi="Calibri"/>
+          <w:b w:val="false"/>
+          <w:bCs w:val="false"/>
+          <w:color w:val="1A1A1A"/>
+          <w:sz w:val="22"/>
+          <w:szCs w:val="22"/>
+        </w:rPr>
+        <w:t xml:space="preserve"> cambiar de rutina —o importar una— no vacía el historial. Todo lo que has entrenado sigue en la lista, en el calendario y en Todas las sesiones, y las sesiones de una rutina anterior llevan una franja que lo indica («De una rutina anterior · se guarda tal y como se registró»). Se consultan, se comparten y se borran, pero no se editan, porque se midieron con otra rutina.</w:t>
       </w:r>
     </w:p>
     <w:p>
@@ -9069,13 +9803,13 @@
       <w:r>
         <w:rPr>
           <w:rFonts w:ascii="Calibri" w:cs="Calibri" w:eastAsia="Calibri" w:hAnsi="Calibri"/>
-          <w:b w:val="0"/>
-          <w:bCs w:val="false"/>
-          <w:color w:val="1A1A1A"/>
-          <w:sz w:val="22"/>
-          <w:szCs w:val="22"/>
-        </w:rPr>
-        <w:t>Con la VFC activada: VFC nocturna (ms) y FC en reposo (lpm), los valores de tu reloj o pulsera. Con el reloj conectado (ver más abajo) llegan ya puestos y no hay que teclearlos. La casilla Dato poco fiable descarta los dos de ese día. Si los números vienen del último registro y no los tocas, la app te pide confirmar que son los de hoy.</w:t>
+          <w:b w:val="false"/>
+          <w:bCs w:val="false"/>
+          <w:color w:val="1A1A1A"/>
+          <w:sz w:val="22"/>
+          <w:szCs w:val="22"/>
+        </w:rPr>
+        <w:t xml:space="preserve">Con la VFC activada: VFC nocturna (ms) y FC en reposo (lpm), los valores de tu reloj o pulsera. Con el reloj conectado (ver más abajo) llegan ya puestos y no hay que teclearlos. La casilla Dato poco fiable descarta los dos de ese día; el «?» de al lado explica cuándo conviene marcarla —alcohol, una noche fuera de casa, una cena muy tardía, un viaje o el reloj mal puesto— y cuándo no: haber dormido mal sin un motivo claro sí es información útil. Si los números vienen del último registro y no los tocas, la app te pide confirmar que son los de hoy.</w:t>
       </w:r>
     </w:p>
     <w:p>
@@ -9268,7 +10002,7 @@
           <w:sz w:val="22"/>
           <w:szCs w:val="22"/>
         </w:rPr>
-        <w:t xml:space="preserve"> se mantienen las cargas y el RIR objetivo sube 1. Si la fatiga afecta solo a un tren, el otro se entrena con normalidad.</w:t>
+        <w:t xml:space="preserve"> se mantienen las cargas y el RIR objetivo sube 1. Cuando el ámbar viene solo de una molestia leve, la app no congela las cargas: sigue subiendo, con prudencia. Si lo que te limita es de un solo tren, el otro se entrena con normalidad (ver más abajo).</w:t>
       </w:r>
     </w:p>
     <w:p>
@@ -9343,6 +10077,33 @@
           <w:szCs w:val="22"/>
         </w:rPr>
         <w:t xml:space="preserve">Sin check-in, la app no asume que estás bien: te lo recuerda antes de proponer subidas.</w:t>
+      </w:r>
+    </w:p>
+    <w:p>
+      <w:pPr>
+        <w:spacing w:after="160" w:line="276"/>
+      </w:pPr>
+      <w:r>
+        <w:rPr>
+          <w:rFonts w:ascii="Calibri" w:cs="Calibri" w:eastAsia="Calibri" w:hAnsi="Calibri"/>
+          <w:b/>
+          <w:bCs/>
+          <w:color w:val="1A1A1A"/>
+          <w:sz w:val="22"/>
+          <w:szCs w:val="22"/>
+        </w:rPr>
+        <w:t xml:space="preserve">Disponibilidad por trenes.</w:t>
+      </w:r>
+      <w:r>
+        <w:rPr>
+          <w:rFonts w:ascii="Calibri" w:cs="Calibri" w:eastAsia="Calibri" w:hAnsi="Calibri"/>
+          <w:b w:val="false"/>
+          <w:bCs w:val="false"/>
+          <w:color w:val="1A1A1A"/>
+          <w:sz w:val="22"/>
+          <w:szCs w:val="22"/>
+        </w:rPr>
+        <w:t xml:space="preserve"> Algunas señales son de todo el cuerpo —sueño, ánimo, estrés, enfermedad, VFC, fatiga acumulada o rendimiento— y otras son locales: el dolor articular y las agujetas llevan su zona. Cuando lo que te limita es solo de un tren, el día se reparte: cada tren tiene su color y su puntuación, y el que está libre sigue su curso con normalidad, con sus subidas, sus récords y sus intentos de progresión. El chip de la cabecera lo enseña según lo que cargue la sesión del día: en una sesión de un solo tren, su estado y su número, con el otro como un punto pequeño con su abreviatura (Sup. o Inf.); en una que carga los dos, un punto y un número por tren. Al tocarlo, el desglose dice qué tren te limita y cuál no. En los ejercicios que no se ven afectados, en lugar del aviso aparece una línea discreta que lo dice. Algunos ejercicios de tren superior que también cargan el inferior —los remos con el tronco inclinado, el press militar de pie o el paseo del granjero— se protegen como los de piernas. Ya en el check-in, si lo que marcas limita solo un tren, ves en vivo cómo queda cada uno. Si alguna señal es de todo el cuerpo, no hay reparto y el día se ve como siempre.</w:t>
       </w:r>
     </w:p>
     <w:p>
@@ -9440,13 +10201,99 @@
       <w:r>
         <w:rPr>
           <w:rFonts w:ascii="Calibri" w:cs="Calibri" w:eastAsia="Calibri" w:hAnsi="Calibri"/>
+          <w:b w:val="false"/>
+          <w:bCs w:val="false"/>
+          <w:color w:val="1A1A1A"/>
+          <w:sz w:val="22"/>
+          <w:szCs w:val="22"/>
+        </w:rPr>
+        <w:t xml:space="preserve">Si llevas reloj o pulsera, TrueLift puede aprovechar lo que ya mide en lugar de que lo teclees. Se activa en Ajustes → Autorregulación y VFC → </w:t>
+      </w:r>
+      <w:r>
+        <w:rPr>
+          <w:rFonts w:ascii="Calibri" w:cs="Calibri" w:eastAsia="Calibri" w:hAnsi="Calibri"/>
+          <w:b/>
+          <w:bCs/>
+          <w:color w:val="1A1A1A"/>
+          <w:sz w:val="22"/>
+          <w:szCs w:val="22"/>
+        </w:rPr>
+        <w:t xml:space="preserve">Leer datos de Health Connect</w:t>
+      </w:r>
+      <w:r>
+        <w:rPr>
+          <w:rFonts w:ascii="Calibri" w:cs="Calibri" w:eastAsia="Calibri" w:hAnsi="Calibri"/>
+          <w:b w:val="false"/>
+          <w:bCs w:val="false"/>
+          <w:color w:val="1A1A1A"/>
+          <w:sz w:val="22"/>
+          <w:szCs w:val="22"/>
+        </w:rPr>
+        <w:t xml:space="preserve"> (en el iPhone, </w:t>
+      </w:r>
+      <w:r>
+        <w:rPr>
+          <w:rFonts w:ascii="Calibri" w:cs="Calibri" w:eastAsia="Calibri" w:hAnsi="Calibri"/>
+          <w:b/>
+          <w:bCs/>
+          <w:color w:val="1A1A1A"/>
+          <w:sz w:val="22"/>
+          <w:szCs w:val="22"/>
+        </w:rPr>
+        <w:t xml:space="preserve">Leer datos de Apple Salud</w:t>
+      </w:r>
+      <w:r>
+        <w:rPr>
+          <w:rFonts w:ascii="Calibri" w:cs="Calibri" w:eastAsia="Calibri" w:hAnsi="Calibri"/>
+          <w:b w:val="false"/>
+          <w:bCs w:val="false"/>
+          <w:color w:val="1A1A1A"/>
+          <w:sz w:val="22"/>
+          <w:szCs w:val="22"/>
+        </w:rPr>
+        <w:t xml:space="preserve">) y funciona a través de la plataforma de salud del móvil. TrueLift no habla con el reloj: lee lo que la app de tu reloj o tu báscula hayan dejado allí. En Ajustes → Seguimiento hay además una fila con el nombre de esa plataforma que explica, sin necesidad de PRO ni de permisos, qué datos se leen y para qué se usa cada uno.</w:t>
+      </w:r>
+    </w:p>
+    <w:p>
+      <w:pPr>
+        <w:pStyle w:val="ListParagraph"/>
+        <w:numPr>
+          <w:ilvl w:val="0"/>
+          <w:numId w:val="2"/>
+        </w:numPr>
+        <w:spacing w:after="100" w:line="276"/>
+      </w:pPr>
+      <w:r>
+        <w:rPr>
+          <w:rFonts w:ascii="Calibri" w:cs="Calibri" w:eastAsia="Calibri" w:hAnsi="Calibri"/>
+          <w:b w:val="false"/>
+          <w:bCs w:val="false"/>
+          <w:color w:val="1A1A1A"/>
+          <w:sz w:val="22"/>
+          <w:szCs w:val="22"/>
+        </w:rPr>
+        <w:t xml:space="preserve">Frecuencia cardíaca en reposo, VFC nocturna y sueño: alimentan tu estado diario. La pregunta de sueño del check-in llega ya puntuada a partir de lo que dormiste —y de lo rota que fuera la noche—; tú la corriges si no lo ves así, y la app aprende de tus correcciones. Si la noche no fue del todo buena, el check-in se abre desplegado con esa puntuación ya marcada, para que no la pises sin querer con «Hoy todo bien». De la VFC solo cuenta la media de la noche, no las lecturas sueltas del día.</w:t>
+      </w:r>
+    </w:p>
+    <w:p>
+      <w:pPr>
+        <w:pStyle w:val="ListParagraph"/>
+        <w:numPr>
+          <w:ilvl w:val="0"/>
+          <w:numId w:val="2"/>
+        </w:numPr>
+        <w:spacing w:after="100" w:line="276"/>
+      </w:pPr>
+      <w:r>
+        <w:rPr>
+          <w:rFonts w:ascii="Calibri" w:cs="Calibri" w:eastAsia="Calibri" w:hAnsi="Calibri"/>
           <w:b w:val="0"/>
           <w:bCs w:val="false"/>
           <w:color w:val="1A1A1A"/>
           <w:sz w:val="22"/>
           <w:szCs w:val="22"/>
         </w:rPr>
-        <w:t>Si llevas reloj o pulsera, TrueLift puede aprovechar lo que ya mide en lugar de que lo teclees. Se activa en Ajustes → Autorregulación y VFC → Reloj conectado y funciona a través de la plataforma de salud del móvil: Health Connect en Android y Apple Salud en el iPhone. TrueLift no habla con el reloj: lee lo que la app de tu reloj o tu báscula hayan dejado allí.</w:t>
+        <w:t>Pasos y calorías: afinan la capa de nutrición y alimentan la tarjeta de pasos de la pestaña Progreso (sección 14).</w:t>
       </w:r>
     </w:p>
     <w:p>
@@ -9467,7 +10314,7 @@
           <w:sz w:val="22"/>
           <w:szCs w:val="22"/>
         </w:rPr>
-        <w:t>Frecuencia cardíaca en reposo, VFC nocturna y sueño: alimentan tu estado diario. La pregunta de sueño del check-in llega ya puntuada a partir de lo que dormiste —y de lo rota que fuera la noche—; tú la corriges si no lo ves así, y la app aprende de tus correcciones. De la VFC solo cuenta la media de la noche, no las lecturas sueltas del día.</w:t>
+        <w:t>Peso: si tu báscula vuelca en la plataforma, el pesaje del día entra solo en la capa de nutrición. Nunca pisa un pesaje que ya hayas anotado, y un salto grande respecto a tu tendencia se te pide confirmar antes de darlo por bueno.</w:t>
       </w:r>
     </w:p>
     <w:p>
@@ -9488,17 +10335,12 @@
           <w:sz w:val="22"/>
           <w:szCs w:val="22"/>
         </w:rPr>
-        <w:t>Pasos y calorías: afinan la capa de nutrición y alimentan la tarjeta de pasos de la pestaña Progreso (sección 14).</w:t>
-      </w:r>
-    </w:p>
-    <w:p>
-      <w:pPr>
-        <w:pStyle w:val="ListParagraph"/>
-        <w:numPr>
-          <w:ilvl w:val="0"/>
-          <w:numId w:val="2"/>
-        </w:numPr>
-        <w:spacing w:after="100" w:line="276"/>
+        <w:t>Entrenamientos: las sesiones aeróbicas que registra el reloj —carrera, bici, remo, natación, elíptica, deportes…— entran solas en tu historial como cardio, con su duración real y una intensidad estimada a partir de tu pulso durante la sesión y de tu frecuencia en reposo. Caminar no entra, porque ya lo recogen los pasos, y las sesiones de fuerza tampoco, porque las registras tú. Si ese día ya habías anotado a mano un cardio parecido, no se duplica; y un cardio del reloj que borres del historial no vuelve a entrar.</w:t>
+      </w:r>
+    </w:p>
+    <w:p>
+      <w:pPr>
+        <w:spacing w:after="160" w:line="276"/>
       </w:pPr>
       <w:r>
         <w:rPr>
@@ -9509,17 +10351,12 @@
           <w:sz w:val="22"/>
           <w:szCs w:val="22"/>
         </w:rPr>
-        <w:t>Peso: si tu báscula vuelca en la plataforma, el pesaje del día entra solo en la capa de nutrición. Nunca pisa un pesaje que ya hayas anotado, y un salto grande respecto a tu tendencia se te pide confirmar antes de darlo por bueno.</w:t>
-      </w:r>
-    </w:p>
-    <w:p>
-      <w:pPr>
-        <w:pStyle w:val="ListParagraph"/>
-        <w:numPr>
-          <w:ilvl w:val="0"/>
-          <w:numId w:val="2"/>
-        </w:numPr>
-        <w:spacing w:after="100" w:line="276"/>
+        <w:t>Solo lectura y solo en este móvil: TrueLift no escribe nada en la plataforma de salud y ningún dato sale del dispositivo. Se lee al abrir la app y al volver a ella, nunca en segundo plano, y cada vez se repasan los últimos días, así que un dato que llegue con retraso acaba entrando solo. Lo que no concedas simplemente no se lee —si no tienes báscula, puedes dejar el peso fuera y recibir el resto— y un valor que hayas tecleado a mano nunca se pisa.</w:t>
+      </w:r>
+    </w:p>
+    <w:p>
+      <w:pPr>
+        <w:spacing w:after="160" w:line="276"/>
       </w:pPr>
       <w:r>
         <w:rPr>
@@ -9530,7 +10367,7 @@
           <w:sz w:val="22"/>
           <w:szCs w:val="22"/>
         </w:rPr>
-        <w:t>Entrenamientos: las sesiones aeróbicas que registra el reloj —carrera, bici, remo, natación, elíptica, deportes…— entran solas en tu historial como cardio, con su duración real y una intensidad estimada a partir de tu pulso durante la sesión y de tu frecuencia en reposo. Caminar no entra, porque ya lo recogen los pasos, y las sesiones de fuerza tampoco, porque las registras tú. Si ese día ya habías anotado a mano un cardio parecido, no se duplica; y un cardio del reloj que borres del historial no vuelve a entrar.</w:t>
+        <w:t>Si cambias de reloj o de app, la VFC empieza banda nueva. Cada marca mide la variabilidad a su manera, y mezclar dos escalas haría que noches normales parecieran malas: a partir del relevo la app vuelve a aprender tu banda con las noches del reloj nuevo, y la gráfica de VFC no cruza esa frontera. Tu historial no se toca.</w:t>
       </w:r>
     </w:p>
     <w:p>
@@ -9546,39 +10383,23 @@
           <w:sz w:val="22"/>
           <w:szCs w:val="22"/>
         </w:rPr>
-        <w:t>Solo lectura y solo en este móvil: TrueLift no escribe nada en la plataforma de salud y ningún dato sale del dispositivo. Se lee al abrir la app y al volver a ella, nunca en segundo plano, y cada vez se repasan los últimos días, así que un dato que llegue con retraso acaba entrando solo. Lo que no concedas simplemente no se lee —si no tienes báscula, puedes dejar el peso fuera y recibir el resto— y un valor que hayas tecleado a mano nunca se pisa.</w:t>
-      </w:r>
-    </w:p>
-    <w:p>
-      <w:pPr>
-        <w:spacing w:after="160" w:line="276"/>
-      </w:pPr>
-      <w:r>
-        <w:rPr>
-          <w:rFonts w:ascii="Calibri" w:cs="Calibri" w:eastAsia="Calibri" w:hAnsi="Calibri"/>
-          <w:b w:val="0"/>
-          <w:bCs w:val="false"/>
-          <w:color w:val="1A1A1A"/>
-          <w:sz w:val="22"/>
-          <w:szCs w:val="22"/>
-        </w:rPr>
-        <w:t>Si cambias de reloj o de app, la VFC empieza banda nueva. Cada marca mide la variabilidad a su manera, y mezclar dos escalas haría que noches normales parecieran malas: a partir del relevo la app vuelve a aprender tu banda con las noches del reloj nuevo, y la gráfica de VFC no cruza esa frontera. Tu historial no se toca.</w:t>
-      </w:r>
-    </w:p>
-    <w:p>
-      <w:pPr>
-        <w:spacing w:after="160" w:line="276"/>
-      </w:pPr>
-      <w:r>
-        <w:rPr>
-          <w:rFonts w:ascii="Calibri" w:cs="Calibri" w:eastAsia="Calibri" w:hAnsi="Calibri"/>
-          <w:b w:val="0"/>
-          <w:bCs w:val="false"/>
-          <w:color w:val="1A1A1A"/>
-          <w:sz w:val="22"/>
-          <w:szCs w:val="22"/>
-        </w:rPr>
         <w:t>El reloj conectado está en estado BETA, y así se indica en Ajustes. Sin reloj, todo lo que lee se sigue anotando a mano como siempre.</w:t>
+      </w:r>
+    </w:p>
+    <w:p>
+      <w:pPr>
+        <w:spacing w:after="160" w:line="276"/>
+      </w:pPr>
+      <w:r>
+        <w:rPr>
+          <w:rFonts w:ascii="Calibri" w:cs="Calibri" w:eastAsia="Calibri" w:hAnsi="Calibri"/>
+          <w:b w:val="false"/>
+          <w:bCs w:val="false"/>
+          <w:color w:val="1A1A1A"/>
+          <w:sz w:val="22"/>
+          <w:szCs w:val="22"/>
+        </w:rPr>
+        <w:t xml:space="preserve">En algunos móviles Android —ciertos Xiaomi, por ejemplo— el sistema puede impedir que TrueLift se conecte con Health Connect. Si pasa, la app sigue funcionando: la tarjeta de Ajustes avisa en ámbar de que Health Connect no responde y te indica que permitas el inicio automático de Health Connect y de TrueLift en los ajustes del teléfono. Mientras tanto, los datos se siguen anotando a mano.</w:t>
       </w:r>
     </w:p>
     <w:p>
@@ -10694,13 +11515,56 @@
       <w:r>
         <w:rPr>
           <w:rFonts w:ascii="Calibri" w:cs="Calibri" w:eastAsia="Calibri" w:hAnsi="Calibri"/>
-          <w:b w:val="0"/>
-          <w:bCs w:val="false"/>
-          <w:color w:val="1A1A1A"/>
-          <w:sz w:val="22"/>
-          <w:szCs w:val="22"/>
-        </w:rPr>
-        <w:t>Pasos por día (con el reloj conectado): una barra por día frente a tu objetivo, en verde, ámbar o rojo según cómo quedó la jornada, con el día de hoy atenuado porque aún está a medias. Un día sin dato queda hueco: un reloj sin llevar no es un día sin pasos. Debajo se dice de dónde sale el objetivo.</w:t>
+          <w:b/>
+          <w:bCs/>
+          <w:color w:val="1A1A1A"/>
+          <w:sz w:val="22"/>
+          <w:szCs w:val="22"/>
+        </w:rPr>
+        <w:t xml:space="preserve">Pasos por día</w:t>
+      </w:r>
+      <w:r>
+        <w:rPr>
+          <w:rFonts w:ascii="Calibri" w:cs="Calibri" w:eastAsia="Calibri" w:hAnsi="Calibri"/>
+          <w:b w:val="false"/>
+          <w:bCs w:val="false"/>
+          <w:color w:val="1A1A1A"/>
+          <w:sz w:val="22"/>
+          <w:szCs w:val="22"/>
+        </w:rPr>
+        <w:t xml:space="preserve"> (con el reloj conectado): una barra por día frente a tu objetivo, en verde, ámbar o rojo según cómo quedó la jornada, con el día de hoy atenuado porque aún está a medias. Un día sin dato queda hueco: un reloj sin llevar no es un día sin pasos. Debajo, dos líneas con lo que sirve para decidir: el objetivo de esta semana y tu media de pasos de esta semana —sin contar hoy— frente a la de la semana pasada. De dónde sale el objetivo lo explica el «?».</w:t>
+      </w:r>
+    </w:p>
+    <w:p>
+      <w:pPr>
+        <w:pStyle w:val="ListParagraph"/>
+        <w:numPr>
+          <w:ilvl w:val="0"/>
+          <w:numId w:val="2"/>
+        </w:numPr>
+        <w:spacing w:after="100" w:line="276"/>
+      </w:pPr>
+      <w:r>
+        <w:rPr>
+          <w:rFonts w:ascii="Calibri" w:cs="Calibri" w:eastAsia="Calibri" w:hAnsi="Calibri"/>
+          <w:b/>
+          <w:bCs/>
+          <w:color w:val="1A1A1A"/>
+          <w:sz w:val="22"/>
+          <w:szCs w:val="22"/>
+        </w:rPr>
+        <w:t xml:space="preserve">Cardio por semana</w:t>
+      </w:r>
+      <w:r>
+        <w:rPr>
+          <w:rFonts w:ascii="Calibri" w:cs="Calibri" w:eastAsia="Calibri" w:hAnsi="Calibri"/>
+          <w:b w:val="false"/>
+          <w:bCs w:val="false"/>
+          <w:color w:val="1A1A1A"/>
+          <w:sz w:val="22"/>
+          <w:szCs w:val="22"/>
+        </w:rPr>
+        <w:t xml:space="preserve"> (si has registrado cardio): una barra por semana con los minutos de cardio, la intensidad media encima y un color que dice cuánto pesó en tu disponibilidad para entrenar: verde si fue leve, ámbar si fue moderado y rojo si fue alto. La semana en curso va atenuada. Sin autorregulación, las barras van en un color neutro y la tarjeta no habla de impacto.</w:t>
       </w:r>
     </w:p>
     <w:p>
@@ -11306,6 +12170,38 @@
           <w:sz w:val="22"/>
           <w:szCs w:val="22"/>
         </w:rPr>
+        <w:t xml:space="preserve">Cardio y recuperación</w:t>
+      </w:r>
+      <w:r>
+        <w:rPr>
+          <w:rFonts w:ascii="Calibri" w:cs="Calibri" w:eastAsia="Calibri" w:hAnsi="Calibri"/>
+          <w:b w:val="false"/>
+          <w:bCs w:val="false"/>
+          <w:color w:val="1A1A1A"/>
+          <w:sz w:val="22"/>
+          <w:szCs w:val="22"/>
+        </w:rPr>
+        <w:t xml:space="preserve"> (si hubo cardio en el mes): sesiones, minutos e intensidad media del mes, una fila por semana con lo que pesó en tu recuperación (leve, moderado o alto) y una frase con lo que supone. Si alguna semana pesó mucho, aparece también en las conclusiones.</w:t>
+      </w:r>
+    </w:p>
+    <w:p>
+      <w:pPr>
+        <w:pStyle w:val="ListParagraph"/>
+        <w:numPr>
+          <w:ilvl w:val="0"/>
+          <w:numId w:val="2"/>
+        </w:numPr>
+        <w:spacing w:after="100" w:line="276"/>
+      </w:pPr>
+      <w:r>
+        <w:rPr>
+          <w:rFonts w:ascii="Calibri" w:cs="Calibri" w:eastAsia="Calibri" w:hAnsi="Calibri"/>
+          <w:b/>
+          <w:bCs/>
+          <w:color w:val="1A1A1A"/>
+          <w:sz w:val="22"/>
+          <w:szCs w:val="22"/>
+        </w:rPr>
         <w:t xml:space="preserve">Comparativa</w:t>
       </w:r>
       <w:r>
@@ -11333,7 +12229,7 @@
           <w:sz w:val="22"/>
           <w:szCs w:val="22"/>
         </w:rPr>
-        <w:t xml:space="preserve">Se puede compartir como HTML con el icono de compartir. No incluye el cardio.</w:t>
+        <w:t xml:space="preserve">Se puede compartir como HTML con el icono de compartir. El cardio tiene su propio apartado; las cifras de fuerza (sesiones, carga, récords) no lo cuentan.</w:t>
       </w:r>
     </w:p>
     <w:p>
@@ -11515,6 +12411,44 @@
           <w:sz w:val="22"/>
           <w:szCs w:val="22"/>
         </w:rPr>
+        <w:t xml:space="preserve">El botón </w:t>
+      </w:r>
+      <w:r>
+        <w:rPr>
+          <w:rFonts w:ascii="Calibri" w:cs="Calibri" w:eastAsia="Calibri" w:hAnsi="Calibri"/>
+          <w:b/>
+          <w:bCs/>
+          <w:color w:val="1A1A1A"/>
+          <w:sz w:val="22"/>
+          <w:szCs w:val="22"/>
+        </w:rPr>
+        <w:t xml:space="preserve">Cómo medirte</w:t>
+      </w:r>
+      <w:r>
+        <w:rPr>
+          <w:rFonts w:ascii="Calibri" w:cs="Calibri" w:eastAsia="Calibri" w:hAnsi="Calibri"/>
+          <w:b w:val="false"/>
+          <w:bCs w:val="false"/>
+          <w:color w:val="1A1A1A"/>
+          <w:sz w:val="22"/>
+          <w:szCs w:val="22"/>
+        </w:rPr>
+        <w:t xml:space="preserve"> abre una guía ilustrada con el punto exacto de cada medida y cómo colocar la cinta; también se llega desde el formulario de medidas y desde cada punto. La guía de la cintura se adapta al sexo de tu perfil, porque es la referencia que usa el estimador de % de grasa.</w:t>
+      </w:r>
+    </w:p>
+    <w:p>
+      <w:pPr>
+        <w:spacing w:after="160" w:line="276"/>
+      </w:pPr>
+      <w:r>
+        <w:rPr>
+          <w:rFonts w:ascii="Calibri" w:cs="Calibri" w:eastAsia="Calibri" w:hAnsi="Calibri"/>
+          <w:b w:val="false"/>
+          <w:bCs w:val="false"/>
+          <w:color w:val="1A1A1A"/>
+          <w:sz w:val="22"/>
+          <w:szCs w:val="22"/>
+        </w:rPr>
         <w:t xml:space="preserve">Cuello, cintura y cadera son las mismas que usa el estimador de % de grasa por contornos de la capa de nutrición: llegan rellenas con lo que ya tengas medido, y lo que midas allí se guarda aquí. No puede haber dos cinturas distintas.</w:t>
       </w:r>
     </w:p>
@@ -11610,29 +12544,62 @@
       <w:r>
         <w:rPr>
           <w:rFonts w:ascii="Calibri" w:cs="Calibri" w:eastAsia="Calibri" w:hAnsi="Calibri"/>
-          <w:b w:val="false"/>
-          <w:bCs w:val="false"/>
-          <w:color w:val="1A1A1A"/>
-          <w:sz w:val="22"/>
-          <w:szCs w:val="22"/>
-        </w:rPr>
-        <w:t xml:space="preserve">Comparar (PRO): dos fotos de la misma pose lado a lado —por defecto, la primera y la última—, con los días transcurridos y la diferencia de peso entre ambas. Se puede compartir como imagen.</w:t>
-      </w:r>
-    </w:p>
-    <w:p>
-      <w:pPr>
-        <w:spacing w:after="160" w:line="276"/>
-      </w:pPr>
-      <w:r>
-        <w:rPr>
-          <w:rFonts w:ascii="Calibri" w:cs="Calibri" w:eastAsia="Calibri" w:hAnsi="Calibri"/>
-          <w:b w:val="false"/>
-          <w:bCs w:val="false"/>
-          <w:color w:val="1A1A1A"/>
-          <w:sz w:val="22"/>
-          <w:szCs w:val="22"/>
-        </w:rPr>
-        <w:t xml:space="preserve">Misma pose, misma luz, misma hora del día. Una foto cada cuatro semanas dice mucho más que una cada semana.</w:t>
+          <w:b/>
+          <w:bCs/>
+          <w:color w:val="1A1A1A"/>
+          <w:sz w:val="22"/>
+          <w:szCs w:val="22"/>
+        </w:rPr>
+        <w:t xml:space="preserve">Comparar</w:t>
+      </w:r>
+      <w:r>
+        <w:rPr>
+          <w:rFonts w:ascii="Calibri" w:cs="Calibri" w:eastAsia="Calibri" w:hAnsi="Calibri"/>
+          <w:b w:val="false"/>
+          <w:bCs w:val="false"/>
+          <w:color w:val="1A1A1A"/>
+          <w:sz w:val="22"/>
+          <w:szCs w:val="22"/>
+        </w:rPr>
+        <w:t xml:space="preserve"> (PRO): dos fotos de la misma pose —por defecto, la primera y la última— lado a lado, con cortina (la nueva tapa a la vieja hasta donde arrastres) o superpuestas, con los días transcurridos y la diferencia de peso entre ambas. Se puede compartir como imagen (sección 18).</w:t>
+      </w:r>
+    </w:p>
+    <w:p>
+      <w:pPr>
+        <w:spacing w:after="160" w:line="276"/>
+      </w:pPr>
+      <w:r>
+        <w:rPr>
+          <w:rFonts w:ascii="Calibri" w:cs="Calibri" w:eastAsia="Calibri" w:hAnsi="Calibri"/>
+          <w:b w:val="false"/>
+          <w:bCs w:val="false"/>
+          <w:color w:val="1A1A1A"/>
+          <w:sz w:val="22"/>
+          <w:szCs w:val="22"/>
+        </w:rPr>
+        <w:t xml:space="preserve">Misma pose, misma luz, misma hora del día. Una foto cada cuatro semanas dice mucho más que una cada semana. El botón </w:t>
+      </w:r>
+      <w:r>
+        <w:rPr>
+          <w:rFonts w:ascii="Calibri" w:cs="Calibri" w:eastAsia="Calibri" w:hAnsi="Calibri"/>
+          <w:b/>
+          <w:bCs/>
+          <w:color w:val="1A1A1A"/>
+          <w:sz w:val="22"/>
+          <w:szCs w:val="22"/>
+        </w:rPr>
+        <w:t xml:space="preserve">Cómo hacer las fotos</w:t>
+      </w:r>
+      <w:r>
+        <w:rPr>
+          <w:rFonts w:ascii="Calibri" w:cs="Calibri" w:eastAsia="Calibri" w:hAnsi="Calibri"/>
+          <w:b w:val="false"/>
+          <w:bCs w:val="false"/>
+          <w:color w:val="1A1A1A"/>
+          <w:sz w:val="22"/>
+          <w:szCs w:val="22"/>
+        </w:rPr>
+        <w:t xml:space="preserve"> abre una guía ilustrada con el momento, el lugar, la cámara, la luz, la ropa y la postura para que tus fotos sean comparables entre sí.</w:t>
       </w:r>
     </w:p>
     <w:p>
@@ -11740,7 +12707,7 @@
           <w:sz w:val="22"/>
           <w:szCs w:val="22"/>
         </w:rPr>
-        <w:t xml:space="preserve">La capa de nutrición trabaja junto a tu entrenamiento. Tú te pesas cada día; una vez por semana la app te dice si conviene ajustar tu alimentación o tu actividad para que tu peso avance al ritmo planificado. No registras comidas, no cuentas calorías y no hay base de datos de alimentos.</w:t>
+        <w:t xml:space="preserve">La capa de nutrición trabaja junto a tu entrenamiento. Tú te pesas cada día; una vez por semana la app te dice si conviene ajustar tu alimentación o tu actividad para que tu peso avance al ritmo planificado. No registras comidas ni hay base de datos de alimentos. Si además quieres una referencia para pesar y medir lo que comes, la tarjeta Energía diaria te da una cifra de calorías para tu fase, su reparto en macros y comidas, y una forma de convertirlo en un menú semanal con tu IA de confianza.</w:t>
       </w:r>
     </w:p>
     <w:p>
@@ -11841,7 +12808,7 @@
           <w:sz w:val="22"/>
           <w:szCs w:val="22"/>
         </w:rPr>
-        <w:t xml:space="preserve">No registra lo que comes, no puntúa alimentos, no reparte macros ni comprueba si tu dieta es completa. No es una dieta ni un plan nutricional.</w:t>
+        <w:t xml:space="preserve">No registra lo que comes, no puntúa alimentos ni comprueba si tu dieta es completa. El reparto en comidas y el menú con IA son guías orientativas: no son una dieta ni un plan nutricional, ni sustituyen a un profesional.</w:t>
       </w:r>
     </w:p>
     <w:p>
@@ -12057,7 +13024,7 @@
           <w:sz w:val="22"/>
           <w:szCs w:val="22"/>
         </w:rPr>
-        <w:t xml:space="preserve"> altura y años de experiencia entrenando fuerza. El sexo se toma del declarado en Ajustes.</w:t>
+        <w:t xml:space="preserve"> altura, años de experiencia entrenando fuerza y, si quieres, cómo es tu trabajo (sentado, de pie o físico), que afina lo que gastas en tu día a día; sin indicarlo, se supone un trabajo sentado. El sexo se toma del declarado en Ajustes.</w:t>
       </w:r>
     </w:p>
     <w:p>
@@ -12514,7 +13481,61 @@
           <w:sz w:val="22"/>
           <w:szCs w:val="22"/>
         </w:rPr>
-        <w:t xml:space="preserve">, y peso, % graso y masa magra estimados de inicio a fin del bloque. Con el lazo calibrado, una segunda fila con el ritmo real, el balance energético estimado y el margen que el lazo aún puede ajustar, con su incertidumbre (±). Ninguno es tu ingesta.</w:t>
+        <w:t xml:space="preserve">, y una tabla con peso, % graso y masa magra: una fila por dato y las columnas Inicio, Objetivo y Cambio del bloque. Con el lazo calibrado, una segunda fila con el ritmo real, el balance energético estimado y el margen que el lazo aún puede ajustar, con su incertidumbre (±). Ninguno es tu ingesta.</w:t>
+      </w:r>
+    </w:p>
+    <w:p>
+      <w:pPr>
+        <w:pStyle w:val="ListParagraph"/>
+        <w:numPr>
+          <w:ilvl w:val="0"/>
+          <w:numId w:val="2"/>
+        </w:numPr>
+        <w:spacing w:after="100" w:line="276"/>
+      </w:pPr>
+      <w:r>
+        <w:rPr>
+          <w:rFonts w:ascii="Calibri" w:cs="Calibri" w:eastAsia="Calibri" w:hAnsi="Calibri"/>
+          <w:b/>
+          <w:bCs/>
+          <w:color w:val="1A1A1A"/>
+          <w:sz w:val="22"/>
+          <w:szCs w:val="22"/>
+        </w:rPr>
+        <w:t xml:space="preserve">Energía diaria:</w:t>
+      </w:r>
+      <w:r>
+        <w:rPr>
+          <w:rFonts w:ascii="Calibri" w:cs="Calibri" w:eastAsia="Calibri" w:hAnsi="Calibri"/>
+          <w:b w:val="false"/>
+          <w:bCs w:val="false"/>
+          <w:color w:val="1A1A1A"/>
+          <w:sz w:val="22"/>
+          <w:szCs w:val="22"/>
+        </w:rPr>
+        <w:t xml:space="preserve"> cuánto gastas al día y cuánto comer en tu fase, con el botón </w:t>
+      </w:r>
+      <w:r>
+        <w:rPr>
+          <w:rFonts w:ascii="Calibri" w:cs="Calibri" w:eastAsia="Calibri" w:hAnsi="Calibri"/>
+          <w:b/>
+          <w:bCs/>
+          <w:color w:val="1A1A1A"/>
+          <w:sz w:val="22"/>
+          <w:szCs w:val="22"/>
+        </w:rPr>
+        <w:t xml:space="preserve">Crea tu menú</w:t>
+      </w:r>
+      <w:r>
+        <w:rPr>
+          <w:rFonts w:ascii="Calibri" w:cs="Calibri" w:eastAsia="Calibri" w:hAnsi="Calibri"/>
+          <w:b w:val="false"/>
+          <w:bCs w:val="false"/>
+          <w:color w:val="1A1A1A"/>
+          <w:sz w:val="22"/>
+          <w:szCs w:val="22"/>
+        </w:rPr>
+        <w:t xml:space="preserve"> (ver más abajo).</w:t>
       </w:r>
     </w:p>
     <w:p>
@@ -12655,7 +13676,7 @@
           <w:sz w:val="22"/>
           <w:szCs w:val="22"/>
         </w:rPr>
-        <w:t xml:space="preserve">.</w:t>
+        <w:t xml:space="preserve">. Cuando hay una tarjeta semanal con recomendación a la vista, Tus alimentos se abre desde la propia tarjeta.</w:t>
       </w:r>
     </w:p>
     <w:p>
@@ -12915,13 +13936,57 @@
       <w:r>
         <w:rPr>
           <w:rFonts w:ascii="Calibri" w:cs="Calibri" w:eastAsia="Calibri" w:hAnsi="Calibri"/>
-          <w:b w:val="0"/>
-          <w:bCs w:val="false"/>
-          <w:color w:val="1A1A1A"/>
-          <w:sz w:val="22"/>
-          <w:szCs w:val="22"/>
-        </w:rPr>
-        <w:t>La vía de solo actividad tiene techo: se ofrece mientras la jornada que saldría —lo que ya caminas más lo que se pediría— siga siendo razonable. Si no cabe, la tarjeta ofrece la dieta o la mezcla de las dos. Sin reloj conectado la app supone una jornada normal, para no pedirte pasos de más.</w:t>
+          <w:b w:val="false"/>
+          <w:bCs w:val="false"/>
+          <w:color w:val="1A1A1A"/>
+          <w:sz w:val="22"/>
+          <w:szCs w:val="22"/>
+        </w:rPr>
+        <w:t xml:space="preserve">La vía de solo actividad tiene techo: se ofrece mientras la jornada que saldría —lo que ya caminas más lo que se pediría— no pase de tu </w:t>
+      </w:r>
+      <w:r>
+        <w:rPr>
+          <w:rFonts w:ascii="Calibri" w:cs="Calibri" w:eastAsia="Calibri" w:hAnsi="Calibri"/>
+          <w:b/>
+          <w:bCs/>
+          <w:color w:val="1A1A1A"/>
+          <w:sz w:val="22"/>
+          <w:szCs w:val="22"/>
+        </w:rPr>
+        <w:t xml:space="preserve">límite de pasos al día</w:t>
+      </w:r>
+      <w:r>
+        <w:rPr>
+          <w:rFonts w:ascii="Calibri" w:cs="Calibri" w:eastAsia="Calibri" w:hAnsi="Calibri"/>
+          <w:b w:val="false"/>
+          <w:bCs w:val="false"/>
+          <w:color w:val="1A1A1A"/>
+          <w:sz w:val="22"/>
+          <w:szCs w:val="22"/>
+        </w:rPr>
+        <w:t xml:space="preserve">, que eliges tú en Tus datos y cuenta desde la siguiente tarjeta. Si no cabe, la tarjeta ofrece la dieta o la mezcla de las dos, y el enlace </w:t>
+      </w:r>
+      <w:r>
+        <w:rPr>
+          <w:rFonts w:ascii="Calibri" w:cs="Calibri" w:eastAsia="Calibri" w:hAnsi="Calibri"/>
+          <w:b/>
+          <w:bCs/>
+          <w:color w:val="1A1A1A"/>
+          <w:sz w:val="22"/>
+          <w:szCs w:val="22"/>
+        </w:rPr>
+        <w:t xml:space="preserve">Cambiar límite de pasos</w:t>
+      </w:r>
+      <w:r>
+        <w:rPr>
+          <w:rFonts w:ascii="Calibri" w:cs="Calibri" w:eastAsia="Calibri" w:hAnsi="Calibri"/>
+          <w:b w:val="false"/>
+          <w:bCs w:val="false"/>
+          <w:color w:val="1A1A1A"/>
+          <w:sz w:val="22"/>
+          <w:szCs w:val="22"/>
+        </w:rPr>
+        <w:t xml:space="preserve"> te lleva a ajustarlo. Sin reloj conectado la app supone una jornada normal, para no pedirte pasos de más.</w:t>
       </w:r>
     </w:p>
     <w:p>
@@ -13131,7 +14196,29 @@
           <w:sz w:val="22"/>
           <w:szCs w:val="22"/>
         </w:rPr>
-        <w:t xml:space="preserve">. Aplicar no se puntúa ni cambia el ajuste: solo indica que la decisión está tomada. Elige una sola opción, mantenla cada día hasta la próxima tarjeta y recuerda que la cifra es un ajuste respecto a tu ingesta media de la semana anterior con el mismo entrenamiento y actividad, no una ingesta objetivo. Si no hay señal limpia (pocos pesajes o ventana de agua), la evaluación se pospone y la tarjeta lo dice.</w:t>
+        <w:t xml:space="preserve">. Aplicar no se puntúa ni cambia el ajuste: solo indica que la decisión está tomada. Elige una sola opción, mantenla cada día hasta la próxima tarjeta y recuerda que la cifra es un ajuste respecto a tu ingesta media de la semana anterior con el mismo entrenamiento y actividad, no una ingesta objetivo. Si no hay señal limpia (pocos pesajes o ventana de agua), la evaluación se pospone y la tarjeta lo dice. Al pie de la tarjeta, el botón </w:t>
+      </w:r>
+      <w:r>
+        <w:rPr>
+          <w:rFonts w:ascii="Calibri" w:cs="Calibri" w:eastAsia="Calibri" w:hAnsi="Calibri"/>
+          <w:b/>
+          <w:bCs/>
+          <w:color w:val="1A1A1A"/>
+          <w:sz w:val="22"/>
+          <w:szCs w:val="22"/>
+        </w:rPr>
+        <w:t xml:space="preserve">Tus alimentos</w:t>
+      </w:r>
+      <w:r>
+        <w:rPr>
+          <w:rFonts w:ascii="Calibri" w:cs="Calibri" w:eastAsia="Calibri" w:hAnsi="Calibri"/>
+          <w:b w:val="false"/>
+          <w:bCs w:val="false"/>
+          <w:color w:val="1A1A1A"/>
+          <w:sz w:val="22"/>
+          <w:szCs w:val="22"/>
+        </w:rPr>
+        <w:t xml:space="preserve"> abre tu biblioteca, que es con la que se expresan los gramos del ajuste.</w:t>
       </w:r>
     </w:p>
     <w:p>
@@ -13148,6 +14235,585 @@
           <w:sz w:val="25"/>
           <w:szCs w:val="25"/>
         </w:rPr>
+        <w:t xml:space="preserve">Energía diaria</w:t>
+      </w:r>
+    </w:p>
+    <w:p>
+      <w:pPr>
+        <w:spacing w:after="160" w:line="276"/>
+      </w:pPr>
+      <w:r>
+        <w:rPr>
+          <w:rFonts w:ascii="Calibri" w:cs="Calibri" w:eastAsia="Calibri" w:hAnsi="Calibri"/>
+          <w:b w:val="false"/>
+          <w:bCs w:val="false"/>
+          <w:color w:val="1A1A1A"/>
+          <w:sz w:val="22"/>
+          <w:szCs w:val="22"/>
+        </w:rPr>
+        <w:t xml:space="preserve">Tarjeta bajo el estado de la fase con dos cifras: el </w:t>
+      </w:r>
+      <w:r>
+        <w:rPr>
+          <w:rFonts w:ascii="Calibri" w:cs="Calibri" w:eastAsia="Calibri" w:hAnsi="Calibri"/>
+          <w:b/>
+          <w:bCs/>
+          <w:color w:val="1A1A1A"/>
+          <w:sz w:val="22"/>
+          <w:szCs w:val="22"/>
+        </w:rPr>
+        <w:t xml:space="preserve">gasto teórico</w:t>
+      </w:r>
+      <w:r>
+        <w:rPr>
+          <w:rFonts w:ascii="Calibri" w:cs="Calibri" w:eastAsia="Calibri" w:hAnsi="Calibri"/>
+          <w:b w:val="false"/>
+          <w:bCs w:val="false"/>
+          <w:color w:val="1A1A1A"/>
+          <w:sz w:val="22"/>
+          <w:szCs w:val="22"/>
+        </w:rPr>
+        <w:t xml:space="preserve">, lo que gastas al día, y la ingesta </w:t>
+      </w:r>
+      <w:r>
+        <w:rPr>
+          <w:rFonts w:ascii="Calibri" w:cs="Calibri" w:eastAsia="Calibri" w:hAnsi="Calibri"/>
+          <w:b/>
+          <w:bCs/>
+          <w:color w:val="1A1A1A"/>
+          <w:sz w:val="22"/>
+          <w:szCs w:val="22"/>
+        </w:rPr>
+        <w:t xml:space="preserve">ajustada a tu fase</w:t>
+      </w:r>
+      <w:r>
+        <w:rPr>
+          <w:rFonts w:ascii="Calibri" w:cs="Calibri" w:eastAsia="Calibri" w:hAnsi="Calibri"/>
+          <w:b w:val="false"/>
+          <w:bCs w:val="false"/>
+          <w:color w:val="1A1A1A"/>
+          <w:sz w:val="22"/>
+          <w:szCs w:val="22"/>
+        </w:rPr>
+        <w:t xml:space="preserve">: lo que comer para perder o ganar al ritmo previsto, o para mantener tu peso en normocalórica. Con la fase calibrada aparece además el gasto </w:t>
+      </w:r>
+      <w:r>
+        <w:rPr>
+          <w:rFonts w:ascii="Calibri" w:cs="Calibri" w:eastAsia="Calibri" w:hAnsi="Calibri"/>
+          <w:b/>
+          <w:bCs/>
+          <w:color w:val="1A1A1A"/>
+          <w:sz w:val="22"/>
+          <w:szCs w:val="22"/>
+        </w:rPr>
+        <w:t xml:space="preserve">según cómo evoluciona tu peso</w:t>
+      </w:r>
+      <w:r>
+        <w:rPr>
+          <w:rFonts w:ascii="Calibri" w:cs="Calibri" w:eastAsia="Calibri" w:hAnsi="Calibri"/>
+          <w:b w:val="false"/>
+          <w:bCs w:val="false"/>
+          <w:color w:val="1A1A1A"/>
+          <w:sz w:val="22"/>
+          <w:szCs w:val="22"/>
+        </w:rPr>
+        <w:t xml:space="preserve">: si comes lo que marca tu fase, es lo que tu báscula dice que gastas.</w:t>
+      </w:r>
+    </w:p>
+    <w:p>
+      <w:pPr>
+        <w:spacing w:after="160" w:line="276"/>
+      </w:pPr>
+      <w:r>
+        <w:rPr>
+          <w:rFonts w:ascii="Calibri" w:cs="Calibri" w:eastAsia="Calibri" w:hAnsi="Calibri"/>
+          <w:b w:val="false"/>
+          <w:bCs w:val="false"/>
+          <w:color w:val="1A1A1A"/>
+          <w:sz w:val="22"/>
+          <w:szCs w:val="22"/>
+        </w:rPr>
+        <w:t xml:space="preserve">El desplegable </w:t>
+      </w:r>
+      <w:r>
+        <w:rPr>
+          <w:rFonts w:ascii="Calibri" w:cs="Calibri" w:eastAsia="Calibri" w:hAnsi="Calibri"/>
+          <w:b/>
+          <w:bCs/>
+          <w:color w:val="1A1A1A"/>
+          <w:sz w:val="22"/>
+          <w:szCs w:val="22"/>
+        </w:rPr>
+        <w:t xml:space="preserve">De dónde sale</w:t>
+      </w:r>
+      <w:r>
+        <w:rPr>
+          <w:rFonts w:ascii="Calibri" w:cs="Calibri" w:eastAsia="Calibri" w:hAnsi="Calibri"/>
+          <w:b w:val="false"/>
+          <w:bCs w:val="false"/>
+          <w:color w:val="1A1A1A"/>
+          <w:sz w:val="22"/>
+          <w:szCs w:val="22"/>
+        </w:rPr>
+        <w:t xml:space="preserve"> suma lo que gasta tu cuerpo en reposo, tu día a día según tu trabajo, tus pasos, tus entrenos de fuerza y de cardio, y la digestión. Los entrenos se reparten por igual entre todos los días, así que comes lo mismo entrenes o no. Ahí mismo puedes contestar </w:t>
+      </w:r>
+      <w:r>
+        <w:rPr>
+          <w:rFonts w:ascii="Calibri" w:cs="Calibri" w:eastAsia="Calibri" w:hAnsi="Calibri"/>
+          <w:b/>
+          <w:bCs/>
+          <w:color w:val="1A1A1A"/>
+          <w:sz w:val="22"/>
+          <w:szCs w:val="22"/>
+        </w:rPr>
+        <w:t xml:space="preserve">¿Cómo es tu trabajo?</w:t>
+      </w:r>
+      <w:r>
+        <w:rPr>
+          <w:rFonts w:ascii="Calibri" w:cs="Calibri" w:eastAsia="Calibri" w:hAnsi="Calibri"/>
+          <w:b w:val="false"/>
+          <w:bCs w:val="false"/>
+          <w:color w:val="1A1A1A"/>
+          <w:sz w:val="22"/>
+          <w:szCs w:val="22"/>
+        </w:rPr>
+        <w:t xml:space="preserve"> (sentado, de pie o físico), que también está en el asistente y en Tus datos. Con el reloj conectado los pasos son los tuyos; sin él, la app supone una jornada normal.</w:t>
+      </w:r>
+    </w:p>
+    <w:p>
+      <w:pPr>
+        <w:spacing w:after="160" w:line="276"/>
+      </w:pPr>
+      <w:r>
+        <w:rPr>
+          <w:rFonts w:ascii="Calibri" w:cs="Calibri" w:eastAsia="Calibri" w:hAnsi="Calibri"/>
+          <w:b w:val="false"/>
+          <w:bCs w:val="false"/>
+          <w:color w:val="1A1A1A"/>
+          <w:sz w:val="22"/>
+          <w:szCs w:val="22"/>
+        </w:rPr>
+        <w:t xml:space="preserve">Es una referencia para quien quiere pesar y medir lo que come. La báscula manda: si tu peso no va como está previsto, la tarjeta semanal lo corrige, y la cifra incluye los ajustes semanales que te has llevado al plato. Nunca te propone comer menos de lo que tu cuerpo gasta en reposo.</w:t>
+      </w:r>
+    </w:p>
+    <w:p>
+      <w:pPr>
+        <w:pStyle w:val="Heading2"/>
+        <w:spacing w:after="140" w:before="240"/>
+      </w:pPr>
+      <w:r>
+        <w:rPr>
+          <w:rFonts w:ascii="Calibri" w:cs="Calibri" w:eastAsia="Calibri" w:hAnsi="Calibri"/>
+          <w:b/>
+          <w:bCs/>
+          <w:color w:val="1A1A1A"/>
+          <w:sz w:val="25"/>
+          <w:szCs w:val="25"/>
+        </w:rPr>
+        <w:t xml:space="preserve">Crea tu menú: el reparto en comidas</w:t>
+      </w:r>
+    </w:p>
+    <w:p>
+      <w:pPr>
+        <w:spacing w:after="160" w:line="276"/>
+      </w:pPr>
+      <w:r>
+        <w:rPr>
+          <w:rFonts w:ascii="Calibri" w:cs="Calibri" w:eastAsia="Calibri" w:hAnsi="Calibri"/>
+          <w:b w:val="false"/>
+          <w:bCs w:val="false"/>
+          <w:color w:val="1A1A1A"/>
+          <w:sz w:val="22"/>
+          <w:szCs w:val="22"/>
+        </w:rPr>
+        <w:t xml:space="preserve">El botón </w:t>
+      </w:r>
+      <w:r>
+        <w:rPr>
+          <w:rFonts w:ascii="Calibri" w:cs="Calibri" w:eastAsia="Calibri" w:hAnsi="Calibri"/>
+          <w:b/>
+          <w:bCs/>
+          <w:color w:val="1A1A1A"/>
+          <w:sz w:val="22"/>
+          <w:szCs w:val="22"/>
+        </w:rPr>
+        <w:t xml:space="preserve">Crea tu menú</w:t>
+      </w:r>
+      <w:r>
+        <w:rPr>
+          <w:rFonts w:ascii="Calibri" w:cs="Calibri" w:eastAsia="Calibri" w:hAnsi="Calibri"/>
+          <w:b w:val="false"/>
+          <w:bCs w:val="false"/>
+          <w:color w:val="1A1A1A"/>
+          <w:sz w:val="22"/>
+          <w:szCs w:val="22"/>
+        </w:rPr>
+        <w:t xml:space="preserve"> de la tarjeta Energía diaria abre </w:t>
+      </w:r>
+      <w:r>
+        <w:rPr>
+          <w:rFonts w:ascii="Calibri" w:cs="Calibri" w:eastAsia="Calibri" w:hAnsi="Calibri"/>
+          <w:b/>
+          <w:bCs/>
+          <w:color w:val="1A1A1A"/>
+          <w:sz w:val="22"/>
+          <w:szCs w:val="22"/>
+        </w:rPr>
+        <w:t xml:space="preserve">Reparto en comidas</w:t>
+      </w:r>
+      <w:r>
+        <w:rPr>
+          <w:rFonts w:ascii="Calibri" w:cs="Calibri" w:eastAsia="Calibri" w:hAnsi="Calibri"/>
+          <w:b w:val="false"/>
+          <w:bCs w:val="false"/>
+          <w:color w:val="1A1A1A"/>
+          <w:sz w:val="22"/>
+          <w:szCs w:val="22"/>
+        </w:rPr>
+        <w:t xml:space="preserve">: las calorías de tu fase repartidas en proteína, hidratos y grasa, y en las comidas que elijas.</w:t>
+      </w:r>
+    </w:p>
+    <w:p>
+      <w:pPr>
+        <w:pStyle w:val="ListParagraph"/>
+        <w:numPr>
+          <w:ilvl w:val="0"/>
+          <w:numId w:val="2"/>
+        </w:numPr>
+        <w:spacing w:after="100" w:line="276"/>
+      </w:pPr>
+      <w:r>
+        <w:rPr>
+          <w:rFonts w:ascii="Calibri" w:cs="Calibri" w:eastAsia="Calibri" w:hAnsi="Calibri"/>
+          <w:b/>
+          <w:bCs/>
+          <w:color w:val="1A1A1A"/>
+          <w:sz w:val="22"/>
+          <w:szCs w:val="22"/>
+        </w:rPr>
+        <w:t xml:space="preserve">Macros del día:</w:t>
+      </w:r>
+      <w:r>
+        <w:rPr>
+          <w:rFonts w:ascii="Calibri" w:cs="Calibri" w:eastAsia="Calibri" w:hAnsi="Calibri"/>
+          <w:b w:val="false"/>
+          <w:bCs w:val="false"/>
+          <w:color w:val="1A1A1A"/>
+          <w:sz w:val="22"/>
+          <w:szCs w:val="22"/>
+        </w:rPr>
+        <w:t xml:space="preserve"> la proteína y la grasa se eligen con dos deslizadores que solo recorren lo recomendado, y los hidratos se ajustan solos para cuadrar con las calorías. Cada macro se ve en gramos y en g/kg de tu peso objetivo. La proteína es la misma del recordatorio de proteína de la tarjeta semanal.</w:t>
+      </w:r>
+    </w:p>
+    <w:p>
+      <w:pPr>
+        <w:pStyle w:val="ListParagraph"/>
+        <w:numPr>
+          <w:ilvl w:val="0"/>
+          <w:numId w:val="2"/>
+        </w:numPr>
+        <w:spacing w:after="100" w:line="276"/>
+      </w:pPr>
+      <w:r>
+        <w:rPr>
+          <w:rFonts w:ascii="Calibri" w:cs="Calibri" w:eastAsia="Calibri" w:hAnsi="Calibri"/>
+          <w:b/>
+          <w:bCs/>
+          <w:color w:val="1A1A1A"/>
+          <w:sz w:val="22"/>
+          <w:szCs w:val="22"/>
+        </w:rPr>
+        <w:t xml:space="preserve">Comidas:</w:t>
+      </w:r>
+      <w:r>
+        <w:rPr>
+          <w:rFonts w:ascii="Calibri" w:cs="Calibri" w:eastAsia="Calibri" w:hAnsi="Calibri"/>
+          <w:b w:val="false"/>
+          <w:bCs w:val="false"/>
+          <w:color w:val="1A1A1A"/>
+          <w:sz w:val="22"/>
+          <w:szCs w:val="22"/>
+        </w:rPr>
+        <w:t xml:space="preserve"> eliges cuántas haces al día, de 3 a 5, y cada una enseña su nombre (desayuno, comida, merienda…), sus kcal y sus gramos de proteína, hidratos y grasa. Con − y + haces una comida más pequeña o más grande y las demás se ajustan solas; </w:t>
+      </w:r>
+      <w:r>
+        <w:rPr>
+          <w:rFonts w:ascii="Calibri" w:cs="Calibri" w:eastAsia="Calibri" w:hAnsi="Calibri"/>
+          <w:b/>
+          <w:bCs/>
+          <w:color w:val="1A1A1A"/>
+          <w:sz w:val="22"/>
+          <w:szCs w:val="22"/>
+        </w:rPr>
+        <w:t xml:space="preserve">Volver al reparto inicial</w:t>
+      </w:r>
+      <w:r>
+        <w:rPr>
+          <w:rFonts w:ascii="Calibri" w:cs="Calibri" w:eastAsia="Calibri" w:hAnsi="Calibri"/>
+          <w:b w:val="false"/>
+          <w:bCs w:val="false"/>
+          <w:color w:val="1A1A1A"/>
+          <w:sz w:val="22"/>
+          <w:szCs w:val="22"/>
+        </w:rPr>
+        <w:t xml:space="preserve"> deshace esos cambios.</w:t>
+      </w:r>
+    </w:p>
+    <w:p>
+      <w:pPr>
+        <w:pStyle w:val="ListParagraph"/>
+        <w:numPr>
+          <w:ilvl w:val="0"/>
+          <w:numId w:val="2"/>
+        </w:numPr>
+        <w:spacing w:after="100" w:line="276"/>
+      </w:pPr>
+      <w:r>
+        <w:rPr>
+          <w:rFonts w:ascii="Calibri" w:cs="Calibri" w:eastAsia="Calibri" w:hAnsi="Calibri"/>
+          <w:b/>
+          <w:bCs/>
+          <w:color w:val="1A1A1A"/>
+          <w:sz w:val="22"/>
+          <w:szCs w:val="22"/>
+        </w:rPr>
+        <w:t xml:space="preserve">Antes y después de entrenar:</w:t>
+      </w:r>
+      <w:r>
+        <w:rPr>
+          <w:rFonts w:ascii="Calibri" w:cs="Calibri" w:eastAsia="Calibri" w:hAnsi="Calibri"/>
+          <w:b w:val="false"/>
+          <w:bCs w:val="false"/>
+          <w:color w:val="1A1A1A"/>
+          <w:sz w:val="22"/>
+          <w:szCs w:val="22"/>
+        </w:rPr>
+        <w:t xml:space="preserve"> marca la comida de antes y la de después del entreno. Llevan más hidratos y algo menos de grasa que las demás, para rendir y recuperar mejor. Si una comida marcada es demasiado ligera para ello, la pantalla te sugiere agrandarla con +.</w:t>
+      </w:r>
+    </w:p>
+    <w:p>
+      <w:pPr>
+        <w:pStyle w:val="ListParagraph"/>
+        <w:numPr>
+          <w:ilvl w:val="0"/>
+          <w:numId w:val="2"/>
+        </w:numPr>
+        <w:spacing w:after="100" w:line="276"/>
+      </w:pPr>
+      <w:r>
+        <w:rPr>
+          <w:rFonts w:ascii="Calibri" w:cs="Calibri" w:eastAsia="Calibri" w:hAnsi="Calibri"/>
+          <w:b/>
+          <w:bCs/>
+          <w:color w:val="1A1A1A"/>
+          <w:sz w:val="22"/>
+          <w:szCs w:val="22"/>
+        </w:rPr>
+        <w:t xml:space="preserve">Corregir las kcal del día:</w:t>
+      </w:r>
+      <w:r>
+        <w:rPr>
+          <w:rFonts w:ascii="Calibri" w:cs="Calibri" w:eastAsia="Calibri" w:hAnsi="Calibri"/>
+          <w:b w:val="false"/>
+          <w:bCs w:val="false"/>
+          <w:color w:val="1A1A1A"/>
+          <w:sz w:val="22"/>
+          <w:szCs w:val="22"/>
+        </w:rPr>
+        <w:t xml:space="preserve"> el lápiz junto a las kcal te deja escribir otra cifra si prefieres comer algo distinto de lo recomendado. Los macros y las comidas se recalculan, la pantalla indica que las kcal están corregidas junto a lo recomendado para tu fase, y tu corrección se mantiene cuando la tarjeta semanal ajusta lo que comes. </w:t>
+      </w:r>
+      <w:r>
+        <w:rPr>
+          <w:rFonts w:ascii="Calibri" w:cs="Calibri" w:eastAsia="Calibri" w:hAnsi="Calibri"/>
+          <w:b/>
+          <w:bCs/>
+          <w:color w:val="1A1A1A"/>
+          <w:sz w:val="22"/>
+          <w:szCs w:val="22"/>
+        </w:rPr>
+        <w:t xml:space="preserve">Volver a lo recomendado</w:t>
+      </w:r>
+      <w:r>
+        <w:rPr>
+          <w:rFonts w:ascii="Calibri" w:cs="Calibri" w:eastAsia="Calibri" w:hAnsi="Calibri"/>
+          <w:b w:val="false"/>
+          <w:bCs w:val="false"/>
+          <w:color w:val="1A1A1A"/>
+          <w:sz w:val="22"/>
+          <w:szCs w:val="22"/>
+        </w:rPr>
+        <w:t xml:space="preserve"> la quita. La corrección no cambia tu fase ni lo que evalúa la tarjeta semanal.</w:t>
+      </w:r>
+    </w:p>
+    <w:p>
+      <w:pPr>
+        <w:spacing w:after="160" w:line="276"/>
+      </w:pPr>
+      <w:r>
+        <w:rPr>
+          <w:rFonts w:ascii="Calibri" w:cs="Calibri" w:eastAsia="Calibri" w:hAnsi="Calibri"/>
+          <w:b w:val="false"/>
+          <w:bCs w:val="false"/>
+          <w:color w:val="1A1A1A"/>
+          <w:sz w:val="22"/>
+          <w:szCs w:val="22"/>
+        </w:rPr>
+        <w:t xml:space="preserve">Son las mismas cantidades todos los días, entrenes o no, y el reparto se actualiza solo cuando la tarjeta semanal ajusta lo que comes. Es una guía para quien pesa lo que come: no se registran comidas y la báscula sigue mandando.</w:t>
+      </w:r>
+    </w:p>
+    <w:p>
+      <w:pPr>
+        <w:pStyle w:val="Heading2"/>
+        <w:spacing w:after="140" w:before="240"/>
+      </w:pPr>
+      <w:r>
+        <w:rPr>
+          <w:rFonts w:ascii="Calibri" w:cs="Calibri" w:eastAsia="Calibri" w:hAnsi="Calibri"/>
+          <w:b/>
+          <w:bCs/>
+          <w:color w:val="1A1A1A"/>
+          <w:sz w:val="25"/>
+          <w:szCs w:val="25"/>
+        </w:rPr>
+        <w:t xml:space="preserve">Crea tu menú semanal con IA</w:t>
+      </w:r>
+    </w:p>
+    <w:p>
+      <w:pPr>
+        <w:spacing w:after="160" w:line="276"/>
+      </w:pPr>
+      <w:r>
+        <w:rPr>
+          <w:rFonts w:ascii="Calibri" w:cs="Calibri" w:eastAsia="Calibri" w:hAnsi="Calibri"/>
+          <w:b w:val="false"/>
+          <w:bCs w:val="false"/>
+          <w:color w:val="1A1A1A"/>
+          <w:sz w:val="22"/>
+          <w:szCs w:val="22"/>
+        </w:rPr>
+        <w:t xml:space="preserve">Desde el reparto en comidas, el botón </w:t>
+      </w:r>
+      <w:r>
+        <w:rPr>
+          <w:rFonts w:ascii="Calibri" w:cs="Calibri" w:eastAsia="Calibri" w:hAnsi="Calibri"/>
+          <w:b/>
+          <w:bCs/>
+          <w:color w:val="1A1A1A"/>
+          <w:sz w:val="22"/>
+          <w:szCs w:val="22"/>
+        </w:rPr>
+        <w:t xml:space="preserve">Crea tu menú semanal con IA</w:t>
+      </w:r>
+      <w:r>
+        <w:rPr>
+          <w:rFonts w:ascii="Calibri" w:cs="Calibri" w:eastAsia="Calibri" w:hAnsi="Calibri"/>
+          <w:b w:val="false"/>
+          <w:bCs w:val="false"/>
+          <w:color w:val="1A1A1A"/>
+          <w:sz w:val="22"/>
+          <w:szCs w:val="22"/>
+        </w:rPr>
+        <w:t xml:space="preserve"> convierte tu reparto en un prompt para la IA que prefieras (ChatGPT, Claude, Gemini…), igual que Crear con IA hace con la rutina. TrueLift no llama a ninguna IA: prepara el texto en tu móvil y tú decides si lo copias o lo compartes.</w:t>
+      </w:r>
+    </w:p>
+    <w:p>
+      <w:pPr>
+        <w:pStyle w:val="ListParagraph"/>
+        <w:numPr>
+          <w:ilvl w:val="0"/>
+          <w:numId w:val="2"/>
+        </w:numPr>
+        <w:spacing w:after="100" w:line="276"/>
+      </w:pPr>
+      <w:r>
+        <w:rPr>
+          <w:rFonts w:ascii="Calibri" w:cs="Calibri" w:eastAsia="Calibri" w:hAnsi="Calibri"/>
+          <w:b w:val="false"/>
+          <w:bCs w:val="false"/>
+          <w:color w:val="1A1A1A"/>
+          <w:sz w:val="22"/>
+          <w:szCs w:val="22"/>
+        </w:rPr>
+        <w:t xml:space="preserve">Un asistente de cuatro pasos: tu alimentación y las condiciones de uso (alergias, intolerancias y alimentos que no puedes tomar, tipo de alimentación —vegetariana, vegana…— y país); tus preferencias y tu cocina (alimentos que quieres evitar y priorizar, presupuesto, supermercado, tiempo y nivel de cocina, utensilios de casa y del trabajo); la organización de la semana (fecha de inicio, horarios, comidas fuera de casa, días de entrenamiento, comensales, cocinar por adelantado…); y una revisión final.</w:t>
+      </w:r>
+    </w:p>
+    <w:p>
+      <w:pPr>
+        <w:pStyle w:val="ListParagraph"/>
+        <w:numPr>
+          <w:ilvl w:val="0"/>
+          <w:numId w:val="2"/>
+        </w:numPr>
+        <w:spacing w:after="100" w:line="276"/>
+      </w:pPr>
+      <w:r>
+        <w:rPr>
+          <w:rFonts w:ascii="Calibri" w:cs="Calibri" w:eastAsia="Calibri" w:hAnsi="Calibri"/>
+          <w:b w:val="false"/>
+          <w:bCs w:val="false"/>
+          <w:color w:val="1A1A1A"/>
+          <w:sz w:val="22"/>
+          <w:szCs w:val="22"/>
+        </w:rPr>
+        <w:t xml:space="preserve">Antes de copiarlo ves el prompt íntegro. Lleva tu fase, tu objetivo y tu ritmo, el reparto vigente (kcal, macros y comidas, con las de antes y después de entrenar) y un resumen de tus entrenamientos recientes. Tu peso, tu altura, tu edad y tu sexo se muestran para que confirmes si quieres incluirlos. Nunca salen tu fecha de nacimiento, tu nombre, tus fotos, tus medidas ni tu VFC.</w:t>
+      </w:r>
+    </w:p>
+    <w:p>
+      <w:pPr>
+        <w:pStyle w:val="ListParagraph"/>
+        <w:numPr>
+          <w:ilvl w:val="0"/>
+          <w:numId w:val="2"/>
+        </w:numPr>
+        <w:spacing w:after="100" w:line="276"/>
+      </w:pPr>
+      <w:r>
+        <w:rPr>
+          <w:rFonts w:ascii="Calibri" w:cs="Calibri" w:eastAsia="Calibri" w:hAnsi="Calibri"/>
+          <w:b w:val="false"/>
+          <w:bCs w:val="false"/>
+          <w:color w:val="1A1A1A"/>
+          <w:sz w:val="22"/>
+          <w:szCs w:val="22"/>
+        </w:rPr>
+        <w:t xml:space="preserve">La IA te devolverá un menú de siete días con cantidades, recetas, lista de la compra y sustituciones. Es orientativo: TrueLift no verifica sus recetas ni sus cálculos, así que revísalo, sobre todo si tienes alergias o intolerancias.</w:t>
+      </w:r>
+    </w:p>
+    <w:p>
+      <w:pPr>
+        <w:pStyle w:val="ListParagraph"/>
+        <w:numPr>
+          <w:ilvl w:val="0"/>
+          <w:numId w:val="2"/>
+        </w:numPr>
+        <w:spacing w:after="100" w:line="276"/>
+      </w:pPr>
+      <w:r>
+        <w:rPr>
+          <w:rFonts w:ascii="Calibri" w:cs="Calibri" w:eastAsia="Calibri" w:hAnsi="Calibri"/>
+          <w:b w:val="false"/>
+          <w:bCs w:val="false"/>
+          <w:color w:val="1A1A1A"/>
+          <w:sz w:val="22"/>
+          <w:szCs w:val="22"/>
+        </w:rPr>
+        <w:t xml:space="preserve">Tus respuestas se guardan en TrueLift y en tu copia de seguridad para la próxima vez, y no se envían a la analítica. Es para personas adultas y sanas y no genera dietas terapéuticas; si la fase está en pausa o hay un refeed en esas fechas, la app te lo dice antes.</w:t>
+      </w:r>
+    </w:p>
+    <w:p>
+      <w:pPr>
+        <w:pStyle w:val="Heading2"/>
+        <w:spacing w:after="140" w:before="240"/>
+      </w:pPr>
+      <w:r>
+        <w:rPr>
+          <w:rFonts w:ascii="Calibri" w:cs="Calibri" w:eastAsia="Calibri" w:hAnsi="Calibri"/>
+          <w:b/>
+          <w:bCs/>
+          <w:color w:val="1A1A1A"/>
+          <w:sz w:val="25"/>
+          <w:szCs w:val="25"/>
+        </w:rPr>
         <w:t xml:space="preserve">Tus datos</w:t>
       </w:r>
     </w:p>
@@ -13311,6 +14977,70 @@
           <w:szCs w:val="22"/>
         </w:rPr>
         <w:t xml:space="preserve"> la declarada en el asistente.</w:t>
+      </w:r>
+    </w:p>
+    <w:p>
+      <w:pPr>
+        <w:pStyle w:val="ListParagraph"/>
+        <w:numPr>
+          <w:ilvl w:val="0"/>
+          <w:numId w:val="2"/>
+        </w:numPr>
+        <w:spacing w:after="100" w:line="276"/>
+      </w:pPr>
+      <w:r>
+        <w:rPr>
+          <w:rFonts w:ascii="Calibri" w:cs="Calibri" w:eastAsia="Calibri" w:hAnsi="Calibri"/>
+          <w:b/>
+          <w:bCs/>
+          <w:color w:val="1A1A1A"/>
+          <w:sz w:val="22"/>
+          <w:szCs w:val="22"/>
+        </w:rPr>
+        <w:t xml:space="preserve">Tu trabajo:</w:t>
+      </w:r>
+      <w:r>
+        <w:rPr>
+          <w:rFonts w:ascii="Calibri" w:cs="Calibri" w:eastAsia="Calibri" w:hAnsi="Calibri"/>
+          <w:b w:val="false"/>
+          <w:bCs w:val="false"/>
+          <w:color w:val="1A1A1A"/>
+          <w:sz w:val="22"/>
+          <w:szCs w:val="22"/>
+        </w:rPr>
+        <w:t xml:space="preserve"> sentado, de pie o físico. Afina lo que gastas en tu día a día, fuera de los pasos y los entrenos (tarjeta Energía diaria).</w:t>
+      </w:r>
+    </w:p>
+    <w:p>
+      <w:pPr>
+        <w:pStyle w:val="ListParagraph"/>
+        <w:numPr>
+          <w:ilvl w:val="0"/>
+          <w:numId w:val="2"/>
+        </w:numPr>
+        <w:spacing w:after="100" w:line="276"/>
+      </w:pPr>
+      <w:r>
+        <w:rPr>
+          <w:rFonts w:ascii="Calibri" w:cs="Calibri" w:eastAsia="Calibri" w:hAnsi="Calibri"/>
+          <w:b/>
+          <w:bCs/>
+          <w:color w:val="1A1A1A"/>
+          <w:sz w:val="22"/>
+          <w:szCs w:val="22"/>
+        </w:rPr>
+        <w:t xml:space="preserve">Límite de pasos al día:</w:t>
+      </w:r>
+      <w:r>
+        <w:rPr>
+          <w:rFonts w:ascii="Calibri" w:cs="Calibri" w:eastAsia="Calibri" w:hAnsi="Calibri"/>
+          <w:b w:val="false"/>
+          <w:bCs w:val="false"/>
+          <w:color w:val="1A1A1A"/>
+          <w:sz w:val="22"/>
+          <w:szCs w:val="22"/>
+        </w:rPr>
+        <w:t xml:space="preserve"> el total diario que la tarjeta semanal nunca te pedirá superar caminando. Cuenta desde la próxima tarjeta.</w:t>
       </w:r>
     </w:p>
     <w:p>
@@ -14089,7 +15819,7 @@
           <w:sz w:val="22"/>
           <w:szCs w:val="22"/>
         </w:rPr>
-        <w:t xml:space="preserve">Icono de mancuerna, arriba a la derecha de cualquier pestaña. Tres bloques:</w:t>
+        <w:t xml:space="preserve">Se abre desde Rutina → Detalles → Material disponible, con su acceso directo; ya no está en la barra superior. Tres bloques:</w:t>
       </w:r>
     </w:p>
     <w:p>
@@ -14234,7 +15964,7 @@
           <w:sz w:val="22"/>
           <w:szCs w:val="22"/>
         </w:rPr>
-        <w:t xml:space="preserve">Descrito en la sección 4 (Durante la sesión): cuenta atrás con alarma, notificación, cronómetro flotante en Android, actividad en directo en iPhone y aviso en el smartwatch.</w:t>
+        <w:t xml:space="preserve">Descrito en la sección 4 (Durante la sesión): cuenta atrás con alarma y pitidos de los minutos, notificación con la serie que toca, cronómetro flotante en Android, actividad en directo en iPhone y aviso en el smartwatch.</w:t>
       </w:r>
     </w:p>
     <w:p>
@@ -14283,7 +16013,61 @@
           <w:sz w:val="22"/>
           <w:szCs w:val="22"/>
         </w:rPr>
-        <w:t xml:space="preserve"> desde el historial, una imagen con la fecha, el tonelaje, las repeticiones totales y el detalle de los ejercicios, con la marca TrueLift.</w:t>
+        <w:t xml:space="preserve"> desde el historial, una imagen con la fecha, el tonelaje, las repeticiones totales y el detalle de los ejercicios, con la marca TrueLift. Con </w:t>
+      </w:r>
+      <w:r>
+        <w:rPr>
+          <w:rFonts w:ascii="Calibri" w:cs="Calibri" w:eastAsia="Calibri" w:hAnsi="Calibri"/>
+          <w:b/>
+          <w:bCs/>
+          <w:color w:val="1A1A1A"/>
+          <w:sz w:val="22"/>
+          <w:szCs w:val="22"/>
+        </w:rPr>
+        <w:t xml:space="preserve">Foto de fondo</w:t>
+      </w:r>
+      <w:r>
+        <w:rPr>
+          <w:rFonts w:ascii="Calibri" w:cs="Calibri" w:eastAsia="Calibri" w:hAnsi="Calibri"/>
+          <w:b w:val="false"/>
+          <w:bCs w:val="false"/>
+          <w:color w:val="1A1A1A"/>
+          <w:sz w:val="22"/>
+          <w:szCs w:val="22"/>
+        </w:rPr>
+        <w:t xml:space="preserve"> pones detrás una foto tuya de la galería —del gimnasio, de la sesión o la que quieras— en lugar del fondo de la app; lleva un velo oscuro para que los datos se lean bien encima. Antes de compartir puedes cambiarla o quitarla, y solo se usa para esa imagen: no se guarda en tu historial.</w:t>
+      </w:r>
+    </w:p>
+    <w:p>
+      <w:pPr>
+        <w:pStyle w:val="ListParagraph"/>
+        <w:numPr>
+          <w:ilvl w:val="0"/>
+          <w:numId w:val="2"/>
+        </w:numPr>
+        <w:spacing w:after="100" w:line="276"/>
+      </w:pPr>
+      <w:r>
+        <w:rPr>
+          <w:rFonts w:ascii="Calibri" w:cs="Calibri" w:eastAsia="Calibri" w:hAnsi="Calibri"/>
+          <w:b/>
+          <w:bCs/>
+          <w:color w:val="1A1A1A"/>
+          <w:sz w:val="22"/>
+          <w:szCs w:val="22"/>
+        </w:rPr>
+        <w:t xml:space="preserve">Evolución corporal</w:t>
+      </w:r>
+      <w:r>
+        <w:rPr>
+          <w:rFonts w:ascii="Calibri" w:cs="Calibri" w:eastAsia="Calibri" w:hAnsi="Calibri"/>
+          <w:b w:val="false"/>
+          <w:bCs w:val="false"/>
+          <w:color w:val="1A1A1A"/>
+          <w:sz w:val="22"/>
+          <w:szCs w:val="22"/>
+        </w:rPr>
+        <w:t xml:space="preserve"> (PRO): desde el comparador de fotos, una imagen con tus dos fotos —lado a lado, con cortina o superpuestas, tal como las estés viendo— y los números que las explican: días transcurridos, peso y contornos.</w:t>
       </w:r>
     </w:p>
     <w:p>
@@ -14803,6 +16587,27 @@
           <w:sz w:val="22"/>
           <w:szCs w:val="22"/>
         </w:rPr>
+        <w:t xml:space="preserve">El rest-pause, como el drop set, en aislamiento o máquinas y con moderación: sirve para sacar mucho trabajo en poco tiempo, no para hacerlo en cada ejercicio.</w:t>
+      </w:r>
+    </w:p>
+    <w:p>
+      <w:pPr>
+        <w:pStyle w:val="ListParagraph"/>
+        <w:numPr>
+          <w:ilvl w:val="0"/>
+          <w:numId w:val="2"/>
+        </w:numPr>
+        <w:spacing w:after="100" w:line="276"/>
+      </w:pPr>
+      <w:r>
+        <w:rPr>
+          <w:rFonts w:ascii="Calibri" w:cs="Calibri" w:eastAsia="Calibri" w:hAnsi="Calibri"/>
+          <w:b w:val="false"/>
+          <w:bCs w:val="false"/>
+          <w:color w:val="1A1A1A"/>
+          <w:sz w:val="22"/>
+          <w:szCs w:val="22"/>
+        </w:rPr>
         <w:t xml:space="preserve">Marca el ejercicio como realizado con molestias en cuanto algo te duela. Entrenar suave sin romper la progresión es mejor que saltarse el ejercicio o forzarlo.</w:t>
       </w:r>
     </w:p>
@@ -14867,6 +16672,27 @@
           <w:szCs w:val="22"/>
         </w:rPr>
         <w:t>Cuando dudes de la ejecución de un ejercicio, abre su vídeo de técnica antes de la primera serie, no después.</w:t>
+      </w:r>
+    </w:p>
+    <w:p>
+      <w:pPr>
+        <w:pStyle w:val="ListParagraph"/>
+        <w:numPr>
+          <w:ilvl w:val="0"/>
+          <w:numId w:val="2"/>
+        </w:numPr>
+        <w:spacing w:after="100" w:line="276"/>
+      </w:pPr>
+      <w:r>
+        <w:rPr>
+          <w:rFonts w:ascii="Calibri" w:cs="Calibri" w:eastAsia="Calibri" w:hAnsi="Calibri"/>
+          <w:b w:val="false"/>
+          <w:bCs w:val="false"/>
+          <w:color w:val="1A1A1A"/>
+          <w:sz w:val="22"/>
+          <w:szCs w:val="22"/>
+        </w:rPr>
+        <w:t xml:space="preserve">Si quieres pesar lo que comes, empieza por el reparto en comidas y deja que la báscula y la tarjeta semanal corrijan. El menú con IA es un punto de partida, no una prescripción.</w:t>
       </w:r>
     </w:p>
     <w:p>
@@ -14937,7 +16763,7 @@
           <w:sz w:val="22"/>
           <w:szCs w:val="22"/>
         </w:rPr>
-        <w:t xml:space="preserve"> Tú eliges: suscripción mensual, un año o pago único de por vida. Todo por Google Play, restaurable en cualquier móvil con tu cuenta.</w:t>
+        <w:t xml:space="preserve"> Tú eliges: suscripción mensual, un año o pago único de por vida. Todo a través de Google Play o de la App Store, restaurable en cualquier móvil con tu cuenta.</w:t>
       </w:r>
     </w:p>
     <w:p>
@@ -15526,7 +17352,7 @@
           <w:sz w:val="22"/>
           <w:szCs w:val="22"/>
         </w:rPr>
-        <w:t xml:space="preserve"> Comprueba que estás en Android, que la cuenta atrás está activa y que concediste el permiso Mostrar sobre otras aplicaciones. Dentro de TrueLift la cápsula se oculta a propósito.</w:t>
+        <w:t xml:space="preserve"> Comprueba que estás en Android, que la cuenta atrás está activa y que concediste el permiso Mostrar sobre otras aplicaciones. Dentro de TrueLift la cápsula se oculta a propósito. El «?» del ajuste explica qué permisos hacen falta y qué revisar si no se ve con el móvil bloqueado.</w:t>
       </w:r>
     </w:p>
     <w:p>
@@ -15596,18 +17422,18 @@
           <w:sz w:val="22"/>
           <w:szCs w:val="22"/>
         </w:rPr>
-        <w:t xml:space="preserve">¿Por qué no puedo meter en una superserie un ejercicio con drop set o con top + back-offs?</w:t>
-      </w:r>
-      <w:r>
-        <w:rPr>
-          <w:rFonts w:ascii="Calibri" w:cs="Calibri" w:eastAsia="Calibri" w:hAnsi="Calibri"/>
-          <w:b w:val="false"/>
-          <w:bCs w:val="false"/>
-          <w:color w:val="1A1A1A"/>
-          <w:sz w:val="22"/>
-          <w:szCs w:val="22"/>
-        </w:rPr>
-        <w:t xml:space="preserve"> Porque una superserie se entrena a series rectas: alternas series con otro ejercicio, y eso no se puede hacer encadenando bajadas de peso sin descanso. Quita esa modalidad y el interruptor se activa; la nota de debajo dice qué ejercicio la lleva.</w:t>
+        <w:t xml:space="preserve">¿Por qué no puedo meter en una superserie un ejercicio con drop set, rest-pause o top + back-offs?</w:t>
+      </w:r>
+      <w:r>
+        <w:rPr>
+          <w:rFonts w:ascii="Calibri" w:cs="Calibri" w:eastAsia="Calibri" w:hAnsi="Calibri"/>
+          <w:b w:val="false"/>
+          <w:bCs w:val="false"/>
+          <w:color w:val="1A1A1A"/>
+          <w:sz w:val="22"/>
+          <w:szCs w:val="22"/>
+        </w:rPr>
+        <w:t xml:space="preserve"> Porque una superserie se entrena a series rectas: alternas series con otro ejercicio, y eso no se puede hacer encadenando bajadas de peso o pausas cortas sin descanso. Quita esa modalidad y el interruptor se activa; la nota de debajo dice qué ejercicio la lleva.</w:t>
       </w:r>
     </w:p>
     <w:p>
@@ -15688,7 +17514,7 @@
           <w:sz w:val="22"/>
           <w:szCs w:val="22"/>
         </w:rPr>
-        <w:t xml:space="preserve"> En la propia serie: el botón de discos del panel abre el desglose de esa carga y sus series de aproximación. La calculadora completa sigue arriba, en el icono de mancuerna.</w:t>
+        <w:t xml:space="preserve"> En la propia serie: el botón de discos del panel abre el desglose de esa carga y sus series de aproximación. La calculadora completa está en Rutina → Detalles → Material disponible.</w:t>
       </w:r>
     </w:p>
     <w:p>
@@ -15752,13 +17578,40 @@
       <w:r>
         <w:rPr>
           <w:rFonts w:ascii="Calibri" w:cs="Calibri" w:eastAsia="Calibri" w:hAnsi="Calibri"/>
+          <w:b/>
+          <w:bCs/>
+          <w:color w:val="1A1A1A"/>
+          <w:sz w:val="22"/>
+          <w:szCs w:val="22"/>
+        </w:rPr>
+        <w:t xml:space="preserve">¿TrueLift puede leer mi reloj?</w:t>
+      </w:r>
+      <w:r>
+        <w:rPr>
+          <w:rFonts w:ascii="Calibri" w:cs="Calibri" w:eastAsia="Calibri" w:hAnsi="Calibri"/>
+          <w:b w:val="false"/>
+          <w:bCs w:val="false"/>
+          <w:color w:val="1A1A1A"/>
+          <w:sz w:val="22"/>
+          <w:szCs w:val="22"/>
+        </w:rPr>
+        <w:t xml:space="preserve"> Sí, con PRO: en Ajustes → Autorregulación y VFC → Leer datos de Health Connect (en el iPhone, de Apple Salud). Lee tu FC en reposo, tu VFC nocturna, tu sueño, tus pasos, tus calorías, tu peso y tus entrenamientos de cardio. Solo lee, nada sale del móvil y está en estado BETA. La fila Health Connect / Apple Salud de Ajustes explica qué se lee y para qué.</w:t>
+      </w:r>
+    </w:p>
+    <w:p>
+      <w:pPr>
+        <w:spacing w:after="160" w:line="276"/>
+      </w:pPr>
+      <w:r>
+        <w:rPr>
+          <w:rFonts w:ascii="Calibri" w:cs="Calibri" w:eastAsia="Calibri" w:hAnsi="Calibri"/>
           <w:b w:val="0"/>
           <w:bCs w:val="false"/>
           <w:color w:val="1A1A1A"/>
           <w:sz w:val="22"/>
           <w:szCs w:val="22"/>
         </w:rPr>
-        <w:t>¿TrueLift puede leer mi reloj? Sí, con PRO: en Ajustes → Autorregulación y VFC → Reloj conectado. Lee de Health Connect (Android) o de Apple Salud (iPhone) tu FC en reposo, tu VFC nocturna, tu sueño, tus pasos, tus calorías, tu peso y tus entrenamientos de cardio. Solo lee, nada sale del móvil y está en estado BETA.</w:t>
+        <w:t>He abierto la app y lo de hoy no ha entrado. TrueLift lee la plataforma de salud, no el reloj: si la app de tu reloj todavía no ha volcado el día allí, no hay nada que leer. Cada vez que abres la app se repasan los últimos días, así que un dato que llegue con retraso acaba entrando solo.</w:t>
       </w:r>
     </w:p>
     <w:p>
@@ -15774,7 +17627,7 @@
           <w:sz w:val="22"/>
           <w:szCs w:val="22"/>
         </w:rPr>
-        <w:t>He abierto la app y lo de hoy no ha entrado. TrueLift lee la plataforma de salud, no el reloj: si la app de tu reloj todavía no ha volcado el día allí, no hay nada que leer. Cada vez que abres la app se repasan los últimos días, así que un dato que llegue con retraso acaba entrando solo.</w:t>
+        <w:t>Mi reloj no mide VFC, o no quiero darle ese permiso. No pasa nada: la VFC se sigue anotando a mano en el check-in y el resto de datos entra igual. Lo que no concedas simplemente no se lee.</w:t>
       </w:r>
     </w:p>
     <w:p>
@@ -15790,7 +17643,7 @@
           <w:sz w:val="22"/>
           <w:szCs w:val="22"/>
         </w:rPr>
-        <w:t>Mi reloj no mide VFC, o no quiero darle ese permiso. No pasa nada: la VFC se sigue anotando a mano en el check-in y el resto de datos entra igual. Lo que no concedas simplemente no se lee.</w:t>
+        <w:t>He cambiado de reloj y mi VFC parece otra. Lo es: cada marca la mide a su manera. La app lo detecta y empieza banda nueva con las noches del reloj nuevo; tu historial se conserva y la gráfica no cruza esa frontera.</w:t>
       </w:r>
     </w:p>
     <w:p>
@@ -15806,7 +17659,7 @@
           <w:sz w:val="22"/>
           <w:szCs w:val="22"/>
         </w:rPr>
-        <w:t>He cambiado de reloj y mi VFC parece otra. Lo es: cada marca la mide a su manera. La app lo detecta y empieza banda nueva con las noches del reloj nuevo; tu historial se conserva y la gráfica no cruza esa frontera.</w:t>
+        <w:t>Mis carreras aparecen solas en el historial. Es el reloj conectado: los entrenamientos aeróbicos entran como cardio con su duración real y una intensidad estimada por tu pulso. Si no los quieres, borra esa sesión —no vuelve a entrar— o apaga el reloj conectado.</w:t>
       </w:r>
     </w:p>
     <w:p>
@@ -15822,7 +17675,7 @@
           <w:sz w:val="22"/>
           <w:szCs w:val="22"/>
         </w:rPr>
-        <w:t>Mis carreras aparecen solas en el historial. Es el reloj conectado: los entrenamientos aeróbicos entran como cardio con su duración real y una intensidad estimada por tu pulso. Si no los quieres, borra esa sesión —no vuelve a entrar— o apaga el reloj conectado.</w:t>
+        <w:t>¿Dónde está la pestaña Volumen? Ya no es una pestaña: el volumen y la frecuencia se abren con los dos botones de la pestaña Rutina, bajo el desplegable Detalles. Los números son los mismos.</w:t>
       </w:r>
     </w:p>
     <w:p>
@@ -15838,7 +17691,7 @@
           <w:sz w:val="22"/>
           <w:szCs w:val="22"/>
         </w:rPr>
-        <w:t>¿Dónde está la pestaña Volumen? Ya no es una pestaña: el volumen y la frecuencia se abren con los dos botones de la pestaña Rutina, bajo el desplegable Detalles. Los números son los mismos.</w:t>
+        <w:t>¿Dónde configuro mis discos y mis microcargas? En la pestaña Rutina, en el desplegable Detalles → Material disponible. La semana de descarga está al lado, en las Herramientas de rutina. Antes las dos vivían en Ajustes.</w:t>
       </w:r>
     </w:p>
     <w:p>
@@ -15854,7 +17707,7 @@
           <w:sz w:val="22"/>
           <w:szCs w:val="22"/>
         </w:rPr>
-        <w:t>¿Dónde configuro mis discos y mis microcargas? En la pestaña Rutina, en el desplegable Detalles → Material disponible. La semana de descarga está al lado, en las Herramientas de rutina. Antes las dos vivían en Ajustes.</w:t>
+        <w:t>He importado una rutina y mis pesos siguen igual, ¿es normal? Sí. Si la rutina importada mantiene el reparto, el sistema de progresión y el número de sesiones, se conservan los pesos que la app ya te proponía. Solo empiezan de nuevo cuando cambia alguna de esas tres cosas, y el diálogo te lo dice antes de importar.</w:t>
       </w:r>
     </w:p>
     <w:p>
@@ -15870,7 +17723,7 @@
           <w:sz w:val="22"/>
           <w:szCs w:val="22"/>
         </w:rPr>
-        <w:t>He importado una rutina y mis pesos siguen igual, ¿es normal? Sí. Si la rutina importada mantiene el reparto, el sistema de progresión y el número de sesiones, se conservan los pesos que la app ya te proponía. Solo empiezan de nuevo cuando cambia alguna de esas tres cosas, y el diálogo te lo dice antes de importar.</w:t>
+        <w:t>Vengo de Hevy o de Strong, ¿puedo traerme mi historial? Sí, y es gratis: Rutina → Herramientas de rutina → Importar de Hevy o Importar de Strong, con el archivo que exporta cada app. Ver sección 19.</w:t>
       </w:r>
     </w:p>
     <w:p>
@@ -15886,7 +17739,7 @@
           <w:sz w:val="22"/>
           <w:szCs w:val="22"/>
         </w:rPr>
-        <w:t>Vengo de Hevy o de Strong, ¿puedo traerme mi historial? Sí, y es gratis: Rutina → Herramientas de rutina → Importar de Hevy o Importar de Strong, con el archivo que exporta cada app. Ver sección 19.</w:t>
+        <w:t>¿Cómo sé si estoy haciendo bien un ejercicio? Los ejercicios de la biblioteca que tienen vídeo llevan un botón TÉCNICA, en la rutina y durante la sesión. Se abre dentro de la app y vuelves a la serie donde estabas.</w:t>
       </w:r>
     </w:p>
     <w:p>
@@ -15902,7 +17755,7 @@
           <w:sz w:val="22"/>
           <w:szCs w:val="22"/>
         </w:rPr>
-        <w:t>¿Cómo sé si estoy haciendo bien un ejercicio? Los ejercicios de la biblioteca que tienen vídeo llevan un botón TÉCNICA, en la rutina y durante la sesión. Se abre dentro de la app y vuelves a la serie donde estabas.</w:t>
+        <w:t>En los fondos asistidos la app me proponía subir peso. Registra ese ejercicio como Fondos asistidos en máquina, no como Fondos en máquina: el primero es la máquina de contrapeso —tecleas la ayuda y progresar es quitarla— y el segundo la de placas, en la que te sientas y empujas.</w:t>
       </w:r>
     </w:p>
     <w:p>
@@ -15918,23 +17771,539 @@
           <w:sz w:val="22"/>
           <w:szCs w:val="22"/>
         </w:rPr>
-        <w:t>En los fondos asistidos la app me proponía subir peso. Registra ese ejercicio como Fondos asistidos en máquina, no como Fondos en máquina: el primero es la máquina de contrapeso —tecleas la ayuda y progresar es quitarla— y el segundo la de placas, en la que te sientas y empujas.</w:t>
-      </w:r>
-    </w:p>
-    <w:p>
-      <w:pPr>
-        <w:spacing w:after="160" w:line="276"/>
-      </w:pPr>
-      <w:r>
-        <w:rPr>
-          <w:rFonts w:ascii="Calibri" w:cs="Calibri" w:eastAsia="Calibri" w:hAnsi="Calibri"/>
-          <w:b w:val="0"/>
-          <w:bCs w:val="false"/>
-          <w:color w:val="1A1A1A"/>
-          <w:sz w:val="22"/>
-          <w:szCs w:val="22"/>
-        </w:rPr>
         <w:t>¿Por qué no puedo volver a Cardio con una sesión empezada? A propósito: mientras entrenas, el selector Fuerza/Cardio se esconde y el deslizamiento lateral se bloquea para que no acabes en Cardio sin querer y sin saber cómo volver. Guarda o descarta la sesión y el selector vuelve.</w:t>
+      </w:r>
+    </w:p>
+    <w:p>
+      <w:pPr>
+        <w:spacing w:after="160" w:line="276"/>
+      </w:pPr>
+      <w:r>
+        <w:rPr>
+          <w:rFonts w:ascii="Calibri" w:cs="Calibri" w:eastAsia="Calibri" w:hAnsi="Calibri"/>
+          <w:b/>
+          <w:bCs/>
+          <w:color w:val="1A1A1A"/>
+          <w:sz w:val="22"/>
+          <w:szCs w:val="22"/>
+        </w:rPr>
+        <w:t xml:space="preserve">¿Puedo saber cuánto me queda de descanso sin mirar el móvil?</w:t>
+      </w:r>
+      <w:r>
+        <w:rPr>
+          <w:rFonts w:ascii="Calibri" w:cs="Calibri" w:eastAsia="Calibri" w:hAnsi="Calibri"/>
+          <w:b w:val="false"/>
+          <w:bCs w:val="false"/>
+          <w:color w:val="1A1A1A"/>
+          <w:sz w:val="22"/>
+          <w:szCs w:val="22"/>
+        </w:rPr>
+        <w:t xml:space="preserve"> Sí: activa los </w:t>
+      </w:r>
+      <w:r>
+        <w:rPr>
+          <w:rFonts w:ascii="Calibri" w:cs="Calibri" w:eastAsia="Calibri" w:hAnsi="Calibri"/>
+          <w:b/>
+          <w:bCs/>
+          <w:color w:val="1A1A1A"/>
+          <w:sz w:val="22"/>
+          <w:szCs w:val="22"/>
+        </w:rPr>
+        <w:t xml:space="preserve">pitidos de los minutos</w:t>
+      </w:r>
+      <w:r>
+        <w:rPr>
+          <w:rFonts w:ascii="Calibri" w:cs="Calibri" w:eastAsia="Calibri" w:hAnsi="Calibri"/>
+          <w:b w:val="false"/>
+          <w:bCs w:val="false"/>
+          <w:color w:val="1A1A1A"/>
+          <w:sz w:val="22"/>
+          <w:szCs w:val="22"/>
+        </w:rPr>
+        <w:t xml:space="preserve"> en Ajustes → Durante la sesión. Cada minuto entero suena un pitido por cada minuto que queda, y el final lo marca la alarma. Con el móvil bloqueado, la notificación —o la actividad en directo en el iPhone— te dice además el ejercicio y la serie que tocan.</w:t>
+      </w:r>
+    </w:p>
+    <w:p>
+      <w:pPr>
+        <w:spacing w:after="160" w:line="276"/>
+      </w:pPr>
+      <w:r>
+        <w:rPr>
+          <w:rFonts w:ascii="Calibri" w:cs="Calibri" w:eastAsia="Calibri" w:hAnsi="Calibri"/>
+          <w:b/>
+          <w:bCs/>
+          <w:color w:val="1A1A1A"/>
+          <w:sz w:val="22"/>
+          <w:szCs w:val="22"/>
+        </w:rPr>
+        <w:t xml:space="preserve">¿Puedo compartir mi entreno con una foto mía?</w:t>
+      </w:r>
+      <w:r>
+        <w:rPr>
+          <w:rFonts w:ascii="Calibri" w:cs="Calibri" w:eastAsia="Calibri" w:hAnsi="Calibri"/>
+          <w:b w:val="false"/>
+          <w:bCs w:val="false"/>
+          <w:color w:val="1A1A1A"/>
+          <w:sz w:val="22"/>
+          <w:szCs w:val="22"/>
+        </w:rPr>
+        <w:t xml:space="preserve"> Sí. En el historial, toca Compartir en la sesión y elige </w:t>
+      </w:r>
+      <w:r>
+        <w:rPr>
+          <w:rFonts w:ascii="Calibri" w:cs="Calibri" w:eastAsia="Calibri" w:hAnsi="Calibri"/>
+          <w:b/>
+          <w:bCs/>
+          <w:color w:val="1A1A1A"/>
+          <w:sz w:val="22"/>
+          <w:szCs w:val="22"/>
+        </w:rPr>
+        <w:t xml:space="preserve">Foto de fondo</w:t>
+      </w:r>
+      <w:r>
+        <w:rPr>
+          <w:rFonts w:ascii="Calibri" w:cs="Calibri" w:eastAsia="Calibri" w:hAnsi="Calibri"/>
+          <w:b w:val="false"/>
+          <w:bCs w:val="false"/>
+          <w:color w:val="1A1A1A"/>
+          <w:sz w:val="22"/>
+          <w:szCs w:val="22"/>
+        </w:rPr>
+        <w:t xml:space="preserve">: la imagen sale con tu foto detrás y los datos de la sesión encima.</w:t>
+      </w:r>
+    </w:p>
+    <w:p>
+      <w:pPr>
+        <w:spacing w:after="160" w:line="276"/>
+      </w:pPr>
+      <w:r>
+        <w:rPr>
+          <w:rFonts w:ascii="Calibri" w:cs="Calibri" w:eastAsia="Calibri" w:hAnsi="Calibri"/>
+          <w:b/>
+          <w:bCs/>
+          <w:color w:val="1A1A1A"/>
+          <w:sz w:val="22"/>
+          <w:szCs w:val="22"/>
+        </w:rPr>
+        <w:t xml:space="preserve">¿TrueLift me hace la dieta?</w:t>
+      </w:r>
+      <w:r>
+        <w:rPr>
+          <w:rFonts w:ascii="Calibri" w:cs="Calibri" w:eastAsia="Calibri" w:hAnsi="Calibri"/>
+          <w:b w:val="false"/>
+          <w:bCs w:val="false"/>
+          <w:color w:val="1A1A1A"/>
+          <w:sz w:val="22"/>
+          <w:szCs w:val="22"/>
+        </w:rPr>
+        <w:t xml:space="preserve"> No. Te da una referencia de calorías para tu fase y su reparto en macros y comidas (Nutrición → Energía diaria → Crea tu menú). Si quieres un menú concreto, </w:t>
+      </w:r>
+      <w:r>
+        <w:rPr>
+          <w:rFonts w:ascii="Calibri" w:cs="Calibri" w:eastAsia="Calibri" w:hAnsi="Calibri"/>
+          <w:b/>
+          <w:bCs/>
+          <w:color w:val="1A1A1A"/>
+          <w:sz w:val="22"/>
+          <w:szCs w:val="22"/>
+        </w:rPr>
+        <w:t xml:space="preserve">Crea tu menú semanal con IA</w:t>
+      </w:r>
+      <w:r>
+        <w:rPr>
+          <w:rFonts w:ascii="Calibri" w:cs="Calibri" w:eastAsia="Calibri" w:hAnsi="Calibri"/>
+          <w:b w:val="false"/>
+          <w:bCs w:val="false"/>
+          <w:color w:val="1A1A1A"/>
+          <w:sz w:val="22"/>
+          <w:szCs w:val="22"/>
+        </w:rPr>
+        <w:t xml:space="preserve"> prepara un prompt con tus cifras y tus preferencias para que lo pegues en tu IA; el menú que te devuelva es orientativo y TrueLift no lo verifica.</w:t>
+      </w:r>
+    </w:p>
+    <w:p>
+      <w:pPr>
+        <w:spacing w:after="160" w:line="276"/>
+      </w:pPr>
+      <w:r>
+        <w:rPr>
+          <w:rFonts w:ascii="Calibri" w:cs="Calibri" w:eastAsia="Calibri" w:hAnsi="Calibri"/>
+          <w:b/>
+          <w:bCs/>
+          <w:color w:val="1A1A1A"/>
+          <w:sz w:val="22"/>
+          <w:szCs w:val="22"/>
+        </w:rPr>
+        <w:t xml:space="preserve">No quiero comer lo que me recomienda la app.</w:t>
+      </w:r>
+      <w:r>
+        <w:rPr>
+          <w:rFonts w:ascii="Calibri" w:cs="Calibri" w:eastAsia="Calibri" w:hAnsi="Calibri"/>
+          <w:b w:val="false"/>
+          <w:bCs w:val="false"/>
+          <w:color w:val="1A1A1A"/>
+          <w:sz w:val="22"/>
+          <w:szCs w:val="22"/>
+        </w:rPr>
+        <w:t xml:space="preserve"> En el reparto en comidas, toca el lápiz junto a las kcal y escribe tu cifra: los macros y las comidas se recalculan, y </w:t>
+      </w:r>
+      <w:r>
+        <w:rPr>
+          <w:rFonts w:ascii="Calibri" w:cs="Calibri" w:eastAsia="Calibri" w:hAnsi="Calibri"/>
+          <w:b/>
+          <w:bCs/>
+          <w:color w:val="1A1A1A"/>
+          <w:sz w:val="22"/>
+          <w:szCs w:val="22"/>
+        </w:rPr>
+        <w:t xml:space="preserve">Volver a lo recomendado</w:t>
+      </w:r>
+      <w:r>
+        <w:rPr>
+          <w:rFonts w:ascii="Calibri" w:cs="Calibri" w:eastAsia="Calibri" w:hAnsi="Calibri"/>
+          <w:b w:val="false"/>
+          <w:bCs w:val="false"/>
+          <w:color w:val="1A1A1A"/>
+          <w:sz w:val="22"/>
+          <w:szCs w:val="22"/>
+        </w:rPr>
+        <w:t xml:space="preserve"> lo deshace. La tarjeta semanal sigue mirando tu báscula.</w:t>
+      </w:r>
+    </w:p>
+    <w:p>
+      <w:pPr>
+        <w:spacing w:after="160" w:line="276"/>
+      </w:pPr>
+      <w:r>
+        <w:rPr>
+          <w:rFonts w:ascii="Calibri" w:cs="Calibri" w:eastAsia="Calibri" w:hAnsi="Calibri"/>
+          <w:b/>
+          <w:bCs/>
+          <w:color w:val="1A1A1A"/>
+          <w:sz w:val="22"/>
+          <w:szCs w:val="22"/>
+        </w:rPr>
+        <w:t xml:space="preserve">La tarjeta semanal me pide caminar demasiado.</w:t>
+      </w:r>
+      <w:r>
+        <w:rPr>
+          <w:rFonts w:ascii="Calibri" w:cs="Calibri" w:eastAsia="Calibri" w:hAnsi="Calibri"/>
+          <w:b w:val="false"/>
+          <w:bCs w:val="false"/>
+          <w:color w:val="1A1A1A"/>
+          <w:sz w:val="22"/>
+          <w:szCs w:val="22"/>
+        </w:rPr>
+        <w:t xml:space="preserve"> Fija tu </w:t>
+      </w:r>
+      <w:r>
+        <w:rPr>
+          <w:rFonts w:ascii="Calibri" w:cs="Calibri" w:eastAsia="Calibri" w:hAnsi="Calibri"/>
+          <w:b/>
+          <w:bCs/>
+          <w:color w:val="1A1A1A"/>
+          <w:sz w:val="22"/>
+          <w:szCs w:val="22"/>
+        </w:rPr>
+        <w:t xml:space="preserve">límite de pasos al día</w:t>
+      </w:r>
+      <w:r>
+        <w:rPr>
+          <w:rFonts w:ascii="Calibri" w:cs="Calibri" w:eastAsia="Calibri" w:hAnsi="Calibri"/>
+          <w:b w:val="false"/>
+          <w:bCs w:val="false"/>
+          <w:color w:val="1A1A1A"/>
+          <w:sz w:val="22"/>
+          <w:szCs w:val="22"/>
+        </w:rPr>
+        <w:t xml:space="preserve"> en Nutrición → Tus datos, o con el enlace Cambiar límite de pasos de la propia tarjeta. Desde la próxima tarjeta, la vía de caminar no te pedirá pasar de ese total.</w:t>
+      </w:r>
+    </w:p>
+    <w:p>
+      <w:pPr>
+        <w:spacing w:after="160" w:line="276"/>
+      </w:pPr>
+      <w:r>
+        <w:rPr>
+          <w:rFonts w:ascii="Calibri" w:cs="Calibri" w:eastAsia="Calibri" w:hAnsi="Calibri"/>
+          <w:b/>
+          <w:bCs/>
+          <w:color w:val="1A1A1A"/>
+          <w:sz w:val="22"/>
+          <w:szCs w:val="22"/>
+        </w:rPr>
+        <w:t xml:space="preserve">¿Qué diferencia hay entre drop set y rest-pause?</w:t>
+      </w:r>
+      <w:r>
+        <w:rPr>
+          <w:rFonts w:ascii="Calibri" w:cs="Calibri" w:eastAsia="Calibri" w:hAnsi="Calibri"/>
+          <w:b w:val="false"/>
+          <w:bCs w:val="false"/>
+          <w:color w:val="1A1A1A"/>
+          <w:sz w:val="22"/>
+          <w:szCs w:val="22"/>
+        </w:rPr>
+        <w:t xml:space="preserve"> En el drop set bajas el peso sin descansar; en el rest-pause mantienes el mismo peso y descansas unos segundos entre series cortas. Los dos son PRO, van al fallo y en los dos solo la primera serie cuenta para tu rendimiento y tus marcas.</w:t>
+      </w:r>
+    </w:p>
+    <w:p>
+      <w:pPr>
+        <w:spacing w:after="160" w:line="276"/>
+      </w:pPr>
+      <w:r>
+        <w:rPr>
+          <w:rFonts w:ascii="Calibri" w:cs="Calibri" w:eastAsia="Calibri" w:hAnsi="Calibri"/>
+          <w:b/>
+          <w:bCs/>
+          <w:color w:val="1A1A1A"/>
+          <w:sz w:val="22"/>
+          <w:szCs w:val="22"/>
+        </w:rPr>
+        <w:t xml:space="preserve">He cambiado de máquina y el rendimiento de ese ejercicio ya no tiene sentido.</w:t>
+      </w:r>
+      <w:r>
+        <w:rPr>
+          <w:rFonts w:ascii="Calibri" w:cs="Calibri" w:eastAsia="Calibri" w:hAnsi="Calibri"/>
+          <w:b w:val="false"/>
+          <w:bCs w:val="false"/>
+          <w:color w:val="1A1A1A"/>
+          <w:sz w:val="22"/>
+          <w:szCs w:val="22"/>
+        </w:rPr>
+        <w:t xml:space="preserve"> Despliega el ejercicio en la pestaña Rutina y pulsa </w:t>
+      </w:r>
+      <w:r>
+        <w:rPr>
+          <w:rFonts w:ascii="Calibri" w:cs="Calibri" w:eastAsia="Calibri" w:hAnsi="Calibri"/>
+          <w:b/>
+          <w:bCs/>
+          <w:color w:val="1A1A1A"/>
+          <w:sz w:val="22"/>
+          <w:szCs w:val="22"/>
+        </w:rPr>
+        <w:t xml:space="preserve">Reiniciar base de rendimiento</w:t>
+      </w:r>
+      <w:r>
+        <w:rPr>
+          <w:rFonts w:ascii="Calibri" w:cs="Calibri" w:eastAsia="Calibri" w:hAnsi="Calibri"/>
+          <w:b w:val="false"/>
+          <w:bCs w:val="false"/>
+          <w:color w:val="1A1A1A"/>
+          <w:sz w:val="22"/>
+          <w:szCs w:val="22"/>
+        </w:rPr>
+        <w:t xml:space="preserve">: deja de compararse con las sesiones anteriores y la app construye una base nueva. Tu historial y tus marcas no se tocan.</w:t>
+      </w:r>
+    </w:p>
+    <w:p>
+      <w:pPr>
+        <w:spacing w:after="160" w:line="276"/>
+      </w:pPr>
+      <w:r>
+        <w:rPr>
+          <w:rFonts w:ascii="Calibri" w:cs="Calibri" w:eastAsia="Calibri" w:hAnsi="Calibri"/>
+          <w:b/>
+          <w:bCs/>
+          <w:color w:val="1A1A1A"/>
+          <w:sz w:val="22"/>
+          <w:szCs w:val="22"/>
+        </w:rPr>
+        <w:t xml:space="preserve">He cambiado de rutina, ¿he perdido mis sesiones?</w:t>
+      </w:r>
+      <w:r>
+        <w:rPr>
+          <w:rFonts w:ascii="Calibri" w:cs="Calibri" w:eastAsia="Calibri" w:hAnsi="Calibri"/>
+          <w:b w:val="false"/>
+          <w:bCs w:val="false"/>
+          <w:color w:val="1A1A1A"/>
+          <w:sz w:val="22"/>
+          <w:szCs w:val="22"/>
+        </w:rPr>
+        <w:t xml:space="preserve"> No. El historial y el calendario muestran todo lo que has entrenado, y las sesiones de rutinas anteriores llevan una franja que lo indica. Se pueden compartir y borrar, pero no editar.</w:t>
+      </w:r>
+    </w:p>
+    <w:p>
+      <w:pPr>
+        <w:spacing w:after="160" w:line="276"/>
+      </w:pPr>
+      <w:r>
+        <w:rPr>
+          <w:rFonts w:ascii="Calibri" w:cs="Calibri" w:eastAsia="Calibri" w:hAnsi="Calibri"/>
+          <w:b/>
+          <w:bCs/>
+          <w:color w:val="1A1A1A"/>
+          <w:sz w:val="22"/>
+          <w:szCs w:val="22"/>
+        </w:rPr>
+        <w:t xml:space="preserve">Me equivoqué al anotar un cardio.</w:t>
+      </w:r>
+      <w:r>
+        <w:rPr>
+          <w:rFonts w:ascii="Calibri" w:cs="Calibri" w:eastAsia="Calibri" w:hAnsi="Calibri"/>
+          <w:b w:val="false"/>
+          <w:bCs w:val="false"/>
+          <w:color w:val="1A1A1A"/>
+          <w:sz w:val="22"/>
+          <w:szCs w:val="22"/>
+        </w:rPr>
+        <w:t xml:space="preserve"> Toca el lápiz de la tarjeta de ese cardio en el historial y corrígelo; no hace falta borrarlo.</w:t>
+      </w:r>
+    </w:p>
+    <w:p>
+      <w:pPr>
+        <w:spacing w:after="160" w:line="276"/>
+      </w:pPr>
+      <w:r>
+        <w:rPr>
+          <w:rFonts w:ascii="Calibri" w:cs="Calibri" w:eastAsia="Calibri" w:hAnsi="Calibri"/>
+          <w:b/>
+          <w:bCs/>
+          <w:color w:val="1A1A1A"/>
+          <w:sz w:val="22"/>
+          <w:szCs w:val="22"/>
+        </w:rPr>
+        <w:t xml:space="preserve">Me molesta la rodilla y hoy toca torso, ¿me frena?</w:t>
+      </w:r>
+      <w:r>
+        <w:rPr>
+          <w:rFonts w:ascii="Calibri" w:cs="Calibri" w:eastAsia="Calibri" w:hAnsi="Calibri"/>
+          <w:b w:val="false"/>
+          <w:bCs w:val="false"/>
+          <w:color w:val="1A1A1A"/>
+          <w:sz w:val="22"/>
+          <w:szCs w:val="22"/>
+        </w:rPr>
+        <w:t xml:space="preserve"> No. Con la autorregulación, una molestia localizada solo limita el tren de esa zona: el chip de la cabecera muestra cada tren por separado y los ejercicios de torso siguen su curso, con sus subidas y sus récords.</w:t>
+      </w:r>
+    </w:p>
+    <w:p>
+      <w:pPr>
+        <w:spacing w:after="160" w:line="276"/>
+      </w:pPr>
+      <w:r>
+        <w:rPr>
+          <w:rFonts w:ascii="Calibri" w:cs="Calibri" w:eastAsia="Calibri" w:hAnsi="Calibri"/>
+          <w:b/>
+          <w:bCs/>
+          <w:color w:val="1A1A1A"/>
+          <w:sz w:val="22"/>
+          <w:szCs w:val="22"/>
+        </w:rPr>
+        <w:t xml:space="preserve">En mi Xiaomi, la app dice que Health Connect no responde.</w:t>
+      </w:r>
+      <w:r>
+        <w:rPr>
+          <w:rFonts w:ascii="Calibri" w:cs="Calibri" w:eastAsia="Calibri" w:hAnsi="Calibri"/>
+          <w:b w:val="false"/>
+          <w:bCs w:val="false"/>
+          <w:color w:val="1A1A1A"/>
+          <w:sz w:val="22"/>
+          <w:szCs w:val="22"/>
+        </w:rPr>
+        <w:t xml:space="preserve"> El sistema está impidiendo la conexión. Permite el inicio automático de Health Connect y de TrueLift en los ajustes del teléfono y vuelve a abrir la app. Mientras tanto, puedes seguir anotando a mano.</w:t>
+      </w:r>
+    </w:p>
+    <w:p>
+      <w:pPr>
+        <w:spacing w:after="160" w:line="276"/>
+      </w:pPr>
+      <w:r>
+        <w:rPr>
+          <w:rFonts w:ascii="Calibri" w:cs="Calibri" w:eastAsia="Calibri" w:hAnsi="Calibri"/>
+          <w:b/>
+          <w:bCs/>
+          <w:color w:val="1A1A1A"/>
+          <w:sz w:val="22"/>
+          <w:szCs w:val="22"/>
+        </w:rPr>
+        <w:t xml:space="preserve">¿Dónde apunto la altura del asiento o el agarre de una máquina?</w:t>
+      </w:r>
+      <w:r>
+        <w:rPr>
+          <w:rFonts w:ascii="Calibri" w:cs="Calibri" w:eastAsia="Calibri" w:hAnsi="Calibri"/>
+          <w:b w:val="false"/>
+          <w:bCs w:val="false"/>
+          <w:color w:val="1A1A1A"/>
+          <w:sz w:val="22"/>
+          <w:szCs w:val="22"/>
+        </w:rPr>
+        <w:t xml:space="preserve"> En Notas y ajustes del ejercicio, en el </w:t>
+      </w:r>
+      <w:r>
+        <w:rPr>
+          <w:rFonts w:ascii="Calibri" w:cs="Calibri" w:eastAsia="Calibri" w:hAnsi="Calibri"/>
+          <w:b/>
+          <w:bCs/>
+          <w:color w:val="1A1A1A"/>
+          <w:sz w:val="22"/>
+          <w:szCs w:val="22"/>
+        </w:rPr>
+        <w:t xml:space="preserve">Registro fijo del ejercicio</w:t>
+      </w:r>
+      <w:r>
+        <w:rPr>
+          <w:rFonts w:ascii="Calibri" w:cs="Calibri" w:eastAsia="Calibri" w:hAnsi="Calibri"/>
+          <w:b w:val="false"/>
+          <w:bCs w:val="false"/>
+          <w:color w:val="1A1A1A"/>
+          <w:sz w:val="22"/>
+          <w:szCs w:val="22"/>
+        </w:rPr>
+        <w:t xml:space="preserve">: se conserva en todas las sesiones.</w:t>
+      </w:r>
+    </w:p>
+    <w:p>
+      <w:pPr>
+        <w:spacing w:after="160" w:line="276"/>
+      </w:pPr>
+      <w:r>
+        <w:rPr>
+          <w:rFonts w:ascii="Calibri" w:cs="Calibri" w:eastAsia="Calibri" w:hAnsi="Calibri"/>
+          <w:b/>
+          <w:bCs/>
+          <w:color w:val="1A1A1A"/>
+          <w:sz w:val="22"/>
+          <w:szCs w:val="22"/>
+        </w:rPr>
+        <w:t xml:space="preserve">¿Dónde está la calculadora de discos?</w:t>
+      </w:r>
+      <w:r>
+        <w:rPr>
+          <w:rFonts w:ascii="Calibri" w:cs="Calibri" w:eastAsia="Calibri" w:hAnsi="Calibri"/>
+          <w:b w:val="false"/>
+          <w:bCs w:val="false"/>
+          <w:color w:val="1A1A1A"/>
+          <w:sz w:val="22"/>
+          <w:szCs w:val="22"/>
+        </w:rPr>
+        <w:t xml:space="preserve"> Ya no está en la barra superior: se abre desde Rutina → Detalles → Material disponible, y cada serie tiene su botón de discos con la carga ya puesta.</w:t>
+      </w:r>
+    </w:p>
+    <w:p>
+      <w:pPr>
+        <w:spacing w:after="160" w:line="276"/>
+      </w:pPr>
+      <w:r>
+        <w:rPr>
+          <w:rFonts w:ascii="Calibri" w:cs="Calibri" w:eastAsia="Calibri" w:hAnsi="Calibri"/>
+          <w:b/>
+          <w:bCs/>
+          <w:color w:val="1A1A1A"/>
+          <w:sz w:val="22"/>
+          <w:szCs w:val="22"/>
+        </w:rPr>
+        <w:t xml:space="preserve">¿Puedo crear un ejercicio que se mida por tiempo?</w:t>
+      </w:r>
+      <w:r>
+        <w:rPr>
+          <w:rFonts w:ascii="Calibri" w:cs="Calibri" w:eastAsia="Calibri" w:hAnsi="Calibri"/>
+          <w:b w:val="false"/>
+          <w:bCs w:val="false"/>
+          <w:color w:val="1A1A1A"/>
+          <w:sz w:val="22"/>
+          <w:szCs w:val="22"/>
+        </w:rPr>
+        <w:t xml:space="preserve"> Sí, con PRO: al crearlo, en Progresa por elige Tiempo. Anotas segundos y progresa como la plancha.</w:t>
       </w:r>
     </w:p>
     <w:p>

</xml_diff>

<commit_message>
Manual de la web al día en los tres idiomas (25/10/2026)
Sustituye los PDF que descarga la web (ES, EN y PT-BR) y el .docx por la
edición del 25/10/2026: récord y nivel nuevo para compartir como imagen o
vídeo, y la nueva sección Compartir en Strava (conexión, publicación a mano
o automática, duplicados con el reloj, imagen con los dibujos y club
TrueLift).

Co-Authored-By: Claude Opus 5.5 <noreply@anthropic.com>
Claude-Session: https://claude.ai/code/session_015QdEb8gScqezMq5e8qNpkA
</commit_message>
<xml_diff>
--- a/Manual_TrueLift.docx
+++ b/Manual_TrueLift.docx
@@ -105,7 +105,7 @@
           <w:sz w:val="22"/>
           <w:szCs w:val="22"/>
         </w:rPr>
-        <w:t>Edición de octubre de 2026 · actualizada el 22/10/2026</w:t>
+        <w:t>Edición de octubre de 2026 · actualizada el 25/10/2026</w:t>
       </w:r>
     </w:p>
     <w:p>
@@ -826,7 +826,7 @@
         <w:tc>
           <w:tcPr>
             <w:tcW w:type="dxa" w:w="6260"/>
-            <w:shd w:fill="F5F5F5" w:val="clear"/>
+            <w:shd w:val="clear" w:fill="F5F5F5"/>
             <w:tcMar>
               <w:top w:type="dxa" w:w="80"/>
               <w:left w:type="dxa" w:w="120"/>
@@ -854,7 +854,7 @@
         <w:tc>
           <w:tcPr>
             <w:tcW w:type="dxa" w:w="1550"/>
-            <w:shd w:fill="F5F5F5" w:val="clear"/>
+            <w:shd w:val="clear" w:fill="F5F5F5"/>
             <w:tcMar>
               <w:top w:type="dxa" w:w="80"/>
               <w:left w:type="dxa" w:w="120"/>
@@ -882,7 +882,7 @@
         <w:tc>
           <w:tcPr>
             <w:tcW w:type="dxa" w:w="1550"/>
-            <w:shd w:fill="F5F5F5" w:val="clear"/>
+            <w:shd w:val="clear" w:fill="F5F5F5"/>
             <w:tcMar>
               <w:top w:type="dxa" w:w="80"/>
               <w:left w:type="dxa" w:w="120"/>
@@ -999,7 +999,7 @@
         <w:tc>
           <w:tcPr>
             <w:tcW w:type="dxa" w:w="6260"/>
-            <w:shd w:fill="F5F5F5" w:val="clear"/>
+            <w:shd w:val="clear" w:fill="F5F5F5"/>
             <w:tcMar>
               <w:top w:type="dxa" w:w="80"/>
               <w:left w:type="dxa" w:w="120"/>
@@ -1027,7 +1027,7 @@
         <w:tc>
           <w:tcPr>
             <w:tcW w:type="dxa" w:w="1550"/>
-            <w:shd w:fill="F5F5F5" w:val="clear"/>
+            <w:shd w:val="clear" w:fill="F5F5F5"/>
             <w:tcMar>
               <w:top w:type="dxa" w:w="80"/>
               <w:left w:type="dxa" w:w="120"/>
@@ -1055,7 +1055,7 @@
         <w:tc>
           <w:tcPr>
             <w:tcW w:type="dxa" w:w="1550"/>
-            <w:shd w:fill="F5F5F5" w:val="clear"/>
+            <w:shd w:val="clear" w:fill="F5F5F5"/>
             <w:tcMar>
               <w:top w:type="dxa" w:w="80"/>
               <w:left w:type="dxa" w:w="120"/>
@@ -1174,7 +1174,7 @@
         <w:tc>
           <w:tcPr>
             <w:tcW w:type="dxa" w:w="6260"/>
-            <w:shd w:fill="F5F5F5" w:val="clear"/>
+            <w:shd w:val="clear" w:fill="F5F5F5"/>
             <w:tcMar>
               <w:top w:type="dxa" w:w="80"/>
               <w:left w:type="dxa" w:w="120"/>
@@ -1202,7 +1202,7 @@
         <w:tc>
           <w:tcPr>
             <w:tcW w:type="dxa" w:w="1550"/>
-            <w:shd w:fill="F5F5F5" w:val="clear"/>
+            <w:shd w:val="clear" w:fill="F5F5F5"/>
             <w:tcMar>
               <w:top w:type="dxa" w:w="80"/>
               <w:left w:type="dxa" w:w="120"/>
@@ -1230,7 +1230,7 @@
         <w:tc>
           <w:tcPr>
             <w:tcW w:type="dxa" w:w="1550"/>
-            <w:shd w:fill="F5F5F5" w:val="clear"/>
+            <w:shd w:val="clear" w:fill="F5F5F5"/>
             <w:tcMar>
               <w:top w:type="dxa" w:w="80"/>
               <w:left w:type="dxa" w:w="120"/>
@@ -1281,7 +1281,7 @@
                 <w:sz w:val="20"/>
                 <w:szCs w:val="20"/>
               </w:rPr>
-              <w:t xml:space="preserve">Avisos en vivo de récord y de nivel de fuerza nuevo, con su interruptor</w:t>
+              <w:t>Avisos en vivo de récord y de nivel de fuerza nuevo, con su interruptor, para compartir como imagen o vídeo</w:t>
             </w:r>
           </w:p>
         </w:tc>
@@ -1343,7 +1343,7 @@
         <w:tc>
           <w:tcPr>
             <w:tcW w:type="dxa" w:w="6260"/>
-            <w:shd w:fill="F5F5F5" w:val="clear"/>
+            <w:shd w:val="clear" w:fill="F5F5F5"/>
             <w:tcMar>
               <w:top w:type="dxa" w:w="80"/>
               <w:left w:type="dxa" w:w="120"/>
@@ -1371,7 +1371,7 @@
         <w:tc>
           <w:tcPr>
             <w:tcW w:type="dxa" w:w="1550"/>
-            <w:shd w:fill="F5F5F5" w:val="clear"/>
+            <w:shd w:val="clear" w:fill="F5F5F5"/>
             <w:tcMar>
               <w:top w:type="dxa" w:w="80"/>
               <w:left w:type="dxa" w:w="120"/>
@@ -1399,7 +1399,7 @@
         <w:tc>
           <w:tcPr>
             <w:tcW w:type="dxa" w:w="1550"/>
-            <w:shd w:fill="F5F5F5" w:val="clear"/>
+            <w:shd w:val="clear" w:fill="F5F5F5"/>
             <w:tcMar>
               <w:top w:type="dxa" w:w="80"/>
               <w:left w:type="dxa" w:w="120"/>
@@ -1518,7 +1518,7 @@
         <w:tc>
           <w:tcPr>
             <w:tcW w:type="dxa" w:w="6260"/>
-            <w:shd w:fill="F5F5F5" w:val="clear"/>
+            <w:shd w:val="clear" w:fill="F5F5F5"/>
             <w:tcMar>
               <w:top w:type="dxa" w:w="80"/>
               <w:left w:type="dxa" w:w="120"/>
@@ -1546,7 +1546,7 @@
         <w:tc>
           <w:tcPr>
             <w:tcW w:type="dxa" w:w="1550"/>
-            <w:shd w:fill="F5F5F5" w:val="clear"/>
+            <w:shd w:val="clear" w:fill="F5F5F5"/>
             <w:tcMar>
               <w:top w:type="dxa" w:w="80"/>
               <w:left w:type="dxa" w:w="120"/>
@@ -1574,7 +1574,7 @@
         <w:tc>
           <w:tcPr>
             <w:tcW w:type="dxa" w:w="1550"/>
-            <w:shd w:fill="F5F5F5" w:val="clear"/>
+            <w:shd w:val="clear" w:fill="F5F5F5"/>
             <w:tcMar>
               <w:top w:type="dxa" w:w="80"/>
               <w:left w:type="dxa" w:w="120"/>
@@ -1693,7 +1693,7 @@
         <w:tc>
           <w:tcPr>
             <w:tcW w:type="dxa" w:w="6260"/>
-            <w:shd w:fill="F5F5F5" w:val="clear"/>
+            <w:shd w:val="clear" w:fill="F5F5F5"/>
             <w:tcMar>
               <w:top w:type="dxa" w:w="80"/>
               <w:left w:type="dxa" w:w="120"/>
@@ -1714,14 +1714,14 @@
                 <w:sz w:val="20"/>
                 <w:szCs w:val="20"/>
               </w:rPr>
-              <w:t>Copias de seguridad y TrueLift Escritorio (tus datos en el ordenador)</w:t>
+              <w:t>Publicar tus sesiones en Strava, a mano o automáticamente, y club TrueLift</w:t>
             </w:r>
           </w:p>
         </w:tc>
         <w:tc>
           <w:tcPr>
             <w:tcW w:type="dxa" w:w="1550"/>
-            <w:shd w:fill="F5F5F5" w:val="clear"/>
+            <w:shd w:val="clear" w:fill="F5F5F5"/>
             <w:tcMar>
               <w:top w:type="dxa" w:w="80"/>
               <w:left w:type="dxa" w:w="120"/>
@@ -1749,7 +1749,7 @@
         <w:tc>
           <w:tcPr>
             <w:tcW w:type="dxa" w:w="1550"/>
-            <w:shd w:fill="F5F5F5" w:val="clear"/>
+            <w:shd w:val="clear" w:fill="F5F5F5"/>
             <w:tcMar>
               <w:top w:type="dxa" w:w="80"/>
               <w:left w:type="dxa" w:w="120"/>
@@ -1802,7 +1802,7 @@
                 <w:sz w:val="20"/>
                 <w:szCs w:val="20"/>
               </w:rPr>
-              <w:t xml:space="preserve">Cambiar un ejercicio por otro del mismo patrón y grupo</w:t>
+              <w:t>Copias de seguridad y TrueLift Escritorio (tus datos en el ordenador)</w:t>
             </w:r>
           </w:p>
         </w:tc>
@@ -1868,7 +1868,7 @@
         <w:tc>
           <w:tcPr>
             <w:tcW w:type="dxa" w:w="6260"/>
-            <w:shd w:fill="F5F5F5" w:val="clear"/>
+            <w:shd w:val="clear" w:fill="F5F5F5"/>
             <w:tcMar>
               <w:top w:type="dxa" w:w="80"/>
               <w:left w:type="dxa" w:w="120"/>
@@ -1889,14 +1889,14 @@
                 <w:sz w:val="20"/>
                 <w:szCs w:val="20"/>
               </w:rPr>
-              <w:t xml:space="preserve">Renombrar tu rutina</w:t>
+              <w:t xml:space="preserve">Cambiar un ejercicio por otro del mismo patrón y grupo</w:t>
             </w:r>
           </w:p>
         </w:tc>
         <w:tc>
           <w:tcPr>
             <w:tcW w:type="dxa" w:w="1550"/>
-            <w:shd w:fill="F5F5F5" w:val="clear"/>
+            <w:shd w:val="clear" w:fill="F5F5F5"/>
             <w:tcMar>
               <w:top w:type="dxa" w:w="80"/>
               <w:left w:type="dxa" w:w="120"/>
@@ -1924,7 +1924,7 @@
         <w:tc>
           <w:tcPr>
             <w:tcW w:type="dxa" w:w="1550"/>
-            <w:shd w:fill="F5F5F5" w:val="clear"/>
+            <w:shd w:val="clear" w:fill="F5F5F5"/>
             <w:tcMar>
               <w:top w:type="dxa" w:w="80"/>
               <w:left w:type="dxa" w:w="120"/>
@@ -1977,7 +1977,7 @@
                 <w:sz w:val="20"/>
                 <w:szCs w:val="20"/>
               </w:rPr>
-              <w:t xml:space="preserve">Exportar tu rutina a Excel</w:t>
+              <w:t xml:space="preserve">Renombrar tu rutina</w:t>
             </w:r>
           </w:p>
         </w:tc>
@@ -2043,7 +2043,7 @@
         <w:tc>
           <w:tcPr>
             <w:tcW w:type="dxa" w:w="6260"/>
-            <w:shd w:fill="F5F5F5" w:val="clear"/>
+            <w:shd w:val="clear" w:fill="F5F5F5"/>
             <w:tcMar>
               <w:top w:type="dxa" w:w="80"/>
               <w:left w:type="dxa" w:w="120"/>
@@ -2064,14 +2064,14 @@
                 <w:sz w:val="20"/>
                 <w:szCs w:val="20"/>
               </w:rPr>
-              <w:t>Idioma (ES / EN / PT-BR), unidades kg / lb, tamaño del texto y tema oscuro o claro</w:t>
+              <w:t xml:space="preserve">Exportar tu rutina a Excel</w:t>
             </w:r>
           </w:p>
         </w:tc>
         <w:tc>
           <w:tcPr>
             <w:tcW w:type="dxa" w:w="1550"/>
-            <w:shd w:fill="F5F5F5" w:val="clear"/>
+            <w:shd w:val="clear" w:fill="F5F5F5"/>
             <w:tcMar>
               <w:top w:type="dxa" w:w="80"/>
               <w:left w:type="dxa" w:w="120"/>
@@ -2099,7 +2099,7 @@
         <w:tc>
           <w:tcPr>
             <w:tcW w:type="dxa" w:w="1550"/>
-            <w:shd w:fill="F5F5F5" w:val="clear"/>
+            <w:shd w:val="clear" w:fill="F5F5F5"/>
             <w:tcMar>
               <w:top w:type="dxa" w:w="80"/>
               <w:left w:type="dxa" w:w="120"/>
@@ -2152,6 +2152,93 @@
                 <w:sz w:val="20"/>
                 <w:szCs w:val="20"/>
               </w:rPr>
+              <w:t>Idioma (ES / EN / PT-BR), unidades kg / lb, tamaño del texto y tema oscuro o claro</w:t>
+            </w:r>
+          </w:p>
+        </w:tc>
+        <w:tc>
+          <w:tcPr>
+            <w:tcW w:type="dxa" w:w="1550"/>
+            <w:tcMar>
+              <w:top w:type="dxa" w:w="80"/>
+              <w:left w:type="dxa" w:w="120"/>
+              <w:bottom w:type="dxa" w:w="80"/>
+              <w:right w:type="dxa" w:w="120"/>
+            </w:tcMar>
+          </w:tcPr>
+          <w:p>
+            <w:pPr>
+              <w:jc w:val="center"/>
+            </w:pPr>
+            <w:r>
+              <w:rPr>
+                <w:rFonts w:ascii="Calibri" w:cs="Calibri" w:eastAsia="Calibri" w:hAnsi="Calibri"/>
+                <w:b w:val="false"/>
+                <w:bCs w:val="false"/>
+                <w:color w:val="1A1A1A"/>
+                <w:sz w:val="20"/>
+                <w:szCs w:val="20"/>
+              </w:rPr>
+              <w:t xml:space="preserve">✓</w:t>
+            </w:r>
+          </w:p>
+        </w:tc>
+        <w:tc>
+          <w:tcPr>
+            <w:tcW w:type="dxa" w:w="1550"/>
+            <w:tcMar>
+              <w:top w:type="dxa" w:w="80"/>
+              <w:left w:type="dxa" w:w="120"/>
+              <w:bottom w:type="dxa" w:w="80"/>
+              <w:right w:type="dxa" w:w="120"/>
+            </w:tcMar>
+          </w:tcPr>
+          <w:p>
+            <w:pPr>
+              <w:jc w:val="center"/>
+            </w:pPr>
+            <w:r>
+              <w:rPr>
+                <w:rFonts w:ascii="Calibri" w:cs="Calibri" w:eastAsia="Calibri" w:hAnsi="Calibri"/>
+                <w:b w:val="false"/>
+                <w:bCs w:val="false"/>
+                <w:color w:val="1A1A1A"/>
+                <w:sz w:val="20"/>
+                <w:szCs w:val="20"/>
+              </w:rPr>
+              <w:t xml:space="preserve">✓</w:t>
+            </w:r>
+          </w:p>
+        </w:tc>
+      </w:tr>
+      <w:tr>
+        <w:trPr>
+          <w:tblHeader w:val="false"/>
+        </w:trPr>
+        <w:tc>
+          <w:tcPr>
+            <w:tcW w:type="dxa" w:w="6260"/>
+            <w:shd w:val="clear" w:fill="F5F5F5"/>
+            <w:tcMar>
+              <w:top w:type="dxa" w:w="80"/>
+              <w:left w:type="dxa" w:w="120"/>
+              <w:bottom w:type="dxa" w:w="80"/>
+              <w:right w:type="dxa" w:w="120"/>
+            </w:tcMar>
+          </w:tcPr>
+          <w:p>
+            <w:pPr>
+              <w:jc w:val="left"/>
+            </w:pPr>
+            <w:r>
+              <w:rPr>
+                <w:rFonts w:ascii="Calibri" w:cs="Calibri" w:eastAsia="Calibri" w:hAnsi="Calibri"/>
+                <w:b w:val="false"/>
+                <w:bCs w:val="false"/>
+                <w:color w:val="1A1A1A"/>
+                <w:sz w:val="20"/>
+                <w:szCs w:val="20"/>
+              </w:rPr>
               <w:t>Modo DEMO: explorar la app con un historial de ejemplo</w:t>
             </w:r>
           </w:p>
@@ -2159,6 +2246,7 @@
         <w:tc>
           <w:tcPr>
             <w:tcW w:type="dxa" w:w="1550"/>
+            <w:shd w:val="clear" w:fill="F5F5F5"/>
             <w:tcMar>
               <w:top w:type="dxa" w:w="80"/>
               <w:left w:type="dxa" w:w="120"/>
@@ -2186,6 +2274,7 @@
         <w:tc>
           <w:tcPr>
             <w:tcW w:type="dxa" w:w="1550"/>
+            <w:shd w:val="clear" w:fill="F5F5F5"/>
             <w:tcMar>
               <w:top w:type="dxa" w:w="80"/>
               <w:left w:type="dxa" w:w="120"/>
@@ -2218,7 +2307,6 @@
         <w:tc>
           <w:tcPr>
             <w:tcW w:type="dxa" w:w="6260"/>
-            <w:shd w:fill="F5F5F5" w:val="clear"/>
             <w:tcMar>
               <w:top w:type="dxa" w:w="80"/>
               <w:left w:type="dxa" w:w="120"/>
@@ -2246,7 +2334,6 @@
         <w:tc>
           <w:tcPr>
             <w:tcW w:type="dxa" w:w="1550"/>
-            <w:shd w:fill="F5F5F5" w:val="clear"/>
             <w:tcMar>
               <w:top w:type="dxa" w:w="80"/>
               <w:left w:type="dxa" w:w="120"/>
@@ -2274,7 +2361,6 @@
         <w:tc>
           <w:tcPr>
             <w:tcW w:type="dxa" w:w="1550"/>
-            <w:shd w:fill="F5F5F5" w:val="clear"/>
             <w:tcMar>
               <w:top w:type="dxa" w:w="80"/>
               <w:left w:type="dxa" w:w="120"/>
@@ -2307,6 +2393,7 @@
         <w:tc>
           <w:tcPr>
             <w:tcW w:type="dxa" w:w="6260"/>
+            <w:shd w:val="clear" w:fill="F5F5F5"/>
             <w:tcMar>
               <w:top w:type="dxa" w:w="80"/>
               <w:left w:type="dxa" w:w="120"/>
@@ -2328,6 +2415,94 @@
                 <w:szCs w:val="20"/>
               </w:rPr>
               <w:t>Importar una rutina desde Excel</w:t>
+            </w:r>
+          </w:p>
+        </w:tc>
+        <w:tc>
+          <w:tcPr>
+            <w:tcW w:type="dxa" w:w="1550"/>
+            <w:shd w:val="clear" w:fill="F5F5F5"/>
+            <w:tcMar>
+              <w:top w:type="dxa" w:w="80"/>
+              <w:left w:type="dxa" w:w="120"/>
+              <w:bottom w:type="dxa" w:w="80"/>
+              <w:right w:type="dxa" w:w="120"/>
+            </w:tcMar>
+          </w:tcPr>
+          <w:p>
+            <w:pPr>
+              <w:jc w:val="center"/>
+            </w:pPr>
+            <w:r>
+              <w:rPr>
+                <w:rFonts w:ascii="Calibri" w:cs="Calibri" w:eastAsia="Calibri" w:hAnsi="Calibri"/>
+                <w:b w:val="0"/>
+                <w:bCs w:val="false"/>
+                <w:color w:val="1A1A1A"/>
+                <w:sz w:val="20"/>
+                <w:szCs w:val="20"/>
+              </w:rPr>
+              <w:t>✓</w:t>
+            </w:r>
+          </w:p>
+        </w:tc>
+        <w:tc>
+          <w:tcPr>
+            <w:tcW w:type="dxa" w:w="1550"/>
+            <w:shd w:val="clear" w:fill="F5F5F5"/>
+            <w:tcMar>
+              <w:top w:type="dxa" w:w="80"/>
+              <w:left w:type="dxa" w:w="120"/>
+              <w:bottom w:type="dxa" w:w="80"/>
+              <w:right w:type="dxa" w:w="120"/>
+            </w:tcMar>
+          </w:tcPr>
+          <w:p>
+            <w:pPr>
+              <w:jc w:val="center"/>
+            </w:pPr>
+            <w:r>
+              <w:rPr>
+                <w:rFonts w:ascii="Calibri" w:cs="Calibri" w:eastAsia="Calibri" w:hAnsi="Calibri"/>
+                <w:b w:val="0"/>
+                <w:bCs w:val="false"/>
+                <w:color w:val="1A1A1A"/>
+                <w:sz w:val="20"/>
+                <w:szCs w:val="20"/>
+              </w:rPr>
+              <w:t>✓</w:t>
+            </w:r>
+          </w:p>
+        </w:tc>
+      </w:tr>
+      <w:tr>
+        <w:trPr>
+          <w:tblHeader w:val="false"/>
+        </w:trPr>
+        <w:tc>
+          <w:tcPr>
+            <w:tcW w:type="dxa" w:w="6260"/>
+            <w:tcMar>
+              <w:top w:type="dxa" w:w="80"/>
+              <w:left w:type="dxa" w:w="120"/>
+              <w:bottom w:type="dxa" w:w="80"/>
+              <w:right w:type="dxa" w:w="120"/>
+            </w:tcMar>
+          </w:tcPr>
+          <w:p>
+            <w:pPr>
+              <w:jc w:val="left"/>
+            </w:pPr>
+            <w:r>
+              <w:rPr>
+                <w:rFonts w:ascii="Calibri" w:cs="Calibri" w:eastAsia="Calibri" w:hAnsi="Calibri"/>
+                <w:b w:val="0"/>
+                <w:bCs w:val="false"/>
+                <w:color w:val="1A1A1A"/>
+                <w:sz w:val="20"/>
+                <w:szCs w:val="20"/>
+              </w:rPr>
+              <w:t>Importar tu historial de Hevy o de Strong</w:t>
             </w:r>
           </w:p>
         </w:tc>
@@ -2393,7 +2568,7 @@
         <w:tc>
           <w:tcPr>
             <w:tcW w:type="dxa" w:w="6260"/>
-            <w:shd w:fill="F5F5F5" w:val="clear"/>
+            <w:shd w:val="clear" w:fill="F5F5F5"/>
             <w:tcMar>
               <w:top w:type="dxa" w:w="80"/>
               <w:left w:type="dxa" w:w="120"/>
@@ -2414,14 +2589,14 @@
                 <w:sz w:val="20"/>
                 <w:szCs w:val="20"/>
               </w:rPr>
-              <w:t>Importar tu historial de Hevy o de Strong</w:t>
+              <w:t>Vídeo de técnica de los ejercicios de la biblioteca</w:t>
             </w:r>
           </w:p>
         </w:tc>
         <w:tc>
           <w:tcPr>
             <w:tcW w:type="dxa" w:w="1550"/>
-            <w:shd w:fill="F5F5F5" w:val="clear"/>
+            <w:shd w:val="clear" w:fill="F5F5F5"/>
             <w:tcMar>
               <w:top w:type="dxa" w:w="80"/>
               <w:left w:type="dxa" w:w="120"/>
@@ -2449,7 +2624,7 @@
         <w:tc>
           <w:tcPr>
             <w:tcW w:type="dxa" w:w="1550"/>
-            <w:shd w:fill="F5F5F5" w:val="clear"/>
+            <w:shd w:val="clear" w:fill="F5F5F5"/>
             <w:tcMar>
               <w:top w:type="dxa" w:w="80"/>
               <w:left w:type="dxa" w:w="120"/>
@@ -2496,93 +2671,6 @@
             <w:r>
               <w:rPr>
                 <w:rFonts w:ascii="Calibri" w:cs="Calibri" w:eastAsia="Calibri" w:hAnsi="Calibri"/>
-                <w:b w:val="0"/>
-                <w:bCs w:val="false"/>
-                <w:color w:val="1A1A1A"/>
-                <w:sz w:val="20"/>
-                <w:szCs w:val="20"/>
-              </w:rPr>
-              <w:t>Vídeo de técnica de los ejercicios de la biblioteca</w:t>
-            </w:r>
-          </w:p>
-        </w:tc>
-        <w:tc>
-          <w:tcPr>
-            <w:tcW w:type="dxa" w:w="1550"/>
-            <w:tcMar>
-              <w:top w:type="dxa" w:w="80"/>
-              <w:left w:type="dxa" w:w="120"/>
-              <w:bottom w:type="dxa" w:w="80"/>
-              <w:right w:type="dxa" w:w="120"/>
-            </w:tcMar>
-          </w:tcPr>
-          <w:p>
-            <w:pPr>
-              <w:jc w:val="center"/>
-            </w:pPr>
-            <w:r>
-              <w:rPr>
-                <w:rFonts w:ascii="Calibri" w:cs="Calibri" w:eastAsia="Calibri" w:hAnsi="Calibri"/>
-                <w:b w:val="0"/>
-                <w:bCs w:val="false"/>
-                <w:color w:val="1A1A1A"/>
-                <w:sz w:val="20"/>
-                <w:szCs w:val="20"/>
-              </w:rPr>
-              <w:t>✓</w:t>
-            </w:r>
-          </w:p>
-        </w:tc>
-        <w:tc>
-          <w:tcPr>
-            <w:tcW w:type="dxa" w:w="1550"/>
-            <w:tcMar>
-              <w:top w:type="dxa" w:w="80"/>
-              <w:left w:type="dxa" w:w="120"/>
-              <w:bottom w:type="dxa" w:w="80"/>
-              <w:right w:type="dxa" w:w="120"/>
-            </w:tcMar>
-          </w:tcPr>
-          <w:p>
-            <w:pPr>
-              <w:jc w:val="center"/>
-            </w:pPr>
-            <w:r>
-              <w:rPr>
-                <w:rFonts w:ascii="Calibri" w:cs="Calibri" w:eastAsia="Calibri" w:hAnsi="Calibri"/>
-                <w:b w:val="0"/>
-                <w:bCs w:val="false"/>
-                <w:color w:val="1A1A1A"/>
-                <w:sz w:val="20"/>
-                <w:szCs w:val="20"/>
-              </w:rPr>
-              <w:t>✓</w:t>
-            </w:r>
-          </w:p>
-        </w:tc>
-      </w:tr>
-      <w:tr>
-        <w:trPr>
-          <w:tblHeader w:val="false"/>
-        </w:trPr>
-        <w:tc>
-          <w:tcPr>
-            <w:tcW w:type="dxa" w:w="6260"/>
-            <w:shd w:fill="F5F5F5" w:val="clear"/>
-            <w:tcMar>
-              <w:top w:type="dxa" w:w="80"/>
-              <w:left w:type="dxa" w:w="120"/>
-              <w:bottom w:type="dxa" w:w="80"/>
-              <w:right w:type="dxa" w:w="120"/>
-            </w:tcMar>
-          </w:tcPr>
-          <w:p>
-            <w:pPr>
-              <w:jc w:val="left"/>
-            </w:pPr>
-            <w:r>
-              <w:rPr>
-                <w:rFonts w:ascii="Calibri" w:cs="Calibri" w:eastAsia="Calibri" w:hAnsi="Calibri"/>
                 <w:b w:val="false"/>
                 <w:bCs w:val="false"/>
                 <w:color w:val="1A1A1A"/>
@@ -2596,7 +2684,6 @@
         <w:tc>
           <w:tcPr>
             <w:tcW w:type="dxa" w:w="1550"/>
-            <w:shd w:fill="F5F5F5" w:val="clear"/>
             <w:tcMar>
               <w:top w:type="dxa" w:w="80"/>
               <w:left w:type="dxa" w:w="120"/>
@@ -2624,7 +2711,95 @@
         <w:tc>
           <w:tcPr>
             <w:tcW w:type="dxa" w:w="1550"/>
-            <w:shd w:fill="F5F5F5" w:val="clear"/>
+            <w:tcMar>
+              <w:top w:type="dxa" w:w="80"/>
+              <w:left w:type="dxa" w:w="120"/>
+              <w:bottom w:type="dxa" w:w="80"/>
+              <w:right w:type="dxa" w:w="120"/>
+            </w:tcMar>
+          </w:tcPr>
+          <w:p>
+            <w:pPr>
+              <w:jc w:val="center"/>
+            </w:pPr>
+            <w:r>
+              <w:rPr>
+                <w:rFonts w:ascii="Calibri" w:cs="Calibri" w:eastAsia="Calibri" w:hAnsi="Calibri"/>
+                <w:b w:val="false"/>
+                <w:bCs w:val="false"/>
+                <w:color w:val="1A1A1A"/>
+                <w:sz w:val="20"/>
+                <w:szCs w:val="20"/>
+              </w:rPr>
+              <w:t xml:space="preserve">✓</w:t>
+            </w:r>
+          </w:p>
+        </w:tc>
+      </w:tr>
+      <w:tr>
+        <w:trPr>
+          <w:tblHeader w:val="false"/>
+        </w:trPr>
+        <w:tc>
+          <w:tcPr>
+            <w:tcW w:type="dxa" w:w="6260"/>
+            <w:shd w:val="clear" w:fill="F5F5F5"/>
+            <w:tcMar>
+              <w:top w:type="dxa" w:w="80"/>
+              <w:left w:type="dxa" w:w="120"/>
+              <w:bottom w:type="dxa" w:w="80"/>
+              <w:right w:type="dxa" w:w="120"/>
+            </w:tcMar>
+          </w:tcPr>
+          <w:p>
+            <w:pPr>
+              <w:jc w:val="left"/>
+            </w:pPr>
+            <w:r>
+              <w:rPr>
+                <w:rFonts w:ascii="Calibri" w:cs="Calibri" w:eastAsia="Calibri" w:hAnsi="Calibri"/>
+                <w:b w:val="false"/>
+                <w:bCs w:val="false"/>
+                <w:color w:val="1A1A1A"/>
+                <w:sz w:val="20"/>
+                <w:szCs w:val="20"/>
+              </w:rPr>
+              <w:t xml:space="preserve">Editar la rutina: series, repeticiones, RIR, descanso, añadir y quitar ejercicios, cambiar patrón</w:t>
+            </w:r>
+          </w:p>
+        </w:tc>
+        <w:tc>
+          <w:tcPr>
+            <w:tcW w:type="dxa" w:w="1550"/>
+            <w:shd w:val="clear" w:fill="F5F5F5"/>
+            <w:tcMar>
+              <w:top w:type="dxa" w:w="80"/>
+              <w:left w:type="dxa" w:w="120"/>
+              <w:bottom w:type="dxa" w:w="80"/>
+              <w:right w:type="dxa" w:w="120"/>
+            </w:tcMar>
+          </w:tcPr>
+          <w:p>
+            <w:pPr>
+              <w:jc w:val="center"/>
+            </w:pPr>
+            <w:r>
+              <w:rPr>
+                <w:rFonts w:ascii="Calibri" w:cs="Calibri" w:eastAsia="Calibri" w:hAnsi="Calibri"/>
+                <w:b w:val="false"/>
+                <w:bCs w:val="false"/>
+                <w:color w:val="1A1A1A"/>
+                <w:sz w:val="20"/>
+                <w:szCs w:val="20"/>
+              </w:rPr>
+              <w:t xml:space="preserve">—</w:t>
+            </w:r>
+          </w:p>
+        </w:tc>
+        <w:tc>
+          <w:tcPr>
+            <w:tcW w:type="dxa" w:w="1550"/>
+            <w:shd w:val="clear" w:fill="F5F5F5"/>
             <w:tcMar>
               <w:top w:type="dxa" w:w="80"/>
               <w:left w:type="dxa" w:w="120"/>
@@ -2677,7 +2852,7 @@
                 <w:sz w:val="20"/>
                 <w:szCs w:val="20"/>
               </w:rPr>
-              <w:t xml:space="preserve">Editar la rutina: series, repeticiones, RIR, descanso, añadir y quitar ejercicios, cambiar patrón</w:t>
+              <w:t xml:space="preserve">Renombrar y reordenar sesiones y ejercicios</w:t>
             </w:r>
           </w:p>
         </w:tc>
@@ -2743,7 +2918,7 @@
         <w:tc>
           <w:tcPr>
             <w:tcW w:type="dxa" w:w="6260"/>
-            <w:shd w:fill="F5F5F5" w:val="clear"/>
+            <w:shd w:val="clear" w:fill="F5F5F5"/>
             <w:tcMar>
               <w:top w:type="dxa" w:w="80"/>
               <w:left w:type="dxa" w:w="120"/>
@@ -2764,14 +2939,14 @@
                 <w:sz w:val="20"/>
                 <w:szCs w:val="20"/>
               </w:rPr>
-              <w:t xml:space="preserve">Renombrar y reordenar sesiones y ejercicios</w:t>
+              <w:t xml:space="preserve">Crear ejercicios propios en la biblioteca, por repeticiones o por tiempo</w:t>
             </w:r>
           </w:p>
         </w:tc>
         <w:tc>
           <w:tcPr>
             <w:tcW w:type="dxa" w:w="1550"/>
-            <w:shd w:fill="F5F5F5" w:val="clear"/>
+            <w:shd w:val="clear" w:fill="F5F5F5"/>
             <w:tcMar>
               <w:top w:type="dxa" w:w="80"/>
               <w:left w:type="dxa" w:w="120"/>
@@ -2799,7 +2974,7 @@
         <w:tc>
           <w:tcPr>
             <w:tcW w:type="dxa" w:w="1550"/>
-            <w:shd w:fill="F5F5F5" w:val="clear"/>
+            <w:shd w:val="clear" w:fill="F5F5F5"/>
             <w:tcMar>
               <w:top w:type="dxa" w:w="80"/>
               <w:left w:type="dxa" w:w="120"/>
@@ -2852,7 +3027,7 @@
                 <w:sz w:val="20"/>
                 <w:szCs w:val="20"/>
               </w:rPr>
-              <w:t xml:space="preserve">Crear ejercicios propios en la biblioteca, por repeticiones o por tiempo</w:t>
+              <w:t xml:space="preserve">Rutinas PRO listas para entrenar</w:t>
             </w:r>
           </w:p>
         </w:tc>
@@ -2918,7 +3093,7 @@
         <w:tc>
           <w:tcPr>
             <w:tcW w:type="dxa" w:w="6260"/>
-            <w:shd w:fill="F5F5F5" w:val="clear"/>
+            <w:shd w:val="clear" w:fill="F5F5F5"/>
             <w:tcMar>
               <w:top w:type="dxa" w:w="80"/>
               <w:left w:type="dxa" w:w="120"/>
@@ -2939,14 +3114,14 @@
                 <w:sz w:val="20"/>
                 <w:szCs w:val="20"/>
               </w:rPr>
-              <w:t xml:space="preserve">Rutinas PRO listas para entrenar</w:t>
+              <w:t xml:space="preserve">Crear tu rutina con IA (cuestionario + prompt)</w:t>
             </w:r>
           </w:p>
         </w:tc>
         <w:tc>
           <w:tcPr>
             <w:tcW w:type="dxa" w:w="1550"/>
-            <w:shd w:fill="F5F5F5" w:val="clear"/>
+            <w:shd w:val="clear" w:fill="F5F5F5"/>
             <w:tcMar>
               <w:top w:type="dxa" w:w="80"/>
               <w:left w:type="dxa" w:w="120"/>
@@ -2974,7 +3149,7 @@
         <w:tc>
           <w:tcPr>
             <w:tcW w:type="dxa" w:w="1550"/>
-            <w:shd w:fill="F5F5F5" w:val="clear"/>
+            <w:shd w:val="clear" w:fill="F5F5F5"/>
             <w:tcMar>
               <w:top w:type="dxa" w:w="80"/>
               <w:left w:type="dxa" w:w="120"/>
@@ -3027,7 +3202,7 @@
                 <w:sz w:val="20"/>
                 <w:szCs w:val="20"/>
               </w:rPr>
-              <w:t xml:space="preserve">Crear tu rutina con IA (cuestionario + prompt)</w:t>
+              <w:t xml:space="preserve">Drop sets</w:t>
             </w:r>
           </w:p>
         </w:tc>
@@ -3093,7 +3268,7 @@
         <w:tc>
           <w:tcPr>
             <w:tcW w:type="dxa" w:w="6260"/>
-            <w:shd w:fill="F5F5F5" w:val="clear"/>
+            <w:shd w:val="clear" w:fill="F5F5F5"/>
             <w:tcMar>
               <w:top w:type="dxa" w:w="80"/>
               <w:left w:type="dxa" w:w="120"/>
@@ -3114,14 +3289,14 @@
                 <w:sz w:val="20"/>
                 <w:szCs w:val="20"/>
               </w:rPr>
-              <w:t xml:space="preserve">Drop sets</w:t>
+              <w:t xml:space="preserve">Superseries</w:t>
             </w:r>
           </w:p>
         </w:tc>
         <w:tc>
           <w:tcPr>
             <w:tcW w:type="dxa" w:w="1550"/>
-            <w:shd w:fill="F5F5F5" w:val="clear"/>
+            <w:shd w:val="clear" w:fill="F5F5F5"/>
             <w:tcMar>
               <w:top w:type="dxa" w:w="80"/>
               <w:left w:type="dxa" w:w="120"/>
@@ -3149,7 +3324,7 @@
         <w:tc>
           <w:tcPr>
             <w:tcW w:type="dxa" w:w="1550"/>
-            <w:shd w:fill="F5F5F5" w:val="clear"/>
+            <w:shd w:val="clear" w:fill="F5F5F5"/>
             <w:tcMar>
               <w:top w:type="dxa" w:w="80"/>
               <w:left w:type="dxa" w:w="120"/>
@@ -3202,7 +3377,7 @@
                 <w:sz w:val="20"/>
                 <w:szCs w:val="20"/>
               </w:rPr>
-              <w:t xml:space="preserve">Superseries</w:t>
+              <w:t xml:space="preserve">Rest-pause</w:t>
             </w:r>
           </w:p>
         </w:tc>
@@ -3268,7 +3443,7 @@
         <w:tc>
           <w:tcPr>
             <w:tcW w:type="dxa" w:w="6260"/>
-            <w:shd w:fill="F5F5F5" w:val="clear"/>
+            <w:shd w:val="clear" w:fill="F5F5F5"/>
             <w:tcMar>
               <w:top w:type="dxa" w:w="80"/>
               <w:left w:type="dxa" w:w="120"/>
@@ -3289,14 +3464,14 @@
                 <w:sz w:val="20"/>
                 <w:szCs w:val="20"/>
               </w:rPr>
-              <w:t xml:space="preserve">Rest-pause</w:t>
+              <w:t xml:space="preserve">Autorregulación: check-in diario, disponibilidad para entrenar y fatiga por zonas</w:t>
             </w:r>
           </w:p>
         </w:tc>
         <w:tc>
           <w:tcPr>
             <w:tcW w:type="dxa" w:w="1550"/>
-            <w:shd w:fill="F5F5F5" w:val="clear"/>
+            <w:shd w:val="clear" w:fill="F5F5F5"/>
             <w:tcMar>
               <w:top w:type="dxa" w:w="80"/>
               <w:left w:type="dxa" w:w="120"/>
@@ -3324,7 +3499,7 @@
         <w:tc>
           <w:tcPr>
             <w:tcW w:type="dxa" w:w="1550"/>
-            <w:shd w:fill="F5F5F5" w:val="clear"/>
+            <w:shd w:val="clear" w:fill="F5F5F5"/>
             <w:tcMar>
               <w:top w:type="dxa" w:w="80"/>
               <w:left w:type="dxa" w:w="120"/>
@@ -3377,7 +3552,7 @@
                 <w:sz w:val="20"/>
                 <w:szCs w:val="20"/>
               </w:rPr>
-              <w:t xml:space="preserve">Autorregulación: check-in diario, disponibilidad para entrenar y fatiga por zonas</w:t>
+              <w:t xml:space="preserve">VFC y frecuencia cardíaca en reposo</w:t>
             </w:r>
           </w:p>
         </w:tc>
@@ -3443,95 +3618,7 @@
         <w:tc>
           <w:tcPr>
             <w:tcW w:type="dxa" w:w="6260"/>
-            <w:shd w:fill="F5F5F5" w:val="clear"/>
-            <w:tcMar>
-              <w:top w:type="dxa" w:w="80"/>
-              <w:left w:type="dxa" w:w="120"/>
-              <w:bottom w:type="dxa" w:w="80"/>
-              <w:right w:type="dxa" w:w="120"/>
-            </w:tcMar>
-          </w:tcPr>
-          <w:p>
-            <w:pPr>
-              <w:jc w:val="left"/>
-            </w:pPr>
-            <w:r>
-              <w:rPr>
-                <w:rFonts w:ascii="Calibri" w:cs="Calibri" w:eastAsia="Calibri" w:hAnsi="Calibri"/>
-                <w:b w:val="false"/>
-                <w:bCs w:val="false"/>
-                <w:color w:val="1A1A1A"/>
-                <w:sz w:val="20"/>
-                <w:szCs w:val="20"/>
-              </w:rPr>
-              <w:t xml:space="preserve">VFC y frecuencia cardíaca en reposo</w:t>
-            </w:r>
-          </w:p>
-        </w:tc>
-        <w:tc>
-          <w:tcPr>
-            <w:tcW w:type="dxa" w:w="1550"/>
-            <w:shd w:fill="F5F5F5" w:val="clear"/>
-            <w:tcMar>
-              <w:top w:type="dxa" w:w="80"/>
-              <w:left w:type="dxa" w:w="120"/>
-              <w:bottom w:type="dxa" w:w="80"/>
-              <w:right w:type="dxa" w:w="120"/>
-            </w:tcMar>
-          </w:tcPr>
-          <w:p>
-            <w:pPr>
-              <w:jc w:val="center"/>
-            </w:pPr>
-            <w:r>
-              <w:rPr>
-                <w:rFonts w:ascii="Calibri" w:cs="Calibri" w:eastAsia="Calibri" w:hAnsi="Calibri"/>
-                <w:b w:val="false"/>
-                <w:bCs w:val="false"/>
-                <w:color w:val="1A1A1A"/>
-                <w:sz w:val="20"/>
-                <w:szCs w:val="20"/>
-              </w:rPr>
-              <w:t xml:space="preserve">—</w:t>
-            </w:r>
-          </w:p>
-        </w:tc>
-        <w:tc>
-          <w:tcPr>
-            <w:tcW w:type="dxa" w:w="1550"/>
-            <w:shd w:fill="F5F5F5" w:val="clear"/>
-            <w:tcMar>
-              <w:top w:type="dxa" w:w="80"/>
-              <w:left w:type="dxa" w:w="120"/>
-              <w:bottom w:type="dxa" w:w="80"/>
-              <w:right w:type="dxa" w:w="120"/>
-            </w:tcMar>
-          </w:tcPr>
-          <w:p>
-            <w:pPr>
-              <w:jc w:val="center"/>
-            </w:pPr>
-            <w:r>
-              <w:rPr>
-                <w:rFonts w:ascii="Calibri" w:cs="Calibri" w:eastAsia="Calibri" w:hAnsi="Calibri"/>
-                <w:b w:val="false"/>
-                <w:bCs w:val="false"/>
-                <w:color w:val="1A1A1A"/>
-                <w:sz w:val="20"/>
-                <w:szCs w:val="20"/>
-              </w:rPr>
-              <w:t xml:space="preserve">✓</w:t>
-            </w:r>
-          </w:p>
-        </w:tc>
-      </w:tr>
-      <w:tr>
-        <w:trPr>
-          <w:tblHeader w:val="false"/>
-        </w:trPr>
-        <w:tc>
-          <w:tcPr>
-            <w:tcW w:type="dxa" w:w="6260"/>
+            <w:shd w:val="clear" w:fill="F5F5F5"/>
             <w:tcMar>
               <w:top w:type="dxa" w:w="80"/>
               <w:left w:type="dxa" w:w="120"/>
@@ -3559,6 +3646,7 @@
         <w:tc>
           <w:tcPr>
             <w:tcW w:type="dxa" w:w="1550"/>
+            <w:shd w:val="clear" w:fill="F5F5F5"/>
             <w:tcMar>
               <w:top w:type="dxa" w:w="80"/>
               <w:left w:type="dxa" w:w="120"/>
@@ -3586,6 +3674,7 @@
         <w:tc>
           <w:tcPr>
             <w:tcW w:type="dxa" w:w="1550"/>
+            <w:shd w:val="clear" w:fill="F5F5F5"/>
             <w:tcMar>
               <w:top w:type="dxa" w:w="80"/>
               <w:left w:type="dxa" w:w="120"/>
@@ -3618,7 +3707,6 @@
         <w:tc>
           <w:tcPr>
             <w:tcW w:type="dxa" w:w="6260"/>
-            <w:shd w:fill="F5F5F5" w:val="clear"/>
             <w:tcMar>
               <w:top w:type="dxa" w:w="80"/>
               <w:left w:type="dxa" w:w="120"/>
@@ -3640,94 +3728,6 @@
                 <w:szCs w:val="20"/>
               </w:rPr>
               <w:t xml:space="preserve">Fase de la dieta (déficit / normocalórica / superávit)</w:t>
-            </w:r>
-          </w:p>
-        </w:tc>
-        <w:tc>
-          <w:tcPr>
-            <w:tcW w:type="dxa" w:w="1550"/>
-            <w:shd w:fill="F5F5F5" w:val="clear"/>
-            <w:tcMar>
-              <w:top w:type="dxa" w:w="80"/>
-              <w:left w:type="dxa" w:w="120"/>
-              <w:bottom w:type="dxa" w:w="80"/>
-              <w:right w:type="dxa" w:w="120"/>
-            </w:tcMar>
-          </w:tcPr>
-          <w:p>
-            <w:pPr>
-              <w:jc w:val="center"/>
-            </w:pPr>
-            <w:r>
-              <w:rPr>
-                <w:rFonts w:ascii="Calibri" w:cs="Calibri" w:eastAsia="Calibri" w:hAnsi="Calibri"/>
-                <w:b w:val="false"/>
-                <w:bCs w:val="false"/>
-                <w:color w:val="1A1A1A"/>
-                <w:sz w:val="20"/>
-                <w:szCs w:val="20"/>
-              </w:rPr>
-              <w:t xml:space="preserve">—</w:t>
-            </w:r>
-          </w:p>
-        </w:tc>
-        <w:tc>
-          <w:tcPr>
-            <w:tcW w:type="dxa" w:w="1550"/>
-            <w:shd w:fill="F5F5F5" w:val="clear"/>
-            <w:tcMar>
-              <w:top w:type="dxa" w:w="80"/>
-              <w:left w:type="dxa" w:w="120"/>
-              <w:bottom w:type="dxa" w:w="80"/>
-              <w:right w:type="dxa" w:w="120"/>
-            </w:tcMar>
-          </w:tcPr>
-          <w:p>
-            <w:pPr>
-              <w:jc w:val="center"/>
-            </w:pPr>
-            <w:r>
-              <w:rPr>
-                <w:rFonts w:ascii="Calibri" w:cs="Calibri" w:eastAsia="Calibri" w:hAnsi="Calibri"/>
-                <w:b w:val="false"/>
-                <w:bCs w:val="false"/>
-                <w:color w:val="1A1A1A"/>
-                <w:sz w:val="20"/>
-                <w:szCs w:val="20"/>
-              </w:rPr>
-              <w:t xml:space="preserve">✓</w:t>
-            </w:r>
-          </w:p>
-        </w:tc>
-      </w:tr>
-      <w:tr>
-        <w:trPr>
-          <w:tblHeader w:val="false"/>
-        </w:trPr>
-        <w:tc>
-          <w:tcPr>
-            <w:tcW w:type="dxa" w:w="6260"/>
-            <w:tcMar>
-              <w:top w:type="dxa" w:w="80"/>
-              <w:left w:type="dxa" w:w="120"/>
-              <w:bottom w:type="dxa" w:w="80"/>
-              <w:right w:type="dxa" w:w="120"/>
-            </w:tcMar>
-          </w:tcPr>
-          <w:p>
-            <w:pPr>
-              <w:jc w:val="left"/>
-            </w:pPr>
-            <w:r>
-              <w:rPr>
-                <w:rFonts w:ascii="Calibri" w:cs="Calibri" w:eastAsia="Calibri" w:hAnsi="Calibri"/>
-                <w:b w:val="false"/>
-                <w:bCs w:val="false"/>
-                <w:color w:val="1A1A1A"/>
-                <w:sz w:val="20"/>
-                <w:szCs w:val="20"/>
-              </w:rPr>
-              <w:t xml:space="preserve">Prueba de reordenación por estancamiento</w:t>
             </w:r>
           </w:p>
         </w:tc>
@@ -3793,7 +3793,7 @@
         <w:tc>
           <w:tcPr>
             <w:tcW w:type="dxa" w:w="6260"/>
-            <w:shd w:fill="F5F5F5" w:val="clear"/>
+            <w:shd w:val="clear" w:fill="F5F5F5"/>
             <w:tcMar>
               <w:top w:type="dxa" w:w="80"/>
               <w:left w:type="dxa" w:w="120"/>
@@ -3814,14 +3814,14 @@
                 <w:sz w:val="20"/>
                 <w:szCs w:val="20"/>
               </w:rPr>
-              <w:t xml:space="preserve">Modo descarga manual y descarga sugerida</w:t>
+              <w:t xml:space="preserve">Prueba de reordenación por estancamiento</w:t>
             </w:r>
           </w:p>
         </w:tc>
         <w:tc>
           <w:tcPr>
             <w:tcW w:type="dxa" w:w="1550"/>
-            <w:shd w:fill="F5F5F5" w:val="clear"/>
+            <w:shd w:val="clear" w:fill="F5F5F5"/>
             <w:tcMar>
               <w:top w:type="dxa" w:w="80"/>
               <w:left w:type="dxa" w:w="120"/>
@@ -3849,7 +3849,7 @@
         <w:tc>
           <w:tcPr>
             <w:tcW w:type="dxa" w:w="1550"/>
-            <w:shd w:fill="F5F5F5" w:val="clear"/>
+            <w:shd w:val="clear" w:fill="F5F5F5"/>
             <w:tcMar>
               <w:top w:type="dxa" w:w="80"/>
               <w:left w:type="dxa" w:w="120"/>
@@ -3902,7 +3902,7 @@
                 <w:sz w:val="20"/>
                 <w:szCs w:val="20"/>
               </w:rPr>
-              <w:t xml:space="preserve">Informe mensual, con su apartado de cardio</w:t>
+              <w:t xml:space="preserve">Modo descarga manual y descarga sugerida</w:t>
             </w:r>
           </w:p>
         </w:tc>
@@ -3968,7 +3968,7 @@
         <w:tc>
           <w:tcPr>
             <w:tcW w:type="dxa" w:w="6260"/>
-            <w:shd w:fill="F5F5F5" w:val="clear"/>
+            <w:shd w:val="clear" w:fill="F5F5F5"/>
             <w:tcMar>
               <w:top w:type="dxa" w:w="80"/>
               <w:left w:type="dxa" w:w="120"/>
@@ -3989,14 +3989,14 @@
                 <w:sz w:val="20"/>
                 <w:szCs w:val="20"/>
               </w:rPr>
-              <w:t>Evolución corporal: gráficas de tus medidas, comparador de fotos (encuadre, igualar luz, blanco y negro) y vídeo de progreso</w:t>
+              <w:t xml:space="preserve">Informe mensual, con su apartado de cardio</w:t>
             </w:r>
           </w:p>
         </w:tc>
         <w:tc>
           <w:tcPr>
             <w:tcW w:type="dxa" w:w="1550"/>
-            <w:shd w:fill="F5F5F5" w:val="clear"/>
+            <w:shd w:val="clear" w:fill="F5F5F5"/>
             <w:tcMar>
               <w:top w:type="dxa" w:w="80"/>
               <w:left w:type="dxa" w:w="120"/>
@@ -4024,7 +4024,7 @@
         <w:tc>
           <w:tcPr>
             <w:tcW w:type="dxa" w:w="1550"/>
-            <w:shd w:fill="F5F5F5" w:val="clear"/>
+            <w:shd w:val="clear" w:fill="F5F5F5"/>
             <w:tcMar>
               <w:top w:type="dxa" w:w="80"/>
               <w:left w:type="dxa" w:w="120"/>
@@ -4071,11 +4071,13 @@
             <w:r>
               <w:rPr>
                 <w:rFonts w:ascii="Calibri" w:cs="Calibri" w:eastAsia="Calibri" w:hAnsi="Calibri"/>
+                <w:b w:val="false"/>
+                <w:bCs w:val="false"/>
                 <w:color w:val="1A1A1A"/>
                 <w:sz w:val="20"/>
                 <w:szCs w:val="20"/>
               </w:rPr>
-              <w:t>Pestaña Nutrición: dos formas de seguir la pauta (alimentación habitual u objetivo de calorías), peso-tendencia, cómo vas frente a lo pactado, revisión semanal, planificador de temporada, % de grasa, alimentos, vigilante de rendimiento, gasto estimado, reparto en comidas y menú semanal con IA</w:t>
+              <w:t>Evolución corporal: gráficas de tus medidas, comparador de fotos (encuadre, igualar luz, blanco y negro) y vídeo de progreso</w:t>
             </w:r>
           </w:p>
         </w:tc>
@@ -4134,6 +4136,93 @@
           </w:p>
         </w:tc>
       </w:tr>
+      <w:tr>
+        <w:trPr>
+          <w:tblHeader w:val="false"/>
+        </w:trPr>
+        <w:tc>
+          <w:tcPr>
+            <w:tcW w:type="dxa" w:w="6260"/>
+            <w:shd w:val="clear" w:fill="F5F5F5"/>
+            <w:tcMar>
+              <w:top w:type="dxa" w:w="80"/>
+              <w:left w:type="dxa" w:w="120"/>
+              <w:bottom w:type="dxa" w:w="80"/>
+              <w:right w:type="dxa" w:w="120"/>
+            </w:tcMar>
+          </w:tcPr>
+          <w:p>
+            <w:pPr>
+              <w:jc w:val="left"/>
+            </w:pPr>
+            <w:r>
+              <w:rPr>
+                <w:rFonts w:ascii="Calibri" w:cs="Calibri" w:eastAsia="Calibri" w:hAnsi="Calibri"/>
+                <w:color w:val="1A1A1A"/>
+                <w:sz w:val="20"/>
+                <w:szCs w:val="20"/>
+              </w:rPr>
+              <w:t>Pestaña Nutrición: dos formas de seguir la pauta (alimentación habitual u objetivo de calorías), peso-tendencia, cómo vas frente a lo pactado, revisión semanal, planificador de temporada, % de grasa, alimentos, vigilante de rendimiento, gasto estimado, reparto en comidas y menú semanal con IA</w:t>
+            </w:r>
+          </w:p>
+        </w:tc>
+        <w:tc>
+          <w:tcPr>
+            <w:tcW w:type="dxa" w:w="1550"/>
+            <w:shd w:val="clear" w:fill="F5F5F5"/>
+            <w:tcMar>
+              <w:top w:type="dxa" w:w="80"/>
+              <w:left w:type="dxa" w:w="120"/>
+              <w:bottom w:type="dxa" w:w="80"/>
+              <w:right w:type="dxa" w:w="120"/>
+            </w:tcMar>
+          </w:tcPr>
+          <w:p>
+            <w:pPr>
+              <w:jc w:val="center"/>
+            </w:pPr>
+            <w:r>
+              <w:rPr>
+                <w:rFonts w:ascii="Calibri" w:cs="Calibri" w:eastAsia="Calibri" w:hAnsi="Calibri"/>
+                <w:b w:val="false"/>
+                <w:bCs w:val="false"/>
+                <w:color w:val="1A1A1A"/>
+                <w:sz w:val="20"/>
+                <w:szCs w:val="20"/>
+              </w:rPr>
+              <w:t xml:space="preserve">—</w:t>
+            </w:r>
+          </w:p>
+        </w:tc>
+        <w:tc>
+          <w:tcPr>
+            <w:tcW w:type="dxa" w:w="1550"/>
+            <w:shd w:val="clear" w:fill="F5F5F5"/>
+            <w:tcMar>
+              <w:top w:type="dxa" w:w="80"/>
+              <w:left w:type="dxa" w:w="120"/>
+              <w:bottom w:type="dxa" w:w="80"/>
+              <w:right w:type="dxa" w:w="120"/>
+            </w:tcMar>
+          </w:tcPr>
+          <w:p>
+            <w:pPr>
+              <w:jc w:val="center"/>
+            </w:pPr>
+            <w:r>
+              <w:rPr>
+                <w:rFonts w:ascii="Calibri" w:cs="Calibri" w:eastAsia="Calibri" w:hAnsi="Calibri"/>
+                <w:b w:val="false"/>
+                <w:bCs w:val="false"/>
+                <w:color w:val="1A1A1A"/>
+                <w:sz w:val="20"/>
+                <w:szCs w:val="20"/>
+              </w:rPr>
+              <w:t xml:space="preserve">✓</w:t>
+            </w:r>
+          </w:p>
+        </w:tc>
+      </w:tr>
     </w:tbl>
     <w:p>
       <w:pPr>
@@ -4943,7 +5032,7 @@
           <w:sz w:val="22"/>
           <w:szCs w:val="22"/>
         </w:rPr>
-        <w:t>Se abre con el icono de ajustes (arriba a la derecha). Es un índice de categorías repartidas en tres bloques —Tu entrenamiento, Seguimiento y La app—; cada línea muestra su valor actual. Al pie figura la versión de la app. La pantalla TrueLift PRO —estado de la prueba o compra, web, descarga del manual, app de escritorio, contacto, política de privacidad y autor— no se abre desde aquí, sino con el botón PRO de la barra superior (sección 5). Dos decisiones que antes vivían aquí se toman ahora desde la pestaña Rutina, que es donde se miran: el material disponible y la semana de descarga.</w:t>
+        <w:t>Se abre con el icono de ajustes (arriba a la derecha). Es un índice de categorías repartidas en cuatro bloques —Tu entrenamiento, Seguimiento, Compartir y La app—; cada línea muestra su valor actual. Al pie figura la versión de la app. La pantalla TrueLift PRO —estado de la prueba o compra, web, descarga del manual, app de escritorio, contacto, política de privacidad y autor— no se abre desde aquí, sino con el botón PRO de la barra superior (sección 5). Dos decisiones que antes vivían aquí se toman ahora desde la pestaña Rutina, que es donde se miran: el material disponible y la semana de descarga.</w:t>
       </w:r>
     </w:p>
     <w:p>
@@ -5371,7 +5460,7 @@
           <w:sz w:val="22"/>
           <w:szCs w:val="22"/>
         </w:rPr>
-        <w:t xml:space="preserve"> (gratis, activado de serie): mientras entrenas, celebra con un cartel y sonido cada récord y cada nivel de fuerza nuevo (sección 7). Apágalo si prefieres entrenar sin interrupciones; el resumen al guardar la sesión los sigue citando.</w:t>
+        <w:t xml:space="preserve"> (gratis, activado de serie): mientras entrenas, celebra cada récord y cada nivel de fuerza nuevo con una animación a pantalla completa y su música, que puedes compartir como imagen o como vídeo (sección 7). Apágalo si prefieres entrenar sin interrupciones; el resumen al guardar la sesión los sigue citando.</w:t>
       </w:r>
     </w:p>
     <w:p>
@@ -5761,6 +5850,39 @@
           <w:szCs w:val="22"/>
         </w:rPr>
         <w:t>El modo descarga ya no se activa aquí: vive en la pestaña Rutina → Herramientas de rutina → Semana de descarga (PRO, sección 12). No es una preferencia, sino una decisión sobre cómo entrenas esta semana, y ese es el sitio donde se toma.</w:t>
+      </w:r>
+    </w:p>
+    <w:p>
+      <w:pPr>
+        <w:pStyle w:val="Heading2"/>
+        <w:spacing w:after="140" w:before="240"/>
+      </w:pPr>
+      <w:r>
+        <w:rPr>
+          <w:rFonts w:ascii="Calibri" w:cs="Calibri" w:eastAsia="Calibri" w:hAnsi="Calibri"/>
+          <w:b/>
+          <w:bCs/>
+          <w:color w:val="1A1A1A"/>
+          <w:sz w:val="25"/>
+          <w:szCs w:val="25"/>
+        </w:rPr>
+        <w:t xml:space="preserve">Compartir</w:t>
+      </w:r>
+    </w:p>
+    <w:p>
+      <w:pPr>
+        <w:spacing w:after="160" w:line="276"/>
+      </w:pPr>
+      <w:r>
+        <w:rPr>
+          <w:rFonts w:ascii="Calibri" w:cs="Calibri" w:eastAsia="Calibri" w:hAnsi="Calibri"/>
+          <w:b w:val="0"/>
+          <w:bCs w:val="false"/>
+          <w:color w:val="1A1A1A"/>
+          <w:sz w:val="22"/>
+          <w:szCs w:val="22"/>
+        </w:rPr>
+        <w:t xml:space="preserve">Conecta TrueLift con tu cuenta de Strava para publicar en ella tus sesiones de fuerza, a mano o automáticamente, y únete al club TrueLift. Sin cuenta conectada verás el botón Connect with Strava; con ella, Conectado como y tu nombre, los interruptores Publicar mis sesiones automáticamente, Incluir los pesos e Incluir los récords, y Desconectar. La fila Únete al club TrueLift en Strava está siempre. Es gratis y no aparece en el modo DEMO. Todo se explica en la sección 18.</w:t>
       </w:r>
     </w:p>
     <w:p>
@@ -8491,7 +8613,7 @@
           <w:sz w:val="22"/>
           <w:szCs w:val="22"/>
         </w:rPr>
-        <w:t xml:space="preserve"> Si al completar un ejercicio principal superas tu mejor 1RM estimado, aparece un cartel dorado con aplausos. Y la primera vez que alcanzas un nivel de fuerza —en un ejercicio o en un grupo muscular— sale un cartel propio, con el color de ese nivel y su sonido; si la misma serie sube también algún grupo, se citan debajo. Si coinciden, el del nivel espera a que acabe el del récord. Solo se celebra lo conseguido en un día en verde, y no cuentan los ejercicios hechos con molestias ni los cambiados solo por hoy; un nivel que ya tuviste y recuperas no se vuelve a celebrar. Se apagan en Ajustes → Durante la sesión → Avisos de récords y niveles.</w:t>
+        <w:t xml:space="preserve"> Si al completar un ejercicio principal superas tu mejor 1RM estimado, la pantalla se llena con una animación de TrueLift, con su música y una vibración: ¡NUEVO RÉCORD!, el dibujo del ejercicio, su nombre y tu nuevo 1RM estimado. Y la primera vez que alcanzas un nivel de fuerza —en un ejercicio o en un grupo muscular— sale una animación propia, teñida del color de ese nivel, con una medalla que lleva grabados el título, el dibujo del ejercicio y su nombre (o el grupo muscular); su música crece con el nivel, y cada nivel suma instrumentos al anterior. Si la misma serie sube también otros niveles, aparecen debajo, en También subes. Si coinciden, el del nivel espera a que cierres el del récord. Al terminar la animación aparecen Cerrar y Compartir: puedes mandarla como Imagen o como Vídeo, con la animación y la música (sección 18). Solo se celebra lo conseguido en un día en verde, y no cuentan los ejercicios hechos con molestias ni los cambiados solo por hoy; un nivel que ya tuviste y recuperas no se vuelve a celebrar. Se apagan en Ajustes → Durante la sesión → Avisos de récords y niveles.</w:t>
       </w:r>
     </w:p>
     <w:p>
@@ -9577,7 +9699,7 @@
           <w:sz w:val="22"/>
           <w:szCs w:val="22"/>
         </w:rPr>
-        <w:t xml:space="preserve">Las sesiones recientes, cada una con Compartir (imagen para redes, sección 18), Editar (peso, repeticiones, RIR, observaciones, fecha, ejercicios no realizados y ejercicios hechos con molestias) y Eliminar. En los ejercicios con carga por serie, la edición muestra una fila por serie titulada Top / Drop 1 / Drop 2… Con PRO, cada sesión lleva su luz: verde, ámbar («Sesión con intensidad modulada») o roja («Sesión con intensidad y volumen modulados»); si ese día la disponibilidad se repartió por trenes, la franja lo dice («Tren inferior limitado · Tren superior sin limitaciones»). Si registraste en tiempo real, aparece la duración.</w:t>
+        <w:t>Las sesiones recientes, cada una con Compartir (imagen para redes, sección 18), Publicar en Strava (si has conectado tu cuenta, sección 18), Editar (peso, repeticiones, RIR, observaciones, fecha, ejercicios no realizados y ejercicios hechos con molestias) y Eliminar. En los ejercicios con carga por serie, la edición muestra una fila por serie titulada Top / Drop 1 / Drop 2… Con PRO, cada sesión lleva su luz: verde, ámbar («Sesión con intensidad modulada») o roja («Sesión con intensidad y volumen modulados»); si ese día la disponibilidad se repartió por trenes, la franja lo dice («Tren inferior limitado · Tren superior sin limitaciones»). Si registraste en tiempo real, aparece la duración.</w:t>
       </w:r>
     </w:p>
     <w:p>
@@ -18442,6 +18564,38 @@
         <w:rPr>
           <w:rFonts w:ascii="Calibri" w:cs="Calibri" w:eastAsia="Calibri" w:hAnsi="Calibri"/>
           <w:b/>
+          <w:bCs/>
+          <w:color w:val="1A1A1A"/>
+          <w:sz w:val="22"/>
+          <w:szCs w:val="22"/>
+        </w:rPr>
+        <w:t xml:space="preserve">Récord y nivel nuevo:</w:t>
+      </w:r>
+      <w:r>
+        <w:rPr>
+          <w:rFonts w:ascii="Calibri" w:cs="Calibri" w:eastAsia="Calibri" w:hAnsi="Calibri"/>
+          <w:b w:val="false"/>
+          <w:bCs w:val="false"/>
+          <w:color w:val="1A1A1A"/>
+          <w:sz w:val="22"/>
+          <w:szCs w:val="22"/>
+        </w:rPr>
+        <w:t xml:space="preserve"> al acabar la animación de un récord o de un nivel de fuerza nuevo (sección 7), Compartir te deja elegir Imagen —la pantalla final, con el ejercicio y su cifra o el nivel alcanzado— o Vídeo, la animación entera con su música, en MP4. El vídeo se crea en tu móvil en unos segundos; mientras, verás Creando el vídeo… con la opción Cancelar. Los dos llevan la marca TrueLift y el fondo oscuro.</w:t>
+      </w:r>
+    </w:p>
+    <w:p>
+      <w:pPr>
+        <w:pStyle w:val="ListParagraph"/>
+        <w:numPr>
+          <w:ilvl w:val="0"/>
+          <w:numId w:val="2"/>
+        </w:numPr>
+        <w:spacing w:after="100" w:line="276"/>
+      </w:pPr>
+      <w:r>
+        <w:rPr>
+          <w:rFonts w:ascii="Calibri" w:cs="Calibri" w:eastAsia="Calibri" w:hAnsi="Calibri"/>
+          <w:b/>
           <w:color w:val="1A1A1A"/>
           <w:sz w:val="22"/>
           <w:szCs w:val="22"/>
@@ -18519,6 +18673,343 @@
           <w:szCs w:val="22"/>
         </w:rPr>
         <w:t xml:space="preserve"> (PRO): desde Progreso, en HTML, para compartir o archivar.</w:t>
+      </w:r>
+    </w:p>
+    <w:p>
+      <w:pPr>
+        <w:pStyle w:val="Heading2"/>
+        <w:spacing w:after="140" w:before="240"/>
+      </w:pPr>
+      <w:r>
+        <w:rPr>
+          <w:rFonts w:ascii="Calibri" w:cs="Calibri" w:eastAsia="Calibri" w:hAnsi="Calibri"/>
+          <w:b/>
+          <w:bCs/>
+          <w:color w:val="1A1A1A"/>
+          <w:sz w:val="25"/>
+          <w:szCs w:val="25"/>
+        </w:rPr>
+        <w:t xml:space="preserve">Compartir en Strava</w:t>
+      </w:r>
+    </w:p>
+    <w:p>
+      <w:pPr>
+        <w:spacing w:after="160" w:line="276"/>
+      </w:pPr>
+      <w:r>
+        <w:rPr>
+          <w:rFonts w:ascii="Calibri" w:cs="Calibri" w:eastAsia="Calibri" w:hAnsi="Calibri"/>
+          <w:b w:val="0"/>
+          <w:bCs w:val="false"/>
+          <w:color w:val="1A1A1A"/>
+          <w:sz w:val="22"/>
+          <w:szCs w:val="22"/>
+        </w:rPr>
+        <w:t xml:space="preserve">Si usas Strava, TrueLift puede publicar en tu cuenta un resumen de cada sesión de fuerza como una actividad de Entrenamiento con pesas. Así la ven quienes te siguen y el club TrueLift, con sus kudos y sus comentarios: todo lo social ocurre en Strava. Es gratis, también sin PRO. TrueLift no importa nada de Strava ni guarda tus datos en ningún servidor: solo publica lo que tú decides.</w:t>
+      </w:r>
+    </w:p>
+    <w:p>
+      <w:pPr>
+        <w:pStyle w:val="ListParagraph"/>
+        <w:numPr>
+          <w:ilvl w:val="0"/>
+          <w:numId w:val="2"/>
+        </w:numPr>
+        <w:spacing w:after="100" w:line="276"/>
+      </w:pPr>
+      <w:r>
+        <w:rPr>
+          <w:rFonts w:ascii="Calibri" w:cs="Calibri" w:eastAsia="Calibri" w:hAnsi="Calibri"/>
+          <w:b/>
+          <w:bCs/>
+          <w:color w:val="1A1A1A"/>
+          <w:sz w:val="22"/>
+          <w:szCs w:val="22"/>
+        </w:rPr>
+        <w:t xml:space="preserve">Conectar:</w:t>
+      </w:r>
+      <w:r>
+        <w:rPr>
+          <w:rFonts w:ascii="Calibri" w:cs="Calibri" w:eastAsia="Calibri" w:hAnsi="Calibri"/>
+          <w:b w:val="false"/>
+          <w:bCs w:val="false"/>
+          <w:color w:val="1A1A1A"/>
+          <w:sz w:val="22"/>
+          <w:szCs w:val="22"/>
+        </w:rPr>
+        <w:t xml:space="preserve"> en Ajustes → Compartir, toca Connect with Strava, entra en tu cuenta y autoriza a TrueLift. Deja marcados los dos permisos: el de subir actividades, sin el que no se puede publicar, y el de ver tus actividades, que sirve para no duplicar lo que ya subió tu reloj. Al volver, Ajustes dice Conectado como y tu nombre. Desconectar retira el acceso a TrueLift; si en ese momento no tienes internet, la cuenta se desconecta igual en el móvil y puedes retirar el acceso después desde strava.com.</w:t>
+      </w:r>
+    </w:p>
+    <w:p>
+      <w:pPr>
+        <w:pStyle w:val="ListParagraph"/>
+        <w:numPr>
+          <w:ilvl w:val="0"/>
+          <w:numId w:val="2"/>
+        </w:numPr>
+        <w:spacing w:after="100" w:line="276"/>
+      </w:pPr>
+      <w:r>
+        <w:rPr>
+          <w:rFonts w:ascii="Calibri" w:cs="Calibri" w:eastAsia="Calibri" w:hAnsi="Calibri"/>
+          <w:b/>
+          <w:bCs/>
+          <w:color w:val="1A1A1A"/>
+          <w:sz w:val="22"/>
+          <w:szCs w:val="22"/>
+        </w:rPr>
+        <w:t xml:space="preserve">Publicar una sesión:</w:t>
+      </w:r>
+      <w:r>
+        <w:rPr>
+          <w:rFonts w:ascii="Calibri" w:cs="Calibri" w:eastAsia="Calibri" w:hAnsi="Calibri"/>
+          <w:b w:val="false"/>
+          <w:bCs w:val="false"/>
+          <w:color w:val="1A1A1A"/>
+          <w:sz w:val="22"/>
+          <w:szCs w:val="22"/>
+        </w:rPr>
+        <w:t xml:space="preserve"> en el historial, cada sesión de fuerza lleva Publicar en Strava. Antes de enviar ves el título y el texto exactos que se publicarán; la primera vez, además, la app te explica qué se envía y que quién lo ve depende de la privacidad de tu cuenta de Strava. Al publicar aparece Publicada en Strava con Ver, y el botón pasa a ser Ver en Strava. No aparece en el cardio, en las sesiones importadas de Hevy o Strong ni en el modo DEMO.</w:t>
+      </w:r>
+    </w:p>
+    <w:p>
+      <w:pPr>
+        <w:pStyle w:val="ListParagraph"/>
+        <w:numPr>
+          <w:ilvl w:val="0"/>
+          <w:numId w:val="2"/>
+        </w:numPr>
+        <w:spacing w:after="100" w:line="276"/>
+      </w:pPr>
+      <w:r>
+        <w:rPr>
+          <w:rFonts w:ascii="Calibri" w:cs="Calibri" w:eastAsia="Calibri" w:hAnsi="Calibri"/>
+          <w:b/>
+          <w:bCs/>
+          <w:color w:val="1A1A1A"/>
+          <w:sz w:val="22"/>
+          <w:szCs w:val="22"/>
+        </w:rPr>
+        <w:t xml:space="preserve">Qué se publica:</w:t>
+      </w:r>
+      <w:r>
+        <w:rPr>
+          <w:rFonts w:ascii="Calibri" w:cs="Calibri" w:eastAsia="Calibri" w:hAnsi="Calibri"/>
+          <w:b w:val="false"/>
+          <w:bCs w:val="false"/>
+          <w:color w:val="1A1A1A"/>
+          <w:sz w:val="22"/>
+          <w:szCs w:val="22"/>
+        </w:rPr>
+        <w:t xml:space="preserve"> como título, el día de tu rutina seguido de · TrueLift, con la hora y la duración de la sesión. El texto empieza con la duración, los ejercicios, las series y el volumen total; sigue un bloque por ejercicio con sus series (peso × repeticiones) y el RIR de cada serie, después tus récords personales de esa sesión y, al final, Registrado con TrueLift · truelift.es. En una sesión muy larga, los últimos ejercicios se resumen en una línea. Strava no admite fotos ni formato desde otras apps, así que el texto se ordena con saltos de línea y emojis.</w:t>
+      </w:r>
+    </w:p>
+    <w:p>
+      <w:pPr>
+        <w:pStyle w:val="ListParagraph"/>
+        <w:numPr>
+          <w:ilvl w:val="0"/>
+          <w:numId w:val="2"/>
+        </w:numPr>
+        <w:spacing w:after="100" w:line="276"/>
+      </w:pPr>
+      <w:r>
+        <w:rPr>
+          <w:rFonts w:ascii="Calibri" w:cs="Calibri" w:eastAsia="Calibri" w:hAnsi="Calibri"/>
+          <w:b/>
+          <w:bCs/>
+          <w:color w:val="1A1A1A"/>
+          <w:sz w:val="22"/>
+          <w:szCs w:val="22"/>
+        </w:rPr>
+        <w:t xml:space="preserve">Publicar mis sesiones automáticamente</w:t>
+      </w:r>
+      <w:r>
+        <w:rPr>
+          <w:rFonts w:ascii="Calibri" w:cs="Calibri" w:eastAsia="Calibri" w:hAnsi="Calibri"/>
+          <w:b w:val="false"/>
+          <w:bCs w:val="false"/>
+          <w:color w:val="1A1A1A"/>
+          <w:sz w:val="22"/>
+          <w:szCs w:val="22"/>
+        </w:rPr>
+        <w:t xml:space="preserve"> (apagado de serie): cada sesión de fuerza que guardes se publica sola, sin hacerte esperar, y un aviso te dice Publicada en Strava. Si no hay conexión, el aviso dice Se publicará en Strava cuando haya conexión: queda pendiente en el móvil y sale sola en cuanto se pueda. Al encenderlo por primera vez te pide el mismo consentimiento que la primera publicación a mano.</w:t>
+      </w:r>
+    </w:p>
+    <w:p>
+      <w:pPr>
+        <w:pStyle w:val="ListParagraph"/>
+        <w:numPr>
+          <w:ilvl w:val="0"/>
+          <w:numId w:val="2"/>
+        </w:numPr>
+        <w:spacing w:after="100" w:line="276"/>
+      </w:pPr>
+      <w:r>
+        <w:rPr>
+          <w:rFonts w:ascii="Calibri" w:cs="Calibri" w:eastAsia="Calibri" w:hAnsi="Calibri"/>
+          <w:b/>
+          <w:bCs/>
+          <w:color w:val="1A1A1A"/>
+          <w:sz w:val="22"/>
+          <w:szCs w:val="22"/>
+        </w:rPr>
+        <w:t xml:space="preserve">Incluir los pesos e Incluir los récords</w:t>
+      </w:r>
+      <w:r>
+        <w:rPr>
+          <w:rFonts w:ascii="Calibri" w:cs="Calibri" w:eastAsia="Calibri" w:hAnsi="Calibri"/>
+          <w:b w:val="false"/>
+          <w:bCs w:val="false"/>
+          <w:color w:val="1A1A1A"/>
+          <w:sz w:val="22"/>
+          <w:szCs w:val="22"/>
+        </w:rPr>
+        <w:t xml:space="preserve"> (activados de serie): valen para las dos formas de publicar. Sin los pesos, el texto lleva las repeticiones y el RIR, pero no los kilos ni el volumen total; sin los récords, no los cita.</w:t>
+      </w:r>
+    </w:p>
+    <w:p>
+      <w:pPr>
+        <w:pStyle w:val="ListParagraph"/>
+        <w:numPr>
+          <w:ilvl w:val="0"/>
+          <w:numId w:val="2"/>
+        </w:numPr>
+        <w:spacing w:after="100" w:line="276"/>
+      </w:pPr>
+      <w:r>
+        <w:rPr>
+          <w:rFonts w:ascii="Calibri" w:cs="Calibri" w:eastAsia="Calibri" w:hAnsi="Calibri"/>
+          <w:b/>
+          <w:bCs/>
+          <w:color w:val="1A1A1A"/>
+          <w:sz w:val="22"/>
+          <w:szCs w:val="22"/>
+        </w:rPr>
+        <w:t xml:space="preserve">Si tu reloj ya sube tus entrenos:</w:t>
+      </w:r>
+      <w:r>
+        <w:rPr>
+          <w:rFonts w:ascii="Calibri" w:cs="Calibri" w:eastAsia="Calibri" w:hAnsi="Calibri"/>
+          <w:b w:val="false"/>
+          <w:bCs w:val="false"/>
+          <w:color w:val="1A1A1A"/>
+          <w:sz w:val="22"/>
+          <w:szCs w:val="22"/>
+        </w:rPr>
+        <w:t xml:space="preserve"> TrueLift no crea una actividad repetida. Al publicar a mano te avisa (Ya tienes en Strava «…» a esa hora) y eliges Añadir a esa o Crear otra; en automático, añade el resumen a la actividad del reloj y te lo dice: Resumen añadido a tu actividad de Strava. El nombre que puso el reloj se respeta. Si al conectar desmarcaste el permiso de ver tus actividades, TrueLift no puede comprobarlo y Ajustes te avisa de que saldrían dos veces: desconecta y vuelve a conectar con ese permiso, o deja la publicación automática apagada.</w:t>
+      </w:r>
+    </w:p>
+    <w:p>
+      <w:pPr>
+        <w:pStyle w:val="ListParagraph"/>
+        <w:numPr>
+          <w:ilvl w:val="0"/>
+          <w:numId w:val="2"/>
+        </w:numPr>
+        <w:spacing w:after="100" w:line="276"/>
+      </w:pPr>
+      <w:r>
+        <w:rPr>
+          <w:rFonts w:ascii="Calibri" w:cs="Calibri" w:eastAsia="Calibri" w:hAnsi="Calibri"/>
+          <w:b/>
+          <w:bCs/>
+          <w:color w:val="1A1A1A"/>
+          <w:sz w:val="22"/>
+          <w:szCs w:val="22"/>
+        </w:rPr>
+        <w:t xml:space="preserve">Editar y borrar:</w:t>
+      </w:r>
+      <w:r>
+        <w:rPr>
+          <w:rFonts w:ascii="Calibri" w:cs="Calibri" w:eastAsia="Calibri" w:hAnsi="Calibri"/>
+          <w:b w:val="false"/>
+          <w:bCs w:val="false"/>
+          <w:color w:val="1A1A1A"/>
+          <w:sz w:val="22"/>
+          <w:szCs w:val="22"/>
+        </w:rPr>
+        <w:t xml:space="preserve"> si editas una sesión ya publicada, su texto en Strava se actualiza solo. Strava no deja que otras apps borren actividades: al eliminar una sesión publicada, la app te lo recuerda y te ofrece Abrir en Strava para borrarla allí.</w:t>
+      </w:r>
+    </w:p>
+    <w:p>
+      <w:pPr>
+        <w:pStyle w:val="ListParagraph"/>
+        <w:numPr>
+          <w:ilvl w:val="0"/>
+          <w:numId w:val="2"/>
+        </w:numPr>
+        <w:spacing w:after="100" w:line="276"/>
+      </w:pPr>
+      <w:r>
+        <w:rPr>
+          <w:rFonts w:ascii="Calibri" w:cs="Calibri" w:eastAsia="Calibri" w:hAnsi="Calibri"/>
+          <w:b/>
+          <w:bCs/>
+          <w:color w:val="1A1A1A"/>
+          <w:sz w:val="22"/>
+          <w:szCs w:val="22"/>
+        </w:rPr>
+        <w:t xml:space="preserve">Añadir imagen:</w:t>
+      </w:r>
+      <w:r>
+        <w:rPr>
+          <w:rFonts w:ascii="Calibri" w:cs="Calibri" w:eastAsia="Calibri" w:hAnsi="Calibri"/>
+          <w:b w:val="false"/>
+          <w:bCs w:val="false"/>
+          <w:color w:val="1A1A1A"/>
+          <w:sz w:val="22"/>
+          <w:szCs w:val="22"/>
+        </w:rPr>
+        <w:t xml:space="preserve"> ya publicada, la sesión ofrece también una imagen con el dibujo de cada ejercicio. Guardar imagen para Strava la deja en tu galería y te explica el último paso, que haces tú porque Strava no deja a otras apps añadir fotos: en la actividad, Editar › Añadir fotos, y eliges esa imagen. Abrir Strava te lleva directamente.</w:t>
+      </w:r>
+    </w:p>
+    <w:p>
+      <w:pPr>
+        <w:pStyle w:val="ListParagraph"/>
+        <w:numPr>
+          <w:ilvl w:val="0"/>
+          <w:numId w:val="2"/>
+        </w:numPr>
+        <w:spacing w:after="100" w:line="276"/>
+      </w:pPr>
+      <w:r>
+        <w:rPr>
+          <w:rFonts w:ascii="Calibri" w:cs="Calibri" w:eastAsia="Calibri" w:hAnsi="Calibri"/>
+          <w:b/>
+          <w:bCs/>
+          <w:color w:val="1A1A1A"/>
+          <w:sz w:val="22"/>
+          <w:szCs w:val="22"/>
+        </w:rPr>
+        <w:t xml:space="preserve">Club TrueLift:</w:t>
+      </w:r>
+      <w:r>
+        <w:rPr>
+          <w:rFonts w:ascii="Calibri" w:cs="Calibri" w:eastAsia="Calibri" w:hAnsi="Calibri"/>
+          <w:b w:val="false"/>
+          <w:bCs w:val="false"/>
+          <w:color w:val="1A1A1A"/>
+          <w:sz w:val="22"/>
+          <w:szCs w:val="22"/>
+        </w:rPr>
+        <w:t xml:space="preserve"> la fila Únete al club TrueLift en Strava, en Ajustes → Compartir, abre el club, con retos, eventos y las sesiones de quienes entrenan con TrueLift; está aunque no hayas conectado tu cuenta. Tras tu primera publicación, el aviso te lo ofrece una vez (¿Te unes al club TrueLift? · Unirme). Unirte lo haces tú, en Strava.</w:t>
+      </w:r>
+    </w:p>
+    <w:p>
+      <w:pPr>
+        <w:spacing w:after="160" w:line="276"/>
+      </w:pPr>
+      <w:r>
+        <w:rPr>
+          <w:rFonts w:ascii="Calibri" w:cs="Calibri" w:eastAsia="Calibri" w:hAnsi="Calibri"/>
+          <w:b w:val="0"/>
+          <w:bCs w:val="false"/>
+          <w:color w:val="1A1A1A"/>
+          <w:sz w:val="22"/>
+          <w:szCs w:val="22"/>
+        </w:rPr>
+        <w:t xml:space="preserve">La conexión se guarda en el almacén seguro de tu móvil y no viaja en la copia de seguridad; los interruptores y la lista de lo ya publicado, sí. Tras restaurar la copia en otro móvil, vuelve a conectar: lo ya publicado no se publica otra vez. Si Strava cierra la conexión, Ajustes lo avisa: Strava ha cerrado la conexión. Vuelve a conectar para seguir compartiendo.</w:t>
       </w:r>
     </w:p>
     <w:p>
@@ -21414,6 +21905,181 @@
           <w:szCs w:val="22"/>
         </w:rPr>
         <w:t>, en truelift.es/escritorio/: abres en el ordenador la misma copia de seguridad de la app y ves tus métricas en grande. El enlace está en la pantalla TrueLift PRO y al final del informe mensual.</w:t>
+      </w:r>
+    </w:p>
+    <w:p>
+      <w:pPr>
+        <w:spacing w:after="160" w:line="276"/>
+      </w:pPr>
+      <w:r>
+        <w:rPr>
+          <w:rFonts w:ascii="Calibri" w:cs="Calibri" w:eastAsia="Calibri" w:hAnsi="Calibri"/>
+          <w:b/>
+          <w:bCs/>
+          <w:color w:val="1A1A1A"/>
+          <w:sz w:val="22"/>
+          <w:szCs w:val="22"/>
+        </w:rPr>
+        <w:t xml:space="preserve">¿Puedo compartir un récord o un nivel nuevo?</w:t>
+      </w:r>
+      <w:r>
+        <w:rPr>
+          <w:rFonts w:ascii="Calibri" w:cs="Calibri" w:eastAsia="Calibri" w:hAnsi="Calibri"/>
+          <w:color w:val="1A1A1A"/>
+          <w:sz w:val="22"/>
+          <w:szCs w:val="22"/>
+        </w:rPr>
+        <w:t xml:space="preserve"> Sí. Al acabar la animación, toca Compartir y elige Imagen o Vídeo, con la animación y la música.</w:t>
+      </w:r>
+    </w:p>
+    <w:p>
+      <w:pPr>
+        <w:spacing w:after="160" w:line="276"/>
+      </w:pPr>
+      <w:r>
+        <w:rPr>
+          <w:rFonts w:ascii="Calibri" w:cs="Calibri" w:eastAsia="Calibri" w:hAnsi="Calibri"/>
+          <w:b/>
+          <w:bCs/>
+          <w:color w:val="1A1A1A"/>
+          <w:sz w:val="22"/>
+          <w:szCs w:val="22"/>
+        </w:rPr>
+        <w:t xml:space="preserve">¿Cómo publico mis entrenos en Strava?</w:t>
+      </w:r>
+      <w:r>
+        <w:rPr>
+          <w:rFonts w:ascii="Calibri" w:cs="Calibri" w:eastAsia="Calibri" w:hAnsi="Calibri"/>
+          <w:color w:val="1A1A1A"/>
+          <w:sz w:val="22"/>
+          <w:szCs w:val="22"/>
+        </w:rPr>
+        <w:t xml:space="preserve"> Conecta tu cuenta en Ajustes → Compartir → Connect with Strava. Después, toca Publicar en Strava en una sesión del historial o activa Publicar mis sesiones automáticamente. Es gratis.</w:t>
+      </w:r>
+    </w:p>
+    <w:p>
+      <w:pPr>
+        <w:spacing w:after="160" w:line="276"/>
+      </w:pPr>
+      <w:r>
+        <w:rPr>
+          <w:rFonts w:ascii="Calibri" w:cs="Calibri" w:eastAsia="Calibri" w:hAnsi="Calibri"/>
+          <w:b/>
+          <w:bCs/>
+          <w:color w:val="1A1A1A"/>
+          <w:sz w:val="22"/>
+          <w:szCs w:val="22"/>
+        </w:rPr>
+        <w:t xml:space="preserve">Mi reloj ya sube mis entrenos a Strava, ¿saldrán dos veces?</w:t>
+      </w:r>
+      <w:r>
+        <w:rPr>
+          <w:rFonts w:ascii="Calibri" w:cs="Calibri" w:eastAsia="Calibri" w:hAnsi="Calibri"/>
+          <w:color w:val="1A1A1A"/>
+          <w:sz w:val="22"/>
+          <w:szCs w:val="22"/>
+        </w:rPr>
+        <w:t xml:space="preserve"> No, si al conectar dejaste marcado el permiso de ver tus actividades: TrueLift añade su resumen a la actividad del reloj en lugar de crear otra. Si lo desmarcaste, desconecta y vuelve a conectar con ese permiso.</w:t>
+      </w:r>
+    </w:p>
+    <w:p>
+      <w:pPr>
+        <w:spacing w:after="160" w:line="276"/>
+      </w:pPr>
+      <w:r>
+        <w:rPr>
+          <w:rFonts w:ascii="Calibri" w:cs="Calibri" w:eastAsia="Calibri" w:hAnsi="Calibri"/>
+          <w:b/>
+          <w:bCs/>
+          <w:color w:val="1A1A1A"/>
+          <w:sz w:val="22"/>
+          <w:szCs w:val="22"/>
+        </w:rPr>
+        <w:t xml:space="preserve">He borrado una sesión y sigue en Strava.</w:t>
+      </w:r>
+      <w:r>
+        <w:rPr>
+          <w:rFonts w:ascii="Calibri" w:cs="Calibri" w:eastAsia="Calibri" w:hAnsi="Calibri"/>
+          <w:color w:val="1A1A1A"/>
+          <w:sz w:val="22"/>
+          <w:szCs w:val="22"/>
+        </w:rPr>
+        <w:t xml:space="preserve"> Strava no deja que otras apps borren actividades. Bórrala en Strava: al eliminarla en TrueLift, Abrir en Strava te lleva a ella.</w:t>
+      </w:r>
+    </w:p>
+    <w:p>
+      <w:pPr>
+        <w:spacing w:after="160" w:line="276"/>
+      </w:pPr>
+      <w:r>
+        <w:rPr>
+          <w:rFonts w:ascii="Calibri" w:cs="Calibri" w:eastAsia="Calibri" w:hAnsi="Calibri"/>
+          <w:b/>
+          <w:bCs/>
+          <w:color w:val="1A1A1A"/>
+          <w:sz w:val="22"/>
+          <w:szCs w:val="22"/>
+        </w:rPr>
+        <w:t xml:space="preserve">¿Por qué mi actividad de Strava no tiene los dibujos de los ejercicios?</w:t>
+      </w:r>
+      <w:r>
+        <w:rPr>
+          <w:rFonts w:ascii="Calibri" w:cs="Calibri" w:eastAsia="Calibri" w:hAnsi="Calibri"/>
+          <w:color w:val="1A1A1A"/>
+          <w:sz w:val="22"/>
+          <w:szCs w:val="22"/>
+        </w:rPr>
+        <w:t xml:space="preserve"> Strava no deja que otras apps suban fotos. En la sesión publicada, toca Añadir imagen → Guardar imagen para Strava y añádela tú en la actividad (Editar › Añadir fotos).</w:t>
+      </w:r>
+    </w:p>
+    <w:p>
+      <w:pPr>
+        <w:spacing w:after="160" w:line="276"/>
+      </w:pPr>
+      <w:r>
+        <w:rPr>
+          <w:rFonts w:ascii="Calibri" w:cs="Calibri" w:eastAsia="Calibri" w:hAnsi="Calibri"/>
+          <w:b/>
+          <w:bCs/>
+          <w:color w:val="1A1A1A"/>
+          <w:sz w:val="22"/>
+          <w:szCs w:val="22"/>
+        </w:rPr>
+        <w:t xml:space="preserve">He restaurado la copia en otro móvil y ya no publica en Strava.</w:t>
+      </w:r>
+      <w:r>
+        <w:rPr>
+          <w:rFonts w:ascii="Calibri" w:cs="Calibri" w:eastAsia="Calibri" w:hAnsi="Calibri"/>
+          <w:color w:val="1A1A1A"/>
+          <w:sz w:val="22"/>
+          <w:szCs w:val="22"/>
+        </w:rPr>
+        <w:t xml:space="preserve"> Por seguridad, la conexión con Strava no viaja en la copia. Vuelve a conectar en Ajustes → Compartir; lo ya publicado no se repite.</w:t>
+      </w:r>
+    </w:p>
+    <w:p>
+      <w:pPr>
+        <w:spacing w:after="160" w:line="276"/>
+      </w:pPr>
+      <w:r>
+        <w:rPr>
+          <w:rFonts w:ascii="Calibri" w:cs="Calibri" w:eastAsia="Calibri" w:hAnsi="Calibri"/>
+          <w:b/>
+          <w:bCs/>
+          <w:color w:val="1A1A1A"/>
+          <w:sz w:val="22"/>
+          <w:szCs w:val="22"/>
+        </w:rPr>
+        <w:t xml:space="preserve">¿Quién ve lo que publico en Strava?</w:t>
+      </w:r>
+      <w:r>
+        <w:rPr>
+          <w:rFonts w:ascii="Calibri" w:cs="Calibri" w:eastAsia="Calibri" w:hAnsi="Calibri"/>
+          <w:color w:val="1A1A1A"/>
+          <w:sz w:val="22"/>
+          <w:szCs w:val="22"/>
+        </w:rPr>
+        <w:t xml:space="preserve"> Quien permita la privacidad de tu cuenta de Strava. Se cambia allí, para todas tus actividades o para cada una.</w:t>
       </w:r>
     </w:p>
     <w:p>

</xml_diff>